<commit_message>
CFA y .zip V3.0
</commit_message>
<xml_diff>
--- a/fuentes/CF1_82110034_DU.docx
+++ b/fuentes/CF1_82110034_DU.docx
@@ -1132,7 +1132,7 @@
                 <w:noProof/>
                 <w:webHidden/>
               </w:rPr>
-              <w:t>35</w:t>
+              <w:t>34</w:t>
             </w:r>
             <w:r>
               <w:rPr>
@@ -1220,7 +1220,7 @@
                 <w:noProof/>
                 <w:webHidden/>
               </w:rPr>
-              <w:t>38</w:t>
+              <w:t>37</w:t>
             </w:r>
             <w:r>
               <w:rPr>
@@ -1290,7 +1290,7 @@
                 <w:noProof/>
                 <w:webHidden/>
               </w:rPr>
-              <w:t>43</w:t>
+              <w:t>42</w:t>
             </w:r>
             <w:r>
               <w:rPr>
@@ -1360,7 +1360,7 @@
                 <w:noProof/>
                 <w:webHidden/>
               </w:rPr>
-              <w:t>44</w:t>
+              <w:t>43</w:t>
             </w:r>
             <w:r>
               <w:rPr>
@@ -1430,7 +1430,7 @@
                 <w:noProof/>
                 <w:webHidden/>
               </w:rPr>
-              <w:t>45</w:t>
+              <w:t>44</w:t>
             </w:r>
             <w:r>
               <w:rPr>
@@ -1501,7 +1501,7 @@
                 <w:noProof/>
                 <w:webHidden/>
               </w:rPr>
-              <w:t>48</w:t>
+              <w:t>47</w:t>
             </w:r>
             <w:r>
               <w:rPr>
@@ -1571,7 +1571,7 @@
                 <w:noProof/>
                 <w:webHidden/>
               </w:rPr>
-              <w:t>50</w:t>
+              <w:t>49</w:t>
             </w:r>
             <w:r>
               <w:rPr>
@@ -8292,6 +8292,12 @@
         </w:rPr>
         <w:t>Un condensador es un dispositivo electrónico que almacena energía en forma de campo eléctrico. Está compuesto por dos placas metálicas paralelas (llamadas armaduras), habitualmente de aluminio, separadas por un material dieléctrico, que actúa como aislante. Su comportamiento y aplicación en los circuitos dependen de varias características clave: </w:t>
       </w:r>
+      <w:r>
+        <w:rPr>
+          <w:lang w:eastAsia="es-CO"/>
+        </w:rPr>
+        <w:t>capacidad de un condensador representa la cantidad de carga eléctrica que puede almacenar por unidad de voltaje aplicado. Se mide en faradios (F). Como esta unidad es muy grande para la mayoría de las aplicaciones prácticas, se utilizan sus submúltiplos:  </w:t>
+      </w:r>
     </w:p>
     <w:p>
       <w:pPr>
@@ -8422,39 +8428,15 @@
     </w:p>
     <w:p>
       <w:pPr>
-        <w:ind w:left="708"/>
-        <w:rPr>
-          <w:lang w:eastAsia="es-CO"/>
-        </w:rPr>
-      </w:pPr>
-    </w:p>
-    <w:p>
-      <w:pPr>
-        <w:ind w:left="708"/>
-        <w:rPr>
-          <w:lang w:eastAsia="es-CO"/>
-        </w:rPr>
-      </w:pPr>
-    </w:p>
-    <w:p>
-      <w:pPr>
-        <w:ind w:left="708"/>
-        <w:rPr>
-          <w:lang w:eastAsia="es-CO"/>
-        </w:rPr>
-      </w:pPr>
-    </w:p>
-    <w:p>
-      <w:pPr>
-        <w:ind w:left="708"/>
-        <w:rPr>
-          <w:lang w:eastAsia="es-CO"/>
-        </w:rPr>
-      </w:pPr>
-    </w:p>
-    <w:p>
-      <w:pPr>
-        <w:ind w:left="708"/>
+        <w:ind w:firstLine="0"/>
+        <w:rPr>
+          <w:lang w:eastAsia="es-CO"/>
+        </w:rPr>
+      </w:pPr>
+    </w:p>
+    <w:p>
+      <w:pPr>
+        <w:ind w:firstLine="0"/>
         <w:rPr>
           <w:lang w:eastAsia="es-CO"/>
         </w:rPr>
@@ -8533,20 +8515,6 @@
     </w:p>
     <w:p>
       <w:pPr>
-        <w:ind w:left="708"/>
-        <w:rPr>
-          <w:lang w:eastAsia="es-CO"/>
-        </w:rPr>
-      </w:pPr>
-      <w:r>
-        <w:rPr>
-          <w:lang w:eastAsia="es-CO"/>
-        </w:rPr>
-        <w:t>capacidad de un condensador representa la cantidad de carga eléctrica que puede almacenar por unidad de voltaje aplicado. Se mide en faradios (F). Como esta unidad es muy grande para la mayoría de las aplicaciones prácticas, se utilizan sus submúltiplos:  </w:t>
-      </w:r>
-    </w:p>
-    <w:p>
-      <w:pPr>
         <w:pStyle w:val="Prrafodelista"/>
         <w:numPr>
           <w:ilvl w:val="0"/>
@@ -8648,70 +8616,80 @@
         <w:rPr>
           <w:lang w:eastAsia="es-CO"/>
         </w:rPr>
-        <w:t xml:space="preserve">Es el valor máximo de voltaje que puede soportar un condensador sin dañarse. Esta capacidad depende del tipo de dieléctrico y su grosor. Si se aplica una tensión superior a la especificada, el dieléctrico puede romperse, provocando un cortocircuito o incluso una explosión. Por eso, siempre se debe </w:t>
-      </w:r>
-      <w:r>
-        <w:rPr>
+        <w:t>Es el valor máximo de voltaje que puede soportar un condensador sin dañarse. Esta capacidad depende del tipo de dieléctrico y su grosor. Si se aplica una tensión superior a la especificada, el dieléctrico puede romperse, provocando un cortocircuito o incluso una explosión. Por eso, siempre se debe seleccionar un condensador cuya tensión de trabajo sea superior a la máxima que se espera en el circuito.</w:t>
+      </w:r>
+    </w:p>
+    <w:p>
+      <w:pPr>
+        <w:ind w:left="708"/>
+        <w:rPr>
+          <w:lang w:eastAsia="es-CO"/>
+        </w:rPr>
+      </w:pPr>
+    </w:p>
+    <w:p>
+      <w:pPr>
+        <w:ind w:left="708"/>
+        <w:rPr>
+          <w:lang w:eastAsia="es-CO"/>
+        </w:rPr>
+      </w:pPr>
+    </w:p>
+    <w:p>
+      <w:pPr>
+        <w:ind w:left="708"/>
+        <w:rPr>
+          <w:b/>
+          <w:bCs/>
+          <w:lang w:eastAsia="es-CO"/>
+        </w:rPr>
+      </w:pPr>
+      <w:r>
+        <w:rPr>
+          <w:b/>
+          <w:bCs/>
           <w:lang w:eastAsia="es-CO"/>
         </w:rPr>
         <w:lastRenderedPageBreak/>
-        <w:t>seleccionar un condensador cuya tensión de trabajo sea superior a la máxima que se espera en el circuito.</w:t>
+        <w:t>Tolerancia</w:t>
       </w:r>
     </w:p>
     <w:p>
       <w:pPr>
         <w:ind w:left="708"/>
         <w:rPr>
-          <w:b/>
-          <w:bCs/>
-          <w:lang w:eastAsia="es-CO"/>
-        </w:rPr>
-      </w:pPr>
-      <w:r>
-        <w:rPr>
-          <w:b/>
-          <w:bCs/>
-          <w:lang w:eastAsia="es-CO"/>
-        </w:rPr>
-        <w:t>Tolerancia</w:t>
+          <w:lang w:eastAsia="es-CO"/>
+        </w:rPr>
+      </w:pPr>
+      <w:r>
+        <w:rPr>
+          <w:lang w:eastAsia="es-CO"/>
+        </w:rPr>
+        <w:t>Al igual que en las resistencias, la tolerancia indica el margen de error entre la capacidad real del condensador y la que se indica en su carcasa. Por ejemplo, un condensador de 100 µF con una tolerancia del ± 10 % puede tener una capacidad real entre 90 µF y 110 µF.</w:t>
       </w:r>
     </w:p>
     <w:p>
       <w:pPr>
         <w:ind w:left="708"/>
         <w:rPr>
-          <w:lang w:eastAsia="es-CO"/>
-        </w:rPr>
-      </w:pPr>
-      <w:r>
-        <w:rPr>
-          <w:lang w:eastAsia="es-CO"/>
-        </w:rPr>
-        <w:t>Al igual que en las resistencias, la tolerancia indica el margen de error entre la capacidad real del condensador y la que se indica en su carcasa. Por ejemplo, un condensador de 100 µF con una tolerancia del ± 10 % puede tener una capacidad real entre 90 µF y 110 µF.</w:t>
+          <w:b/>
+          <w:bCs/>
+          <w:lang w:eastAsia="es-CO"/>
+        </w:rPr>
+      </w:pPr>
+      <w:r>
+        <w:rPr>
+          <w:b/>
+          <w:bCs/>
+          <w:lang w:eastAsia="es-CO"/>
+        </w:rPr>
+        <w:t>Polaridad</w:t>
       </w:r>
     </w:p>
     <w:p>
       <w:pPr>
         <w:ind w:left="708"/>
         <w:rPr>
-          <w:b/>
-          <w:bCs/>
-          <w:lang w:eastAsia="es-CO"/>
-        </w:rPr>
-      </w:pPr>
-      <w:r>
-        <w:rPr>
-          <w:b/>
-          <w:bCs/>
-          <w:lang w:eastAsia="es-CO"/>
-        </w:rPr>
-        <w:t>Polaridad</w:t>
-      </w:r>
-    </w:p>
-    <w:p>
-      <w:pPr>
-        <w:ind w:left="708"/>
-        <w:rPr>
           <w:lang w:eastAsia="es-CO"/>
         </w:rPr>
       </w:pPr>
@@ -8762,114 +8740,8 @@
         <w:rPr>
           <w:lang w:eastAsia="es-CO"/>
         </w:rPr>
-        <w:lastRenderedPageBreak/>
         <w:t>Un inductor está formado por un arrollamiento de hilo conductor. La inductancia que produce depende directamente del número de espiras, del diámetro de estas y de la permeabilidad del material presente en el interior del arrollamiento. A su vez, es inversamente proporcional a la longitud de la bobina.</w:t>
       </w:r>
-    </w:p>
-    <w:p>
-      <w:pPr>
-        <w:rPr>
-          <w:lang w:val="es-419" w:eastAsia="es-CO"/>
-        </w:rPr>
-      </w:pPr>
-    </w:p>
-    <w:p>
-      <w:pPr>
-        <w:rPr>
-          <w:lang w:val="es-419" w:eastAsia="es-CO"/>
-        </w:rPr>
-      </w:pPr>
-    </w:p>
-    <w:p>
-      <w:pPr>
-        <w:rPr>
-          <w:lang w:val="es-419" w:eastAsia="es-CO"/>
-        </w:rPr>
-      </w:pPr>
-    </w:p>
-    <w:p>
-      <w:pPr>
-        <w:rPr>
-          <w:lang w:val="es-419" w:eastAsia="es-CO"/>
-        </w:rPr>
-      </w:pPr>
-    </w:p>
-    <w:p>
-      <w:pPr>
-        <w:rPr>
-          <w:lang w:val="es-419" w:eastAsia="es-CO"/>
-        </w:rPr>
-      </w:pPr>
-    </w:p>
-    <w:p>
-      <w:pPr>
-        <w:rPr>
-          <w:lang w:val="es-419" w:eastAsia="es-CO"/>
-        </w:rPr>
-      </w:pPr>
-    </w:p>
-    <w:p>
-      <w:pPr>
-        <w:rPr>
-          <w:lang w:val="es-419" w:eastAsia="es-CO"/>
-        </w:rPr>
-      </w:pPr>
-    </w:p>
-    <w:p>
-      <w:pPr>
-        <w:rPr>
-          <w:lang w:val="es-419" w:eastAsia="es-CO"/>
-        </w:rPr>
-      </w:pPr>
-    </w:p>
-    <w:p>
-      <w:pPr>
-        <w:rPr>
-          <w:lang w:val="es-419" w:eastAsia="es-CO"/>
-        </w:rPr>
-      </w:pPr>
-    </w:p>
-    <w:p>
-      <w:pPr>
-        <w:rPr>
-          <w:lang w:val="es-419" w:eastAsia="es-CO"/>
-        </w:rPr>
-      </w:pPr>
-    </w:p>
-    <w:p>
-      <w:pPr>
-        <w:rPr>
-          <w:lang w:val="es-419" w:eastAsia="es-CO"/>
-        </w:rPr>
-      </w:pPr>
-    </w:p>
-    <w:p>
-      <w:pPr>
-        <w:rPr>
-          <w:lang w:val="es-419" w:eastAsia="es-CO"/>
-        </w:rPr>
-      </w:pPr>
-    </w:p>
-    <w:p>
-      <w:pPr>
-        <w:rPr>
-          <w:lang w:val="es-419" w:eastAsia="es-CO"/>
-        </w:rPr>
-      </w:pPr>
-    </w:p>
-    <w:p>
-      <w:pPr>
-        <w:rPr>
-          <w:lang w:val="es-419" w:eastAsia="es-CO"/>
-        </w:rPr>
-      </w:pPr>
-    </w:p>
-    <w:p>
-      <w:pPr>
-        <w:rPr>
-          <w:lang w:val="es-419" w:eastAsia="es-CO"/>
-        </w:rPr>
-      </w:pPr>
     </w:p>
     <w:p>
       <w:pPr>
@@ -9883,15 +9755,7 @@
     </w:p>
     <w:p>
       <w:pPr>
-        <w:rPr>
-          <w:b/>
-          <w:bCs/>
-          <w:lang w:val="es-419" w:eastAsia="es-CO"/>
-        </w:rPr>
-      </w:pPr>
-    </w:p>
-    <w:p>
-      <w:pPr>
+        <w:ind w:firstLine="0"/>
         <w:rPr>
           <w:b/>
           <w:bCs/>
@@ -9910,6 +9774,7 @@
         <w:rPr>
           <w:lang w:val="es-419"/>
         </w:rPr>
+        <w:lastRenderedPageBreak/>
         <w:t>Corriente directa</w:t>
       </w:r>
     </w:p>
@@ -10134,20 +9999,20 @@
         <w:rPr>
           <w:lang w:val="es-419" w:eastAsia="es-CO"/>
         </w:rPr>
+        <w:t>Fuente: Corriente eléctrica, (2011)</w:t>
+      </w:r>
+    </w:p>
+    <w:p>
+      <w:pPr>
+        <w:rPr>
+          <w:lang w:eastAsia="es-CO"/>
+        </w:rPr>
+      </w:pPr>
+      <w:r>
+        <w:rPr>
+          <w:lang w:eastAsia="es-CO"/>
+        </w:rPr>
         <w:lastRenderedPageBreak/>
-        <w:t>Fuente: Corriente eléctrica, (2011)</w:t>
-      </w:r>
-    </w:p>
-    <w:p>
-      <w:pPr>
-        <w:rPr>
-          <w:lang w:eastAsia="es-CO"/>
-        </w:rPr>
-      </w:pPr>
-      <w:r>
-        <w:rPr>
-          <w:lang w:eastAsia="es-CO"/>
-        </w:rPr>
         <w:t xml:space="preserve">Comprender los fundamentos de la electricidad es clave para el diseño y mantenimiento de instalaciones eléctricas domiciliarias seguras y eficientes. El dominio de conceptos como corriente, voltaje, resistencia, así como la aplicación de leyes fundamentales y el uso adecuado de elementos del circuito, permite </w:t>
       </w:r>
       <w:r>
@@ -10258,6 +10123,16 @@
         </w:rPr>
         <w:tab/>
       </w:r>
+    </w:p>
+    <w:p>
+      <w:pPr>
+        <w:tabs>
+          <w:tab w:val="left" w:pos="4345"/>
+        </w:tabs>
+        <w:rPr>
+          <w:lang w:val="es-419" w:eastAsia="es-CO"/>
+        </w:rPr>
+      </w:pPr>
     </w:p>
     <w:p>
       <w:pPr>
@@ -10986,180 +10861,196 @@
     </w:p>
     <w:p>
       <w:pPr>
-        <w:ind w:firstLine="0"/>
         <w:rPr>
           <w:bdr w:val="none" w:sz="0" w:space="0" w:color="auto" w:frame="1"/>
           <w:lang w:eastAsia="es-CO"/>
         </w:rPr>
       </w:pPr>
-    </w:p>
-    <w:p>
-      <w:pPr>
-        <w:rPr>
+      <w:r>
+        <w:rPr>
+          <w:b/>
+          <w:bCs/>
           <w:bdr w:val="none" w:sz="0" w:space="0" w:color="auto" w:frame="1"/>
           <w:lang w:eastAsia="es-CO"/>
         </w:rPr>
-      </w:pPr>
-      <w:r>
-        <w:rPr>
-          <w:b/>
-          <w:bCs/>
+        <w:lastRenderedPageBreak/>
+        <w:t>Inductores:</w:t>
+      </w:r>
+      <w:r>
+        <w:rPr>
           <w:bdr w:val="none" w:sz="0" w:space="0" w:color="auto" w:frame="1"/>
           <w:lang w:eastAsia="es-CO"/>
         </w:rPr>
-        <w:t>Inductores:</w:t>
-      </w:r>
-      <w:r>
+        <w:t xml:space="preserve"> también conocidos como bobinas, son componentes pasivos de un circuito eléctrico que, debido al fenómeno de la autoinducción, almacena energía en forma de campo magnético.</w:t>
+      </w:r>
+    </w:p>
+    <w:p>
+      <w:pPr>
         <w:rPr>
           <w:bdr w:val="none" w:sz="0" w:space="0" w:color="auto" w:frame="1"/>
           <w:lang w:eastAsia="es-CO"/>
         </w:rPr>
-        <w:t xml:space="preserve"> también conocidos como bobinas, son componentes pasivos de un circuito eléctrico que, debido al fenómeno de la autoinducción, almacena energía en forma de campo magnético.</w:t>
-      </w:r>
-    </w:p>
-    <w:p>
-      <w:pPr>
-        <w:rPr>
+      </w:pPr>
+      <w:r>
+        <w:rPr>
+          <w:b/>
+          <w:bCs/>
           <w:bdr w:val="none" w:sz="0" w:space="0" w:color="auto" w:frame="1"/>
           <w:lang w:eastAsia="es-CO"/>
         </w:rPr>
-      </w:pPr>
-      <w:r>
-        <w:rPr>
-          <w:b/>
-          <w:bCs/>
+        <w:t>Instalación eléctrica:</w:t>
+      </w:r>
+      <w:r>
+        <w:rPr>
           <w:bdr w:val="none" w:sz="0" w:space="0" w:color="auto" w:frame="1"/>
           <w:lang w:eastAsia="es-CO"/>
         </w:rPr>
-        <w:t>Instalación eléctrica:</w:t>
-      </w:r>
-      <w:r>
+        <w:t xml:space="preserve"> conjunto de aparatos, equipos, cables conductores, tuberías y accesorios destinados al suministro, distribución y utilización de la energía eléctrica en una edificación.</w:t>
+      </w:r>
+    </w:p>
+    <w:p>
+      <w:pPr>
         <w:rPr>
           <w:bdr w:val="none" w:sz="0" w:space="0" w:color="auto" w:frame="1"/>
           <w:lang w:eastAsia="es-CO"/>
         </w:rPr>
-        <w:t xml:space="preserve"> conjunto de aparatos, equipos, cables conductores, tuberías y accesorios destinados al suministro, distribución y utilización de la energía eléctrica en una edificación.</w:t>
-      </w:r>
-    </w:p>
-    <w:p>
-      <w:pPr>
-        <w:rPr>
+      </w:pPr>
+      <w:r>
+        <w:rPr>
+          <w:b/>
+          <w:bCs/>
           <w:bdr w:val="none" w:sz="0" w:space="0" w:color="auto" w:frame="1"/>
           <w:lang w:eastAsia="es-CO"/>
         </w:rPr>
-      </w:pPr>
-      <w:r>
-        <w:rPr>
-          <w:b/>
-          <w:bCs/>
+        <w:t>Ley de Corriente:</w:t>
+      </w:r>
+      <w:r>
+        <w:rPr>
           <w:bdr w:val="none" w:sz="0" w:space="0" w:color="auto" w:frame="1"/>
           <w:lang w:eastAsia="es-CO"/>
         </w:rPr>
-        <w:t>Ley de Corriente:</w:t>
-      </w:r>
-      <w:r>
+        <w:t xml:space="preserve"> ley también conocida como Primera Ley de Kirchhoff o LCK, indica que, en cualquier nodo, la suma de la corriente que entra en ese nodo es igual a la suma de la corriente que sale. De igual forma, la suma de todas las corrientes que pasan por el nodo es igual a cero.</w:t>
+      </w:r>
+    </w:p>
+    <w:p>
+      <w:pPr>
         <w:rPr>
           <w:bdr w:val="none" w:sz="0" w:space="0" w:color="auto" w:frame="1"/>
           <w:lang w:eastAsia="es-CO"/>
         </w:rPr>
-        <w:t xml:space="preserve"> ley también conocida como Primera Ley de Kirchhoff o LCK, indica que, en cualquier nodo, la suma de la corriente que entra en ese nodo es igual a la suma de la corriente que sale. De igual forma, la suma de todas las corrientes que pasan por el nodo es igual a cero.</w:t>
-      </w:r>
-    </w:p>
-    <w:p>
-      <w:pPr>
-        <w:rPr>
+      </w:pPr>
+      <w:r>
+        <w:rPr>
+          <w:b/>
+          <w:bCs/>
           <w:bdr w:val="none" w:sz="0" w:space="0" w:color="auto" w:frame="1"/>
           <w:lang w:eastAsia="es-CO"/>
         </w:rPr>
-      </w:pPr>
-      <w:r>
-        <w:rPr>
-          <w:b/>
-          <w:bCs/>
+        <w:t>Ley de Joule:</w:t>
+      </w:r>
+      <w:r>
+        <w:rPr>
           <w:bdr w:val="none" w:sz="0" w:space="0" w:color="auto" w:frame="1"/>
           <w:lang w:eastAsia="es-CO"/>
         </w:rPr>
-        <w:t>Ley de Joule:</w:t>
-      </w:r>
-      <w:r>
+        <w:t xml:space="preserve"> determina la cantidad de calor que es capaz de entregar una resistencia, esta cantidad de calor dependerá de la intensidad de corriente que por ella circule de la cantidad de tiempo que esté conectada.</w:t>
+      </w:r>
+    </w:p>
+    <w:p>
+      <w:pPr>
         <w:rPr>
           <w:bdr w:val="none" w:sz="0" w:space="0" w:color="auto" w:frame="1"/>
           <w:lang w:eastAsia="es-CO"/>
         </w:rPr>
-        <w:t xml:space="preserve"> determina la cantidad de calor que es capaz de entregar una resistencia, esta cantidad de calor dependerá de la intensidad de corriente que por ella circule de la cantidad de tiempo que esté conectada.</w:t>
-      </w:r>
-    </w:p>
-    <w:p>
-      <w:pPr>
-        <w:rPr>
+      </w:pPr>
+      <w:r>
+        <w:rPr>
+          <w:b/>
+          <w:bCs/>
           <w:bdr w:val="none" w:sz="0" w:space="0" w:color="auto" w:frame="1"/>
           <w:lang w:eastAsia="es-CO"/>
         </w:rPr>
-      </w:pPr>
-      <w:r>
-        <w:rPr>
-          <w:b/>
-          <w:bCs/>
+        <w:t>Ley de Ohm:</w:t>
+      </w:r>
+      <w:r>
+        <w:rPr>
           <w:bdr w:val="none" w:sz="0" w:space="0" w:color="auto" w:frame="1"/>
           <w:lang w:eastAsia="es-CO"/>
         </w:rPr>
-        <w:t>Ley de Ohm:</w:t>
-      </w:r>
-      <w:r>
+        <w:t xml:space="preserve"> define que la corriente que circula por un conductor eléctrico es directamente proporcional al voltaje e inversamente proporcional a la resistencia, es decir, cuando aumenta el voltaje aumenta la corriente y cuando la resistencia aumenta la corriente es mínima.</w:t>
+      </w:r>
+    </w:p>
+    <w:p>
+      <w:pPr>
         <w:rPr>
           <w:bdr w:val="none" w:sz="0" w:space="0" w:color="auto" w:frame="1"/>
           <w:lang w:eastAsia="es-CO"/>
         </w:rPr>
-        <w:t xml:space="preserve"> define que la corriente que circula por un conductor eléctrico es directamente proporcional al voltaje e inversamente proporcional a la resistencia, es decir, cuando aumenta el voltaje aumenta la corriente y cuando la resistencia aumenta la corriente es mínima.</w:t>
-      </w:r>
-    </w:p>
-    <w:p>
-      <w:pPr>
-        <w:rPr>
+      </w:pPr>
+      <w:r>
+        <w:rPr>
+          <w:b/>
+          <w:bCs/>
           <w:bdr w:val="none" w:sz="0" w:space="0" w:color="auto" w:frame="1"/>
           <w:lang w:eastAsia="es-CO"/>
         </w:rPr>
-      </w:pPr>
-      <w:r>
-        <w:rPr>
-          <w:b/>
-          <w:bCs/>
+        <w:t>Ley de Voltajes:</w:t>
+      </w:r>
+      <w:r>
+        <w:rPr>
           <w:bdr w:val="none" w:sz="0" w:space="0" w:color="auto" w:frame="1"/>
           <w:lang w:eastAsia="es-CO"/>
         </w:rPr>
-        <w:t>Ley de Voltajes:</w:t>
-      </w:r>
-      <w:r>
+        <w:t xml:space="preserve"> ley que indica que en toda malla la suma de todas las caídas de tensión es igual a la suma de todas las subidas de tensión. De forma equivalente, en toda malla la suma de las diferencias de potencial eléctrico debe ser cero (0).</w:t>
+      </w:r>
+    </w:p>
+    <w:p>
+      <w:pPr>
         <w:rPr>
           <w:bdr w:val="none" w:sz="0" w:space="0" w:color="auto" w:frame="1"/>
           <w:lang w:eastAsia="es-CO"/>
         </w:rPr>
-        <w:t xml:space="preserve"> ley que indica que en toda malla la suma de todas las caídas de tensión es igual a la suma de todas las subidas de tensión. De forma equivalente, en toda malla la suma de las diferencias de potencial eléctrico debe ser cero (0).</w:t>
-      </w:r>
-    </w:p>
-    <w:p>
-      <w:pPr>
-        <w:rPr>
+      </w:pPr>
+      <w:r>
+        <w:rPr>
+          <w:b/>
+          <w:bCs/>
           <w:bdr w:val="none" w:sz="0" w:space="0" w:color="auto" w:frame="1"/>
           <w:lang w:eastAsia="es-CO"/>
         </w:rPr>
-      </w:pPr>
-      <w:r>
-        <w:rPr>
-          <w:b/>
-          <w:bCs/>
+        <w:t xml:space="preserve">Ley de Watt: </w:t>
+      </w:r>
+      <w:r>
+        <w:rPr>
           <w:bdr w:val="none" w:sz="0" w:space="0" w:color="auto" w:frame="1"/>
           <w:lang w:eastAsia="es-CO"/>
         </w:rPr>
+        <w:t>determina la cantidad de energía eléctrica o trabajo que se transporta o que se consume en una determinada unidad de tiempo. Si la tensión se mantiene constante, la potencia es directamente proporcional a la corriente.</w:t>
+      </w:r>
+    </w:p>
+    <w:p>
+      <w:pPr>
+        <w:rPr>
+          <w:bdr w:val="none" w:sz="0" w:space="0" w:color="auto" w:frame="1"/>
+          <w:lang w:eastAsia="es-CO"/>
+        </w:rPr>
+      </w:pPr>
+      <w:r>
+        <w:rPr>
+          <w:b/>
+          <w:bCs/>
+          <w:bdr w:val="none" w:sz="0" w:space="0" w:color="auto" w:frame="1"/>
+          <w:lang w:eastAsia="es-CO"/>
+        </w:rPr>
         <w:lastRenderedPageBreak/>
-        <w:t xml:space="preserve">Ley de Watt: </w:t>
+        <w:t>Leyes de Kirchhoff:</w:t>
       </w:r>
       <w:r>
         <w:rPr>
           <w:bdr w:val="none" w:sz="0" w:space="0" w:color="auto" w:frame="1"/>
           <w:lang w:eastAsia="es-CO"/>
         </w:rPr>
-        <w:t>determina la cantidad de energía eléctrica o trabajo que se transporta o que se consume en una determinada unidad de tiempo. Si la tensión se mantiene constante, la potencia es directamente proporcional a la corriente.</w:t>
+        <w:t xml:space="preserve"> son dos igualdades que se basan en la conservación de la energía y la carga en los circuitos eléctricos. Estas leyes son muy utilizadas en ingeniería eléctrica para hallar corrientes y tensiones en cualquier punto de un circuito eléctrico. Estas leyes son: Primera Ley de Kirchhoff o Ley de Corrientes y Segunda Ley de Kirchhoff o Ley de Voltajes.</w:t>
       </w:r>
     </w:p>
     <w:p>
@@ -11176,14 +11067,14 @@
           <w:bdr w:val="none" w:sz="0" w:space="0" w:color="auto" w:frame="1"/>
           <w:lang w:eastAsia="es-CO"/>
         </w:rPr>
-        <w:t>Leyes de Kirchhoff:</w:t>
+        <w:t>Sistema eléctrico:</w:t>
       </w:r>
       <w:r>
         <w:rPr>
           <w:bdr w:val="none" w:sz="0" w:space="0" w:color="auto" w:frame="1"/>
           <w:lang w:eastAsia="es-CO"/>
         </w:rPr>
-        <w:t xml:space="preserve"> son dos igualdades que se basan en la conservación de la energía y la carga en los circuitos eléctricos. Estas leyes son muy utilizadas en ingeniería eléctrica para hallar corrientes y tensiones en cualquier punto de un circuito eléctrico. Estas leyes son: Primera Ley de Kirchhoff o Ley de Corrientes y Segunda Ley de Kirchhoff o Ley de Voltajes.</w:t>
+        <w:t xml:space="preserve"> conjunto de equipos necesarios para dar el servicio eléctrico, es decir, para hacer que los consumidores dispongan de la electricidad que demandan. Está compuesto en términos generales por: generación de energía, transmisión, subestaciones, distribución y consumo.</w:t>
       </w:r>
     </w:p>
     <w:p>
@@ -11193,22 +11084,14 @@
           <w:lang w:eastAsia="es-CO"/>
         </w:rPr>
       </w:pPr>
-      <w:r>
-        <w:rPr>
-          <w:b/>
-          <w:bCs/>
+    </w:p>
+    <w:p>
+      <w:pPr>
+        <w:rPr>
           <w:bdr w:val="none" w:sz="0" w:space="0" w:color="auto" w:frame="1"/>
           <w:lang w:eastAsia="es-CO"/>
         </w:rPr>
-        <w:t>Sistema eléctrico:</w:t>
-      </w:r>
-      <w:r>
-        <w:rPr>
-          <w:bdr w:val="none" w:sz="0" w:space="0" w:color="auto" w:frame="1"/>
-          <w:lang w:eastAsia="es-CO"/>
-        </w:rPr>
-        <w:t xml:space="preserve"> conjunto de equipos necesarios para dar el servicio eléctrico, es decir, para hacer que los consumidores dispongan de la electricidad que demandan. Está compuesto en términos generales por: generación de energía, transmisión, subestaciones, distribución y consumo.</w:t>
-      </w:r>
+      </w:pPr>
     </w:p>
     <w:p>
       <w:pPr>
@@ -11435,26 +11318,9 @@
           <w:lang w:eastAsia="es-CO"/>
           <w14:ligatures w14:val="none"/>
         </w:rPr>
-        <w:t>. (2014). Descubrimiento de la primera partícula subatómica: el electrón. Recuperado de </w:t>
-      </w:r>
-      <w:hyperlink r:id="rId40" w:tgtFrame="_blank" w:history="1">
-        <w:r>
-          <w:rPr>
-            <w:rStyle w:val="Hipervnculo"/>
-            <w:rFonts w:eastAsia="Times New Roman" w:cstheme="minorHAnsi"/>
-            <w:kern w:val="0"/>
-            <w:szCs w:val="28"/>
-            <w:bdr w:val="none" w:sz="0" w:space="0" w:color="auto" w:frame="1"/>
-            <w:lang w:eastAsia="es-CO"/>
-            <w14:ligatures w14:val="none"/>
-          </w:rPr>
-          <w:t>https://escuelapedia.com/descubrimiento-de-la-primera-particula-subatomica-el-electron/</w:t>
-        </w:r>
-      </w:hyperlink>
-    </w:p>
-    <w:p>
-      <w:pPr>
-        <w:ind w:left="709" w:hanging="709"/>
+        <w:t xml:space="preserve">. (2014). Descubrimiento de la primera partícula subatómica: el electrón. </w:t>
+      </w:r>
+      <w:r>
         <w:rPr>
           <w:rFonts w:eastAsia="Times New Roman" w:cstheme="minorHAnsi"/>
           <w:kern w:val="0"/>
@@ -11463,8 +11329,12 @@
           <w:lang w:eastAsia="es-CO"/>
           <w14:ligatures w14:val="none"/>
         </w:rPr>
-      </w:pPr>
-      <w:r>
+        <w:t xml:space="preserve"> </w:t>
+      </w:r>
+    </w:p>
+    <w:p>
+      <w:pPr>
+        <w:ind w:left="709" w:hanging="709"/>
         <w:rPr>
           <w:rFonts w:eastAsia="Times New Roman" w:cstheme="minorHAnsi"/>
           <w:kern w:val="0"/>
@@ -11473,9 +11343,7 @@
           <w:lang w:eastAsia="es-CO"/>
           <w14:ligatures w14:val="none"/>
         </w:rPr>
-        <w:t xml:space="preserve">García González, A. (22 de marzo de 2023). Conceptos básicos de electricidad: La ley de Ohm - </w:t>
-      </w:r>
-      <w:proofErr w:type="spellStart"/>
+      </w:pPr>
       <w:r>
         <w:rPr>
           <w:rFonts w:eastAsia="Times New Roman" w:cstheme="minorHAnsi"/>
@@ -11485,9 +11353,9 @@
           <w:lang w:eastAsia="es-CO"/>
           <w14:ligatures w14:val="none"/>
         </w:rPr>
-        <w:t>Panama</w:t>
-      </w:r>
-      <w:proofErr w:type="spellEnd"/>
+        <w:t xml:space="preserve">García González, A. (22 de marzo de 2023). Conceptos básicos de electricidad: La ley de Ohm - </w:t>
+      </w:r>
+      <w:proofErr w:type="spellStart"/>
       <w:r>
         <w:rPr>
           <w:rFonts w:eastAsia="Times New Roman" w:cstheme="minorHAnsi"/>
@@ -11497,9 +11365,9 @@
           <w:lang w:eastAsia="es-CO"/>
           <w14:ligatures w14:val="none"/>
         </w:rPr>
-        <w:t xml:space="preserve"> </w:t>
-      </w:r>
-      <w:proofErr w:type="spellStart"/>
+        <w:t>Panama</w:t>
+      </w:r>
+      <w:proofErr w:type="spellEnd"/>
       <w:r>
         <w:rPr>
           <w:rFonts w:eastAsia="Times New Roman" w:cstheme="minorHAnsi"/>
@@ -11509,9 +11377,9 @@
           <w:lang w:eastAsia="es-CO"/>
           <w14:ligatures w14:val="none"/>
         </w:rPr>
-        <w:t>Hitek</w:t>
-      </w:r>
-      <w:proofErr w:type="spellEnd"/>
+        <w:t xml:space="preserve"> </w:t>
+      </w:r>
+      <w:proofErr w:type="spellStart"/>
       <w:r>
         <w:rPr>
           <w:rFonts w:eastAsia="Times New Roman" w:cstheme="minorHAnsi"/>
@@ -11521,9 +11389,21 @@
           <w:lang w:eastAsia="es-CO"/>
           <w14:ligatures w14:val="none"/>
         </w:rPr>
+        <w:t>Hitek</w:t>
+      </w:r>
+      <w:proofErr w:type="spellEnd"/>
+      <w:r>
+        <w:rPr>
+          <w:rFonts w:eastAsia="Times New Roman" w:cstheme="minorHAnsi"/>
+          <w:kern w:val="0"/>
+          <w:szCs w:val="28"/>
+          <w:bdr w:val="none" w:sz="0" w:space="0" w:color="auto" w:frame="1"/>
+          <w:lang w:eastAsia="es-CO"/>
+          <w14:ligatures w14:val="none"/>
+        </w:rPr>
         <w:t>. Recuperado de </w:t>
       </w:r>
-      <w:hyperlink r:id="rId41" w:tgtFrame="_blank" w:history="1">
+      <w:hyperlink r:id="rId40" w:tgtFrame="_blank" w:history="1">
         <w:r>
           <w:rPr>
             <w:rStyle w:val="Hipervnculo"/>
@@ -11561,7 +11441,7 @@
         </w:rPr>
         <w:t>García Fraile, A. (28 de febrero de 2011). Energías renovables y no renovables. [Web blog spot]. Recuperado de </w:t>
       </w:r>
-      <w:hyperlink r:id="rId42" w:tgtFrame="_blank" w:history="1">
+      <w:hyperlink r:id="rId41" w:tgtFrame="_blank" w:history="1">
         <w:r>
           <w:rPr>
             <w:rStyle w:val="Hipervnculo"/>
@@ -11671,7 +11551,7 @@
         </w:rPr>
         <w:t>Martínez, R. (2012). Receptores eléctricos. Recuperado de </w:t>
       </w:r>
-      <w:hyperlink r:id="rId43" w:tgtFrame="_blank" w:history="1">
+      <w:hyperlink r:id="rId42" w:tgtFrame="_blank" w:history="1">
         <w:r>
           <w:rPr>
             <w:rStyle w:val="Hipervnculo"/>
@@ -11722,7 +11602,7 @@
         </w:rPr>
         <w:t>. (mar.). Medidas eléctricas en las instalaciones de baja tensión. Recuperado de </w:t>
       </w:r>
-      <w:hyperlink r:id="rId44" w:tgtFrame="_blank" w:history="1">
+      <w:hyperlink r:id="rId43" w:tgtFrame="_blank" w:history="1">
         <w:r>
           <w:rPr>
             <w:rStyle w:val="Hipervnculo"/>
@@ -11759,7 +11639,6 @@
           <w:lang w:eastAsia="es-CO"/>
           <w14:ligatures w14:val="none"/>
         </w:rPr>
-        <w:lastRenderedPageBreak/>
         <w:t>Picco</w:t>
       </w:r>
       <w:proofErr w:type="spellEnd"/>
@@ -11774,7 +11653,7 @@
         </w:rPr>
         <w:t>, D. L. (9 de mayo de 2014). El largo camino de la electricidad. [Web blog spot]. Recuperado de </w:t>
       </w:r>
-      <w:hyperlink r:id="rId45" w:tgtFrame="_blank" w:history="1">
+      <w:hyperlink r:id="rId44" w:tgtFrame="_blank" w:history="1">
         <w:r>
           <w:rPr>
             <w:rStyle w:val="Hipervnculo"/>
@@ -11810,9 +11689,10 @@
           <w:lang w:eastAsia="es-CO"/>
           <w14:ligatures w14:val="none"/>
         </w:rPr>
+        <w:lastRenderedPageBreak/>
         <w:t>Polanco Cáceres, H.G. (2010). Manual de procesos y procedimientos. [Monografía]. Universidad Santiago de Cali. Recuperado de </w:t>
       </w:r>
-      <w:hyperlink r:id="rId46" w:tgtFrame="_blank" w:history="1">
+      <w:hyperlink r:id="rId45" w:tgtFrame="_blank" w:history="1">
         <w:r>
           <w:rPr>
             <w:rStyle w:val="Hipervnculo"/>
@@ -11935,7 +11815,7 @@
         </w:rPr>
         <w:t>. Recuperado de </w:t>
       </w:r>
-      <w:hyperlink r:id="rId47" w:tgtFrame="_blank" w:history="1">
+      <w:hyperlink r:id="rId46" w:tgtFrame="_blank" w:history="1">
         <w:r>
           <w:rPr>
             <w:rStyle w:val="Hipervnculo"/>
@@ -11986,7 +11866,7 @@
         </w:rPr>
         <w:t>. (11 de febrero de 2011). Corriente eléctrica. Recuperado de </w:t>
       </w:r>
-      <w:hyperlink r:id="rId48" w:tgtFrame="_blank" w:history="1">
+      <w:hyperlink r:id="rId47" w:tgtFrame="_blank" w:history="1">
         <w:r>
           <w:rPr>
             <w:rStyle w:val="Hipervnculo"/>
@@ -12024,7 +11904,7 @@
         </w:rPr>
         <w:t>Rueda, L. (26 de abril de 2021). Electrónica: 3. tutorial de electrónica básica autor Rueda Luis. SlideShare. </w:t>
       </w:r>
-      <w:hyperlink r:id="rId49" w:tgtFrame="_blank" w:history="1">
+      <w:hyperlink r:id="rId48" w:tgtFrame="_blank" w:history="1">
         <w:r>
           <w:rPr>
             <w:rStyle w:val="Hipervnculo"/>
@@ -12099,7 +11979,7 @@
         </w:rPr>
         <w:t>. Buenos Aires: SISBI- UBA. Recuperado de: </w:t>
       </w:r>
-      <w:hyperlink r:id="rId50" w:tgtFrame="_blank" w:history="1">
+      <w:hyperlink r:id="rId49" w:tgtFrame="_blank" w:history="1">
         <w:r>
           <w:rPr>
             <w:rStyle w:val="Hipervnculo"/>
@@ -12150,7 +12030,7 @@
         </w:rPr>
         <w:t>. (s.f.). Sistema Eléctrico de Potencia. Recuperado de </w:t>
       </w:r>
-      <w:hyperlink r:id="rId51" w:tgtFrame="_blank" w:history="1">
+      <w:hyperlink r:id="rId50" w:tgtFrame="_blank" w:history="1">
         <w:r>
           <w:rPr>
             <w:rStyle w:val="Hipervnculo"/>
@@ -12169,6 +12049,7 @@
       <w:pPr>
         <w:ind w:left="709" w:hanging="709"/>
         <w:rPr>
+          <w:rStyle w:val="Hipervnculo"/>
           <w:rFonts w:eastAsia="Times New Roman" w:cstheme="minorHAnsi"/>
           <w:kern w:val="0"/>
           <w:szCs w:val="28"/>
@@ -12199,7 +12080,7 @@
         </w:rPr>
         <w:t>,</w:t>
       </w:r>
-      <w:hyperlink r:id="rId52" w:history="1">
+      <w:hyperlink r:id="rId51" w:history="1">
         <w:r>
           <w:rPr>
             <w:rStyle w:val="Hipervnculo"/>
@@ -12213,6 +12094,33 @@
           <w:t>https://www.academia.edu/38584781/ELEMENTOS_DE_UN_CIRCUITO_Unidad_1_Conceptos_b%C3%A1sicos_de_electricidad</w:t>
         </w:r>
       </w:hyperlink>
+    </w:p>
+    <w:p>
+      <w:pPr>
+        <w:ind w:left="709" w:hanging="709"/>
+        <w:rPr>
+          <w:rStyle w:val="Hipervnculo"/>
+          <w:rFonts w:eastAsia="Times New Roman" w:cstheme="minorHAnsi"/>
+          <w:kern w:val="0"/>
+          <w:szCs w:val="28"/>
+          <w:bdr w:val="none" w:sz="0" w:space="0" w:color="auto" w:frame="1"/>
+          <w:lang w:eastAsia="es-CO"/>
+          <w14:ligatures w14:val="none"/>
+        </w:rPr>
+      </w:pPr>
+    </w:p>
+    <w:p>
+      <w:pPr>
+        <w:ind w:left="709" w:hanging="709"/>
+        <w:rPr>
+          <w:rFonts w:eastAsia="Times New Roman" w:cstheme="minorHAnsi"/>
+          <w:kern w:val="0"/>
+          <w:szCs w:val="28"/>
+          <w:bdr w:val="none" w:sz="0" w:space="0" w:color="auto" w:frame="1"/>
+          <w:lang w:eastAsia="es-CO"/>
+          <w14:ligatures w14:val="none"/>
+        </w:rPr>
+      </w:pPr>
     </w:p>
     <w:p>
       <w:pPr>
@@ -12857,8 +12765,8 @@
       </w:pPr>
     </w:p>
     <w:sectPr>
-      <w:headerReference w:type="default" r:id="rId53"/>
-      <w:footerReference w:type="default" r:id="rId54"/>
+      <w:headerReference w:type="default" r:id="rId52"/>
+      <w:footerReference w:type="default" r:id="rId53"/>
       <w:pgSz w:w="12240" w:h="15840"/>
       <w:pgMar w:top="1701" w:right="1134" w:bottom="1134" w:left="1134" w:header="709" w:footer="737" w:gutter="0"/>
       <w:pgNumType w:start="1"/>
@@ -13211,7 +13119,7 @@
         <v:path o:extrusionok="f" gradientshapeok="t" o:connecttype="rect"/>
         <o:lock v:ext="edit" aspectratio="t"/>
       </v:shapetype>
-      <v:shape id="_x0000_i1038" type="#_x0000_t75" style="width:10.75pt;height:10.75pt" o:bullet="t">
+      <v:shape id="_x0000_i1049" type="#_x0000_t75" style="width:10.9pt;height:10.9pt" o:bullet="t">
         <v:imagedata r:id="rId1" o:title="mso428E"/>
       </v:shape>
     </w:pict>
@@ -17887,6 +17795,30 @@
 </file>
 
 <file path=customXml/item1.xml><?xml version="1.0" encoding="utf-8"?>
+<p:properties xmlns:p="http://schemas.microsoft.com/office/2006/metadata/properties" xmlns:xsi="http://www.w3.org/2001/XMLSchema-instance" xmlns:pc="http://schemas.microsoft.com/office/infopath/2007/PartnerControls">
+  <documentManagement>
+    <TaxCatchAll xmlns="cb45339b-ced9-4d0d-8f64-77573914d53b" xsi:nil="true"/>
+    <lcf76f155ced4ddcb4097134ff3c332f xmlns="43a3ca16-9c26-4813-b83f-4aec9927b43f">
+      <Terms xmlns="http://schemas.microsoft.com/office/infopath/2007/PartnerControls"/>
+    </lcf76f155ced4ddcb4097134ff3c332f>
+  </documentManagement>
+</p:properties>
+</file>
+
+<file path=customXml/item2.xml><?xml version="1.0" encoding="utf-8"?>
+<b:Sources xmlns:b="http://schemas.openxmlformats.org/officeDocument/2006/bibliography" xmlns="http://schemas.openxmlformats.org/officeDocument/2006/bibliography" SelectedStyle="\APASixthEditionOfficeOnline.xsl" StyleName="APA" Version="6"/>
+</file>
+
+<file path=customXml/item3.xml><?xml version="1.0" encoding="utf-8"?>
+<?mso-contentType ?>
+<FormTemplates xmlns="http://schemas.microsoft.com/sharepoint/v3/contenttype/forms">
+  <Display>DocumentLibraryForm</Display>
+  <Edit>DocumentLibraryForm</Edit>
+  <New>DocumentLibraryForm</New>
+</FormTemplates>
+</file>
+
+<file path=customXml/item4.xml><?xml version="1.0" encoding="utf-8"?>
 <ct:contentTypeSchema xmlns:ct="http://schemas.microsoft.com/office/2006/metadata/contentType" xmlns:ma="http://schemas.microsoft.com/office/2006/metadata/properties/metaAttributes" ct:_="" ma:_="" ma:contentTypeName="Documento" ma:contentTypeID="0x01010049282E1EDBE9234EA9E6D38F720E265F" ma:contentTypeVersion="15" ma:contentTypeDescription="Crear nuevo documento." ma:contentTypeScope="" ma:versionID="b31c7aa9eaf043a08b87120b3c4916e3">
   <xsd:schema xmlns:xsd="http://www.w3.org/2001/XMLSchema" xmlns:xs="http://www.w3.org/2001/XMLSchema" xmlns:p="http://schemas.microsoft.com/office/2006/metadata/properties" xmlns:ns2="cb45339b-ced9-4d0d-8f64-77573914d53b" xmlns:ns3="43a3ca16-9c26-4813-b83f-4aec9927b43f" targetNamespace="http://schemas.microsoft.com/office/2006/metadata/properties" ma:root="true" ma:fieldsID="3533d065b04d75c457075bc55f1f5315" ns2:_="" ns3:_="">
     <xsd:import namespace="cb45339b-ced9-4d0d-8f64-77573914d53b"/>
@@ -18121,31 +18053,34 @@
 </ct:contentTypeSchema>
 </file>
 
-<file path=customXml/item2.xml><?xml version="1.0" encoding="utf-8"?>
-<p:properties xmlns:p="http://schemas.microsoft.com/office/2006/metadata/properties" xmlns:xsi="http://www.w3.org/2001/XMLSchema-instance" xmlns:pc="http://schemas.microsoft.com/office/infopath/2007/PartnerControls">
-  <documentManagement>
-    <TaxCatchAll xmlns="cb45339b-ced9-4d0d-8f64-77573914d53b" xsi:nil="true"/>
-    <lcf76f155ced4ddcb4097134ff3c332f xmlns="43a3ca16-9c26-4813-b83f-4aec9927b43f">
-      <Terms xmlns="http://schemas.microsoft.com/office/infopath/2007/PartnerControls"/>
-    </lcf76f155ced4ddcb4097134ff3c332f>
-  </documentManagement>
-</p:properties>
+<file path=customXml/itemProps1.xml><?xml version="1.0" encoding="utf-8"?>
+<ds:datastoreItem xmlns:ds="http://schemas.openxmlformats.org/officeDocument/2006/customXml" ds:itemID="{26259216-AD86-464A-AEAD-95B1F9E17392}">
+  <ds:schemaRefs>
+    <ds:schemaRef ds:uri="http://schemas.microsoft.com/office/2006/metadata/properties"/>
+    <ds:schemaRef ds:uri="http://schemas.microsoft.com/office/infopath/2007/PartnerControls"/>
+    <ds:schemaRef ds:uri="cb45339b-ced9-4d0d-8f64-77573914d53b"/>
+    <ds:schemaRef ds:uri="43a3ca16-9c26-4813-b83f-4aec9927b43f"/>
+  </ds:schemaRefs>
+</ds:datastoreItem>
 </file>
 
-<file path=customXml/item3.xml><?xml version="1.0" encoding="utf-8"?>
-<?mso-contentType ?>
-<FormTemplates xmlns="http://schemas.microsoft.com/sharepoint/v3/contenttype/forms">
-  <Display>DocumentLibraryForm</Display>
-  <Edit>DocumentLibraryForm</Edit>
-  <New>DocumentLibraryForm</New>
-</FormTemplates>
+<file path=customXml/itemProps2.xml><?xml version="1.0" encoding="utf-8"?>
+<ds:datastoreItem xmlns:ds="http://schemas.openxmlformats.org/officeDocument/2006/customXml" ds:itemID="{A9F2CEBA-C824-4C86-81A8-E32CBD0EB92D}">
+  <ds:schemaRefs>
+    <ds:schemaRef ds:uri="http://schemas.openxmlformats.org/officeDocument/2006/bibliography"/>
+  </ds:schemaRefs>
+</ds:datastoreItem>
 </file>
 
-<file path=customXml/item4.xml><?xml version="1.0" encoding="utf-8"?>
-<b:Sources xmlns:b="http://schemas.openxmlformats.org/officeDocument/2006/bibliography" xmlns="http://schemas.openxmlformats.org/officeDocument/2006/bibliography" SelectedStyle="\APASixthEditionOfficeOnline.xsl" StyleName="APA" Version="6"/>
+<file path=customXml/itemProps3.xml><?xml version="1.0" encoding="utf-8"?>
+<ds:datastoreItem xmlns:ds="http://schemas.openxmlformats.org/officeDocument/2006/customXml" ds:itemID="{D00A4A46-BDBD-48AC-87B9-2BA42D9CC06F}">
+  <ds:schemaRefs>
+    <ds:schemaRef ds:uri="http://schemas.microsoft.com/sharepoint/v3/contenttype/forms"/>
+  </ds:schemaRefs>
+</ds:datastoreItem>
 </file>
 
-<file path=customXml/itemProps1.xml><?xml version="1.0" encoding="utf-8"?>
+<file path=customXml/itemProps4.xml><?xml version="1.0" encoding="utf-8"?>
 <ds:datastoreItem xmlns:ds="http://schemas.openxmlformats.org/officeDocument/2006/customXml" ds:itemID="{0BC4A0A4-89EA-4C0C-9011-C1B351E892BC}">
   <ds:schemaRefs>
     <ds:schemaRef ds:uri="http://schemas.microsoft.com/office/2006/metadata/contentType"/>
@@ -18162,31 +18097,4 @@
     <ds:schemaRef ds:uri="http://schemas.microsoft.com/internal/obd"/>
   </ds:schemaRefs>
 </ds:datastoreItem>
-</file>
-
-<file path=customXml/itemProps2.xml><?xml version="1.0" encoding="utf-8"?>
-<ds:datastoreItem xmlns:ds="http://schemas.openxmlformats.org/officeDocument/2006/customXml" ds:itemID="{26259216-AD86-464A-AEAD-95B1F9E17392}">
-  <ds:schemaRefs>
-    <ds:schemaRef ds:uri="http://schemas.microsoft.com/office/2006/metadata/properties"/>
-    <ds:schemaRef ds:uri="http://schemas.microsoft.com/office/infopath/2007/PartnerControls"/>
-    <ds:schemaRef ds:uri="cb45339b-ced9-4d0d-8f64-77573914d53b"/>
-    <ds:schemaRef ds:uri="43a3ca16-9c26-4813-b83f-4aec9927b43f"/>
-  </ds:schemaRefs>
-</ds:datastoreItem>
-</file>
-
-<file path=customXml/itemProps3.xml><?xml version="1.0" encoding="utf-8"?>
-<ds:datastoreItem xmlns:ds="http://schemas.openxmlformats.org/officeDocument/2006/customXml" ds:itemID="{D00A4A46-BDBD-48AC-87B9-2BA42D9CC06F}">
-  <ds:schemaRefs>
-    <ds:schemaRef ds:uri="http://schemas.microsoft.com/sharepoint/v3/contenttype/forms"/>
-  </ds:schemaRefs>
-</ds:datastoreItem>
-</file>
-
-<file path=customXml/itemProps4.xml><?xml version="1.0" encoding="utf-8"?>
-<ds:datastoreItem xmlns:ds="http://schemas.openxmlformats.org/officeDocument/2006/customXml" ds:itemID="{A9F2CEBA-C824-4C86-81A8-E32CBD0EB92D}">
-  <ds:schemaRefs>
-    <ds:schemaRef ds:uri="http://schemas.openxmlformats.org/officeDocument/2006/bibliography"/>
-  </ds:schemaRefs>
-</ds:datastoreItem>
 </file>
</xml_diff>

<commit_message>
Ajustes Repo, CFA y .Zip
</commit_message>
<xml_diff>
--- a/fuentes/CF1_82110034_DU.docx
+++ b/fuentes/CF1_82110034_DU.docx
@@ -1,6 +1,6 @@
 
 <file path=word/document.xml><?xml version="1.0" encoding="utf-8"?>
-<w:document xmlns:wpc="http://schemas.microsoft.com/office/word/2010/wordprocessingCanvas" xmlns:cx="http://schemas.microsoft.com/office/drawing/2014/chartex" xmlns:cx1="http://schemas.microsoft.com/office/drawing/2015/9/8/chartex" xmlns:cx2="http://schemas.microsoft.com/office/drawing/2015/10/21/chartex" xmlns:cx3="http://schemas.microsoft.com/office/drawing/2016/5/9/chartex" xmlns:cx4="http://schemas.microsoft.com/office/drawing/2016/5/10/chartex" xmlns:cx5="http://schemas.microsoft.com/office/drawing/2016/5/11/chartex" xmlns:cx6="http://schemas.microsoft.com/office/drawing/2016/5/12/chartex" xmlns:cx7="http://schemas.microsoft.com/office/drawing/2016/5/13/chartex" xmlns:cx8="http://schemas.microsoft.com/office/drawing/2016/5/14/chartex" xmlns:mc="http://schemas.openxmlformats.org/markup-compatibility/2006" xmlns:aink="http://schemas.microsoft.com/office/drawing/2016/ink" xmlns:am3d="http://schemas.microsoft.com/office/drawing/2017/model3d" xmlns:o="urn:schemas-microsoft-com:office:office" xmlns:r="http://schemas.openxmlformats.org/officeDocument/2006/relationships" xmlns:m="http://schemas.openxmlformats.org/officeDocument/2006/math" xmlns:v="urn:schemas-microsoft-com:vml" xmlns:wp14="http://schemas.microsoft.com/office/word/2010/wordprocessingDrawing" xmlns:wp="http://schemas.openxmlformats.org/drawingml/2006/wordprocessingDrawing" xmlns:w10="urn:schemas-microsoft-com:office:word" xmlns:w="http://schemas.openxmlformats.org/wordprocessingml/2006/main" xmlns:w14="http://schemas.microsoft.com/office/word/2010/wordml" xmlns:w15="http://schemas.microsoft.com/office/word/2012/wordml" xmlns:w16cex="http://schemas.microsoft.com/office/word/2018/wordml/cex" xmlns:w16cid="http://schemas.microsoft.com/office/word/2016/wordml/cid" xmlns:w16="http://schemas.microsoft.com/office/word/2018/wordml" xmlns:w16sdtdh="http://schemas.microsoft.com/office/word/2020/wordml/sdtdatahash" xmlns:w16se="http://schemas.microsoft.com/office/word/2015/wordml/symex" xmlns:wpg="http://schemas.microsoft.com/office/word/2010/wordprocessingGroup" xmlns:wpi="http://schemas.microsoft.com/office/word/2010/wordprocessingInk" xmlns:wne="http://schemas.microsoft.com/office/word/2006/wordml" xmlns:wps="http://schemas.microsoft.com/office/word/2010/wordprocessingShape" mc:Ignorable="w14 w15 w16se w16cid w16 w16cex w16sdtdh wp14">
+<w:document xmlns:wpc="http://schemas.microsoft.com/office/word/2010/wordprocessingCanvas" xmlns:cx="http://schemas.microsoft.com/office/drawing/2014/chartex" xmlns:cx1="http://schemas.microsoft.com/office/drawing/2015/9/8/chartex" xmlns:cx2="http://schemas.microsoft.com/office/drawing/2015/10/21/chartex" xmlns:cx3="http://schemas.microsoft.com/office/drawing/2016/5/9/chartex" xmlns:cx4="http://schemas.microsoft.com/office/drawing/2016/5/10/chartex" xmlns:cx5="http://schemas.microsoft.com/office/drawing/2016/5/11/chartex" xmlns:cx6="http://schemas.microsoft.com/office/drawing/2016/5/12/chartex" xmlns:cx7="http://schemas.microsoft.com/office/drawing/2016/5/13/chartex" xmlns:cx8="http://schemas.microsoft.com/office/drawing/2016/5/14/chartex" xmlns:mc="http://schemas.openxmlformats.org/markup-compatibility/2006" xmlns:aink="http://schemas.microsoft.com/office/drawing/2016/ink" xmlns:am3d="http://schemas.microsoft.com/office/drawing/2017/model3d" xmlns:o="urn:schemas-microsoft-com:office:office" xmlns:oel="http://schemas.microsoft.com/office/2019/extlst" xmlns:r="http://schemas.openxmlformats.org/officeDocument/2006/relationships" xmlns:m="http://schemas.openxmlformats.org/officeDocument/2006/math" xmlns:v="urn:schemas-microsoft-com:vml" xmlns:wp14="http://schemas.microsoft.com/office/word/2010/wordprocessingDrawing" xmlns:wp="http://schemas.openxmlformats.org/drawingml/2006/wordprocessingDrawing" xmlns:w10="urn:schemas-microsoft-com:office:word" xmlns:w="http://schemas.openxmlformats.org/wordprocessingml/2006/main" xmlns:w14="http://schemas.microsoft.com/office/word/2010/wordml" xmlns:w15="http://schemas.microsoft.com/office/word/2012/wordml" xmlns:w16cex="http://schemas.microsoft.com/office/word/2018/wordml/cex" xmlns:w16cid="http://schemas.microsoft.com/office/word/2016/wordml/cid" xmlns:w16="http://schemas.microsoft.com/office/word/2018/wordml" xmlns:w16du="http://schemas.microsoft.com/office/word/2023/wordml/word16du" xmlns:w16sdtdh="http://schemas.microsoft.com/office/word/2020/wordml/sdtdatahash" xmlns:w16sdtfl="http://schemas.microsoft.com/office/word/2024/wordml/sdtformatlock" xmlns:w16se="http://schemas.microsoft.com/office/word/2015/wordml/symex" xmlns:wpg="http://schemas.microsoft.com/office/word/2010/wordprocessingGroup" xmlns:wpi="http://schemas.microsoft.com/office/word/2010/wordprocessingInk" xmlns:wne="http://schemas.microsoft.com/office/word/2006/wordml" xmlns:wps="http://schemas.microsoft.com/office/word/2010/wordprocessingShape" mc:Ignorable="w14 w15 w16se w16cid w16 w16cex w16sdtdh w16sdtfl w16du wp14">
   <w:body>
     <w:p>
       <w:r>
@@ -308,7 +308,7 @@
                 <v:stroke joinstyle="miter"/>
                 <v:path gradientshapeok="t" o:connecttype="rect"/>
               </v:shapetype>
-              <v:shape id="Cuadro de texto 2" o:spid="_x0000_s1026" type="#_x0000_t202" alt="&quot;&quot;" style="position:absolute;left:0;text-align:left;margin-left:-19.8pt;margin-top:36.75pt;width:488.95pt;height:115.5pt;z-index:251663360;visibility:visible;mso-wrap-style:square;mso-width-percent:0;mso-height-percent:0;mso-wrap-distance-left:9pt;mso-wrap-distance-top:3.6pt;mso-wrap-distance-right:9pt;mso-wrap-distance-bottom:3.6pt;mso-position-horizontal:absolute;mso-position-horizontal-relative:text;mso-position-vertical:absolute;mso-position-vertical-relative:text;mso-width-percent:0;mso-height-percent:0;mso-width-relative:margin;mso-height-relative:margin;v-text-anchor:top" o:gfxdata="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" filled="f" stroked="f">
+              <v:shape id="Cuadro de texto 2" o:spid="_x0000_s1026" type="#_x0000_t202" alt="&quot;&quot;" style="position:absolute;left:0;text-align:left;margin-left:-19.8pt;margin-top:36.75pt;width:488.95pt;height:115.5pt;z-index:251663360;visibility:visible;mso-wrap-style:square;mso-width-percent:0;mso-height-percent:0;mso-wrap-distance-left:9pt;mso-wrap-distance-top:3.6pt;mso-wrap-distance-right:9pt;mso-wrap-distance-bottom:3.6pt;mso-position-horizontal:absolute;mso-position-horizontal-relative:text;mso-position-vertical:absolute;mso-position-vertical-relative:text;mso-width-percent:0;mso-height-percent:0;mso-width-relative:margin;mso-height-relative:margin;v-text-anchor:top" o:gfxdata="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" filled="f" stroked="f">
                 <v:textbox>
                   <w:txbxContent>
                     <w:p>
@@ -530,10 +530,9 @@
             <w:rPr>
               <w:rFonts w:eastAsiaTheme="minorEastAsia"/>
               <w:noProof/>
-              <w:kern w:val="0"/>
-              <w:sz w:val="22"/>
-              <w:lang w:eastAsia="es-CO"/>
-              <w14:ligatures w14:val="none"/>
+              <w:sz w:val="24"/>
+              <w:szCs w:val="24"/>
+              <w:lang w:eastAsia="es-MX"/>
             </w:rPr>
           </w:pPr>
           <w:r>
@@ -557,7 +556,7 @@
             </w:rPr>
             <w:fldChar w:fldCharType="separate"/>
           </w:r>
-          <w:hyperlink w:anchor="_Toc202373144" w:history="1">
+          <w:hyperlink w:anchor="_Toc203582977" w:history="1">
             <w:r>
               <w:rPr>
                 <w:rStyle w:val="Hipervnculo"/>
@@ -584,7 +583,7 @@
                 <w:noProof/>
                 <w:webHidden/>
               </w:rPr>
-              <w:instrText xml:space="preserve"> PAGEREF _Toc202373144 \h </w:instrText>
+              <w:instrText xml:space="preserve"> PAGEREF _Toc203582977 \h </w:instrText>
             </w:r>
             <w:r>
               <w:rPr>
@@ -621,13 +620,12 @@
             <w:rPr>
               <w:rFonts w:eastAsiaTheme="minorEastAsia"/>
               <w:noProof/>
-              <w:kern w:val="0"/>
-              <w:sz w:val="22"/>
-              <w:lang w:eastAsia="es-CO"/>
-              <w14:ligatures w14:val="none"/>
+              <w:sz w:val="24"/>
+              <w:szCs w:val="24"/>
+              <w:lang w:eastAsia="es-MX"/>
             </w:rPr>
           </w:pPr>
-          <w:hyperlink w:anchor="_Toc202373145" w:history="1">
+          <w:hyperlink w:anchor="_Toc203582978" w:history="1">
             <w:r>
               <w:rPr>
                 <w:rStyle w:val="Hipervnculo"/>
@@ -639,10 +637,9 @@
               <w:rPr>
                 <w:rFonts w:eastAsiaTheme="minorEastAsia"/>
                 <w:noProof/>
-                <w:kern w:val="0"/>
-                <w:sz w:val="22"/>
-                <w:lang w:eastAsia="es-CO"/>
-                <w14:ligatures w14:val="none"/>
+                <w:sz w:val="24"/>
+                <w:szCs w:val="24"/>
+                <w:lang w:eastAsia="es-MX"/>
               </w:rPr>
               <w:tab/>
             </w:r>
@@ -672,7 +669,7 @@
                 <w:noProof/>
                 <w:webHidden/>
               </w:rPr>
-              <w:instrText xml:space="preserve"> PAGEREF _Toc202373145 \h </w:instrText>
+              <w:instrText xml:space="preserve"> PAGEREF _Toc203582978 \h </w:instrText>
             </w:r>
             <w:r>
               <w:rPr>
@@ -709,13 +706,12 @@
             <w:rPr>
               <w:rFonts w:eastAsiaTheme="minorEastAsia"/>
               <w:noProof/>
-              <w:kern w:val="0"/>
-              <w:sz w:val="22"/>
-              <w:lang w:eastAsia="es-CO"/>
-              <w14:ligatures w14:val="none"/>
+              <w:sz w:val="24"/>
+              <w:szCs w:val="24"/>
+              <w:lang w:eastAsia="es-MX"/>
             </w:rPr>
           </w:pPr>
-          <w:hyperlink w:anchor="_Toc202373146" w:history="1">
+          <w:hyperlink w:anchor="_Toc203582979" w:history="1">
             <w:r>
               <w:rPr>
                 <w:rStyle w:val="Hipervnculo"/>
@@ -727,10 +723,9 @@
               <w:rPr>
                 <w:rFonts w:eastAsiaTheme="minorEastAsia"/>
                 <w:noProof/>
-                <w:kern w:val="0"/>
-                <w:sz w:val="22"/>
-                <w:lang w:eastAsia="es-CO"/>
-                <w14:ligatures w14:val="none"/>
+                <w:sz w:val="24"/>
+                <w:szCs w:val="24"/>
+                <w:lang w:eastAsia="es-MX"/>
               </w:rPr>
               <w:tab/>
             </w:r>
@@ -760,7 +755,7 @@
                 <w:noProof/>
                 <w:webHidden/>
               </w:rPr>
-              <w:instrText xml:space="preserve"> PAGEREF _Toc202373146 \h </w:instrText>
+              <w:instrText xml:space="preserve"> PAGEREF _Toc203582979 \h </w:instrText>
             </w:r>
             <w:r>
               <w:rPr>
@@ -797,13 +792,12 @@
             <w:rPr>
               <w:rFonts w:eastAsiaTheme="minorEastAsia"/>
               <w:noProof/>
-              <w:kern w:val="0"/>
-              <w:sz w:val="22"/>
-              <w:lang w:eastAsia="es-CO"/>
-              <w14:ligatures w14:val="none"/>
+              <w:sz w:val="24"/>
+              <w:szCs w:val="24"/>
+              <w:lang w:eastAsia="es-MX"/>
             </w:rPr>
           </w:pPr>
-          <w:hyperlink w:anchor="_Toc202373147" w:history="1">
+          <w:hyperlink w:anchor="_Toc203582980" w:history="1">
             <w:r>
               <w:rPr>
                 <w:rStyle w:val="Hipervnculo"/>
@@ -815,10 +809,9 @@
               <w:rPr>
                 <w:rFonts w:eastAsiaTheme="minorEastAsia"/>
                 <w:noProof/>
-                <w:kern w:val="0"/>
-                <w:sz w:val="22"/>
-                <w:lang w:eastAsia="es-CO"/>
-                <w14:ligatures w14:val="none"/>
+                <w:sz w:val="24"/>
+                <w:szCs w:val="24"/>
+                <w:lang w:eastAsia="es-MX"/>
               </w:rPr>
               <w:tab/>
             </w:r>
@@ -848,7 +841,7 @@
                 <w:noProof/>
                 <w:webHidden/>
               </w:rPr>
-              <w:instrText xml:space="preserve"> PAGEREF _Toc202373147 \h </w:instrText>
+              <w:instrText xml:space="preserve"> PAGEREF _Toc203582980 \h </w:instrText>
             </w:r>
             <w:r>
               <w:rPr>
@@ -885,13 +878,12 @@
             <w:rPr>
               <w:rFonts w:eastAsiaTheme="minorEastAsia"/>
               <w:noProof/>
-              <w:kern w:val="0"/>
-              <w:sz w:val="22"/>
-              <w:lang w:eastAsia="es-CO"/>
-              <w14:ligatures w14:val="none"/>
+              <w:sz w:val="24"/>
+              <w:szCs w:val="24"/>
+              <w:lang w:eastAsia="es-MX"/>
             </w:rPr>
           </w:pPr>
-          <w:hyperlink w:anchor="_Toc202373148" w:history="1">
+          <w:hyperlink w:anchor="_Toc203582981" w:history="1">
             <w:r>
               <w:rPr>
                 <w:rStyle w:val="Hipervnculo"/>
@@ -903,10 +895,9 @@
               <w:rPr>
                 <w:rFonts w:eastAsiaTheme="minorEastAsia"/>
                 <w:noProof/>
-                <w:kern w:val="0"/>
-                <w:sz w:val="22"/>
-                <w:lang w:eastAsia="es-CO"/>
-                <w14:ligatures w14:val="none"/>
+                <w:sz w:val="24"/>
+                <w:szCs w:val="24"/>
+                <w:lang w:eastAsia="es-MX"/>
               </w:rPr>
               <w:tab/>
             </w:r>
@@ -936,7 +927,7 @@
                 <w:noProof/>
                 <w:webHidden/>
               </w:rPr>
-              <w:instrText xml:space="preserve"> PAGEREF _Toc202373148 \h </w:instrText>
+              <w:instrText xml:space="preserve"> PAGEREF _Toc203582981 \h </w:instrText>
             </w:r>
             <w:r>
               <w:rPr>
@@ -973,13 +964,12 @@
             <w:rPr>
               <w:rFonts w:eastAsiaTheme="minorEastAsia"/>
               <w:noProof/>
-              <w:kern w:val="0"/>
-              <w:sz w:val="22"/>
-              <w:lang w:eastAsia="es-CO"/>
-              <w14:ligatures w14:val="none"/>
+              <w:sz w:val="24"/>
+              <w:szCs w:val="24"/>
+              <w:lang w:eastAsia="es-MX"/>
             </w:rPr>
           </w:pPr>
-          <w:hyperlink w:anchor="_Toc202373149" w:history="1">
+          <w:hyperlink w:anchor="_Toc203582982" w:history="1">
             <w:r>
               <w:rPr>
                 <w:rStyle w:val="Hipervnculo"/>
@@ -991,10 +981,9 @@
               <w:rPr>
                 <w:rFonts w:eastAsiaTheme="minorEastAsia"/>
                 <w:noProof/>
-                <w:kern w:val="0"/>
-                <w:sz w:val="22"/>
-                <w:lang w:eastAsia="es-CO"/>
-                <w14:ligatures w14:val="none"/>
+                <w:sz w:val="24"/>
+                <w:szCs w:val="24"/>
+                <w:lang w:eastAsia="es-MX"/>
               </w:rPr>
               <w:tab/>
             </w:r>
@@ -1024,7 +1013,7 @@
                 <w:noProof/>
                 <w:webHidden/>
               </w:rPr>
-              <w:instrText xml:space="preserve"> PAGEREF _Toc202373149 \h </w:instrText>
+              <w:instrText xml:space="preserve"> PAGEREF _Toc203582982 \h </w:instrText>
             </w:r>
             <w:r>
               <w:rPr>
@@ -1061,13 +1050,12 @@
             <w:rPr>
               <w:rFonts w:eastAsiaTheme="minorEastAsia"/>
               <w:noProof/>
-              <w:kern w:val="0"/>
-              <w:sz w:val="22"/>
-              <w:lang w:eastAsia="es-CO"/>
-              <w14:ligatures w14:val="none"/>
+              <w:sz w:val="24"/>
+              <w:szCs w:val="24"/>
+              <w:lang w:eastAsia="es-MX"/>
             </w:rPr>
           </w:pPr>
-          <w:hyperlink w:anchor="_Toc202373150" w:history="1">
+          <w:hyperlink w:anchor="_Toc203582983" w:history="1">
             <w:r>
               <w:rPr>
                 <w:rStyle w:val="Hipervnculo"/>
@@ -1079,10 +1067,9 @@
               <w:rPr>
                 <w:rFonts w:eastAsiaTheme="minorEastAsia"/>
                 <w:noProof/>
-                <w:kern w:val="0"/>
-                <w:sz w:val="22"/>
-                <w:lang w:eastAsia="es-CO"/>
-                <w14:ligatures w14:val="none"/>
+                <w:sz w:val="24"/>
+                <w:szCs w:val="24"/>
+                <w:lang w:eastAsia="es-MX"/>
               </w:rPr>
               <w:tab/>
             </w:r>
@@ -1112,7 +1099,7 @@
                 <w:noProof/>
                 <w:webHidden/>
               </w:rPr>
-              <w:instrText xml:space="preserve"> PAGEREF _Toc202373150 \h </w:instrText>
+              <w:instrText xml:space="preserve"> PAGEREF _Toc203582983 \h </w:instrText>
             </w:r>
             <w:r>
               <w:rPr>
@@ -1149,13 +1136,12 @@
             <w:rPr>
               <w:rFonts w:eastAsiaTheme="minorEastAsia"/>
               <w:noProof/>
-              <w:kern w:val="0"/>
-              <w:sz w:val="22"/>
-              <w:lang w:eastAsia="es-CO"/>
-              <w14:ligatures w14:val="none"/>
+              <w:sz w:val="24"/>
+              <w:szCs w:val="24"/>
+              <w:lang w:eastAsia="es-MX"/>
             </w:rPr>
           </w:pPr>
-          <w:hyperlink w:anchor="_Toc202373151" w:history="1">
+          <w:hyperlink w:anchor="_Toc203582984" w:history="1">
             <w:r>
               <w:rPr>
                 <w:rStyle w:val="Hipervnculo"/>
@@ -1167,10 +1153,9 @@
               <w:rPr>
                 <w:rFonts w:eastAsiaTheme="minorEastAsia"/>
                 <w:noProof/>
-                <w:kern w:val="0"/>
-                <w:sz w:val="22"/>
-                <w:lang w:eastAsia="es-CO"/>
-                <w14:ligatures w14:val="none"/>
+                <w:sz w:val="24"/>
+                <w:szCs w:val="24"/>
+                <w:lang w:eastAsia="es-MX"/>
               </w:rPr>
               <w:tab/>
             </w:r>
@@ -1200,7 +1185,7 @@
                 <w:noProof/>
                 <w:webHidden/>
               </w:rPr>
-              <w:instrText xml:space="preserve"> PAGEREF _Toc202373151 \h </w:instrText>
+              <w:instrText xml:space="preserve"> PAGEREF _Toc203582984 \h </w:instrText>
             </w:r>
             <w:r>
               <w:rPr>
@@ -1237,13 +1222,12 @@
             <w:rPr>
               <w:rFonts w:eastAsiaTheme="minorEastAsia"/>
               <w:noProof/>
-              <w:kern w:val="0"/>
-              <w:sz w:val="22"/>
-              <w:lang w:eastAsia="es-CO"/>
-              <w14:ligatures w14:val="none"/>
+              <w:sz w:val="24"/>
+              <w:szCs w:val="24"/>
+              <w:lang w:eastAsia="es-MX"/>
             </w:rPr>
           </w:pPr>
-          <w:hyperlink w:anchor="_Toc202373152" w:history="1">
+          <w:hyperlink w:anchor="_Toc203582985" w:history="1">
             <w:r>
               <w:rPr>
                 <w:rStyle w:val="Hipervnculo"/>
@@ -1270,7 +1254,7 @@
                 <w:noProof/>
                 <w:webHidden/>
               </w:rPr>
-              <w:instrText xml:space="preserve"> PAGEREF _Toc202373152 \h </w:instrText>
+              <w:instrText xml:space="preserve"> PAGEREF _Toc203582985 \h </w:instrText>
             </w:r>
             <w:r>
               <w:rPr>
@@ -1307,13 +1291,12 @@
             <w:rPr>
               <w:rFonts w:eastAsiaTheme="minorEastAsia"/>
               <w:noProof/>
-              <w:kern w:val="0"/>
-              <w:sz w:val="22"/>
-              <w:lang w:eastAsia="es-CO"/>
-              <w14:ligatures w14:val="none"/>
+              <w:sz w:val="24"/>
+              <w:szCs w:val="24"/>
+              <w:lang w:eastAsia="es-MX"/>
             </w:rPr>
           </w:pPr>
-          <w:hyperlink w:anchor="_Toc202373153" w:history="1">
+          <w:hyperlink w:anchor="_Toc203582986" w:history="1">
             <w:r>
               <w:rPr>
                 <w:rStyle w:val="Hipervnculo"/>
@@ -1340,7 +1323,7 @@
                 <w:noProof/>
                 <w:webHidden/>
               </w:rPr>
-              <w:instrText xml:space="preserve"> PAGEREF _Toc202373153 \h </w:instrText>
+              <w:instrText xml:space="preserve"> PAGEREF _Toc203582986 \h </w:instrText>
             </w:r>
             <w:r>
               <w:rPr>
@@ -1377,13 +1360,12 @@
             <w:rPr>
               <w:rFonts w:eastAsiaTheme="minorEastAsia"/>
               <w:noProof/>
-              <w:kern w:val="0"/>
-              <w:sz w:val="22"/>
-              <w:lang w:eastAsia="es-CO"/>
-              <w14:ligatures w14:val="none"/>
+              <w:sz w:val="24"/>
+              <w:szCs w:val="24"/>
+              <w:lang w:eastAsia="es-MX"/>
             </w:rPr>
           </w:pPr>
-          <w:hyperlink w:anchor="_Toc202373154" w:history="1">
+          <w:hyperlink w:anchor="_Toc203582987" w:history="1">
             <w:r>
               <w:rPr>
                 <w:rStyle w:val="Hipervnculo"/>
@@ -1410,7 +1392,7 @@
                 <w:noProof/>
                 <w:webHidden/>
               </w:rPr>
-              <w:instrText xml:space="preserve"> PAGEREF _Toc202373154 \h </w:instrText>
+              <w:instrText xml:space="preserve"> PAGEREF _Toc203582987 \h </w:instrText>
             </w:r>
             <w:r>
               <w:rPr>
@@ -1447,13 +1429,12 @@
             <w:rPr>
               <w:rFonts w:eastAsiaTheme="minorEastAsia"/>
               <w:noProof/>
-              <w:kern w:val="0"/>
-              <w:sz w:val="22"/>
-              <w:lang w:eastAsia="es-CO"/>
-              <w14:ligatures w14:val="none"/>
+              <w:sz w:val="24"/>
+              <w:szCs w:val="24"/>
+              <w:lang w:eastAsia="es-MX"/>
             </w:rPr>
           </w:pPr>
-          <w:hyperlink w:anchor="_Toc202373155" w:history="1">
+          <w:hyperlink w:anchor="_Toc203582988" w:history="1">
             <w:r>
               <w:rPr>
                 <w:rStyle w:val="Hipervnculo"/>
@@ -1481,7 +1462,7 @@
                 <w:noProof/>
                 <w:webHidden/>
               </w:rPr>
-              <w:instrText xml:space="preserve"> PAGEREF _Toc202373155 \h </w:instrText>
+              <w:instrText xml:space="preserve"> PAGEREF _Toc203582988 \h </w:instrText>
             </w:r>
             <w:r>
               <w:rPr>
@@ -1518,13 +1499,12 @@
             <w:rPr>
               <w:rFonts w:eastAsiaTheme="minorEastAsia"/>
               <w:noProof/>
-              <w:kern w:val="0"/>
-              <w:sz w:val="22"/>
-              <w:lang w:eastAsia="es-CO"/>
-              <w14:ligatures w14:val="none"/>
+              <w:sz w:val="24"/>
+              <w:szCs w:val="24"/>
+              <w:lang w:eastAsia="es-MX"/>
             </w:rPr>
           </w:pPr>
-          <w:hyperlink w:anchor="_Toc202373156" w:history="1">
+          <w:hyperlink w:anchor="_Toc203582989" w:history="1">
             <w:r>
               <w:rPr>
                 <w:rStyle w:val="Hipervnculo"/>
@@ -1551,7 +1531,7 @@
                 <w:noProof/>
                 <w:webHidden/>
               </w:rPr>
-              <w:instrText xml:space="preserve"> PAGEREF _Toc202373156 \h </w:instrText>
+              <w:instrText xml:space="preserve"> PAGEREF _Toc203582989 \h </w:instrText>
             </w:r>
             <w:r>
               <w:rPr>
@@ -1623,7 +1603,7 @@
         </w:numPr>
         <w:ind w:left="1068"/>
       </w:pPr>
-      <w:bookmarkStart w:id="0" w:name="_Toc202373144"/>
+      <w:bookmarkStart w:id="0" w:name="_Toc203582977"/>
       <w:r>
         <w:lastRenderedPageBreak/>
         <w:t>Introducción</w:t>
@@ -1816,7 +1796,52 @@
               <w:rPr>
                 <w:lang w:val="es-419" w:eastAsia="es-CO"/>
               </w:rPr>
-              <w:t>Bienvenido al componente formativo Conceptos básicos de electricidad. En este espacio abordaremos los conocimientos fundamentales que nos permitirán comprender los principios esenciales que rigen el funcionamiento de la electricidad en nuestros hogares. La electricidad es una parte vital de nuestra vida cotidiana, ya que nos proporciona luz, calor y energía para el funcionamiento de múltiples dispositivos. No obstante, muchas veces la damos por sentada y desconocemos cómo opera realmente. A lo largo de este componente, exploraremos conceptos clave como la corriente eléctrica, la tensión, la resistencia y los circuitos eléctricos, además de las normativas básicas de seguridad que se deben seguir al trabajar con electricidad. Esta comprensión no solo permitirá entender cómo se genera y distribuye la electricidad, sino también cómo utilizarla de forma segura y eficiente en nuestras instalaciones. Al finalizar este componente, se sentirá más seguro y capacitado para realizar proyectos eléctricos en el hogar, siempre actuando con la precaución necesaria.</w:t>
+              <w:t>Bienvenido al componente formativo conceptos básicos de electricidad</w:t>
+            </w:r>
+            <w:r>
+              <w:rPr>
+                <w:lang w:val="es-419" w:eastAsia="es-CO"/>
+              </w:rPr>
+              <w:t>.</w:t>
+            </w:r>
+          </w:p>
+          <w:p>
+            <w:pPr>
+              <w:rPr>
+                <w:lang w:val="es-419" w:eastAsia="es-CO"/>
+              </w:rPr>
+            </w:pPr>
+            <w:r>
+              <w:rPr>
+                <w:lang w:val="es-419" w:eastAsia="es-CO"/>
+              </w:rPr>
+              <w:t>Abordaremos los conceptos básicos que nos permitirán comprender los principios fundamentales que rigen el funcionamiento de la electricidad en nuestros hogares.</w:t>
+            </w:r>
+          </w:p>
+          <w:p>
+            <w:pPr>
+              <w:rPr>
+                <w:lang w:val="es-419" w:eastAsia="es-CO"/>
+              </w:rPr>
+            </w:pPr>
+            <w:r>
+              <w:rPr>
+                <w:lang w:val="es-419" w:eastAsia="es-CO"/>
+              </w:rPr>
+              <w:t>La electricidad es una parte esencial de nuestra vida cotidiana; nos proporciona luz, calor y energía para nuestros dispositivos. Sin embargo, a menudo la consideramos algo habitual y desconocemos cómo funciona realmente. A lo largo de este componente, exploraremos los conceptos clave que nos ayudarán a entender no solo cómo se genera y distribuye la electricidad, sino también cómo podemos utilizarla de manera segura y eficiente en nuestras instalaciones.</w:t>
+            </w:r>
+          </w:p>
+          <w:p>
+            <w:pPr>
+              <w:rPr>
+                <w:lang w:val="es-419" w:eastAsia="es-CO"/>
+              </w:rPr>
+            </w:pPr>
+            <w:r>
+              <w:rPr>
+                <w:lang w:val="es-419" w:eastAsia="es-CO"/>
+              </w:rPr>
+              <w:t>Abordaremos temas como la corriente eléctrica, la tensión, la resistencia y los circuitos, así como las normativas básicas de seguridad que debemos seguir al trabajar con electricidad. Al final de este componente, se sentirá más seguro y capacitado para abordar proyectos eléctricos en su hogar, siempre con la precaución necesaria.</w:t>
             </w:r>
           </w:p>
         </w:tc>
@@ -1846,27 +1871,6 @@
     </w:p>
     <w:p>
       <w:pPr>
-        <w:rPr>
-          <w:lang w:val="es-419" w:eastAsia="es-CO"/>
-        </w:rPr>
-      </w:pPr>
-    </w:p>
-    <w:p>
-      <w:pPr>
-        <w:rPr>
-          <w:lang w:val="es-419" w:eastAsia="es-CO"/>
-        </w:rPr>
-      </w:pPr>
-    </w:p>
-    <w:p>
-      <w:pPr>
-        <w:rPr>
-          <w:lang w:val="es-419" w:eastAsia="es-CO"/>
-        </w:rPr>
-      </w:pPr>
-    </w:p>
-    <w:p>
-      <w:pPr>
         <w:ind w:firstLine="0"/>
         <w:rPr>
           <w:lang w:val="es-419" w:eastAsia="es-CO"/>
@@ -1875,9 +1879,17 @@
     </w:p>
     <w:p>
       <w:pPr>
+        <w:ind w:firstLine="0"/>
+        <w:rPr>
+          <w:lang w:val="es-419" w:eastAsia="es-CO"/>
+        </w:rPr>
+      </w:pPr>
+    </w:p>
+    <w:p>
+      <w:pPr>
         <w:pStyle w:val="Ttulo1"/>
       </w:pPr>
-      <w:bookmarkStart w:id="1" w:name="_Toc202373145"/>
+      <w:bookmarkStart w:id="1" w:name="_Toc203582978"/>
       <w:r>
         <w:lastRenderedPageBreak/>
         <w:t>Fundamentos esenciales de electricidad</w:t>
@@ -1895,6 +1907,23 @@
           <w:lang w:eastAsia="es-CO"/>
         </w:rPr>
         <w:t>La electricidad es un fenómeno físico originado por la presencia y el movimiento de cargas eléctricas, principalmente los electrones. Se manifiesta en diferentes formas de energía como la térmica, mecánica, luminosa y química, lo que la convierte en una herramienta indispensable en la vida cotidiana, especialmente en el hogar, donde se utiliza para iluminación, calefacción y funcionamiento de electrodomésticos.</w:t>
+      </w:r>
+    </w:p>
+    <w:p>
+      <w:pPr>
+        <w:rPr>
+          <w:b/>
+          <w:bCs/>
+          <w:lang w:eastAsia="es-CO"/>
+        </w:rPr>
+      </w:pPr>
+      <w:r>
+        <w:rPr>
+          <w:b/>
+          <w:bCs/>
+          <w:lang w:eastAsia="es-CO"/>
+        </w:rPr>
+        <w:t>Para ampliar esta información diríjase a La carpeta de anexos donde encontrará información clave sobre:</w:t>
       </w:r>
     </w:p>
     <w:p>
@@ -1902,43 +1931,9 @@
         <w:pStyle w:val="Prrafodelista"/>
         <w:numPr>
           <w:ilvl w:val="0"/>
-          <w:numId w:val="9"/>
+          <w:numId w:val="28"/>
         </w:numPr>
         <w:rPr>
-          <w:b/>
-          <w:bCs/>
-          <w:lang w:eastAsia="es-CO"/>
-        </w:rPr>
-      </w:pPr>
-      <w:r>
-        <w:rPr>
-          <w:b/>
-          <w:bCs/>
-          <w:lang w:eastAsia="es-CO"/>
-        </w:rPr>
-        <w:t>Para ampliar esta información diríjase a L</w:t>
-      </w:r>
-      <w:r>
-        <w:rPr>
-          <w:b/>
-          <w:bCs/>
-          <w:lang w:eastAsia="es-CO"/>
-        </w:rPr>
-        <w:t xml:space="preserve">a carpeta de anexos </w:t>
-      </w:r>
-      <w:r>
-        <w:rPr>
-          <w:b/>
-          <w:bCs/>
-          <w:lang w:eastAsia="es-CO"/>
-        </w:rPr>
-        <w:t>donde encontrará información clave sobre:</w:t>
-      </w:r>
-    </w:p>
-    <w:p>
-      <w:pPr>
-        <w:ind w:left="1416" w:firstLine="0"/>
-        <w:rPr>
           <w:lang w:eastAsia="es-CO"/>
         </w:rPr>
       </w:pPr>
@@ -1957,7 +1952,11 @@
     </w:p>
     <w:p>
       <w:pPr>
-        <w:ind w:left="1416" w:firstLine="0"/>
+        <w:pStyle w:val="Prrafodelista"/>
+        <w:numPr>
+          <w:ilvl w:val="0"/>
+          <w:numId w:val="28"/>
+        </w:numPr>
         <w:rPr>
           <w:lang w:eastAsia="es-CO"/>
         </w:rPr>
@@ -2194,30 +2193,28 @@
     </w:p>
     <w:p>
       <w:pPr>
+        <w:rPr>
+          <w:b/>
+          <w:bCs/>
+          <w:lang w:eastAsia="es-CO"/>
+        </w:rPr>
+      </w:pPr>
+      <w:r>
+        <w:rPr>
+          <w:b/>
+          <w:bCs/>
+          <w:lang w:eastAsia="es-CO"/>
+        </w:rPr>
+        <w:t>Para ampliar esta información diríjase a la carpeta de anexos donde encontrará información clave sobre:</w:t>
+      </w:r>
+    </w:p>
+    <w:p>
+      <w:pPr>
         <w:pStyle w:val="Prrafodelista"/>
         <w:numPr>
           <w:ilvl w:val="0"/>
-          <w:numId w:val="12"/>
+          <w:numId w:val="29"/>
         </w:numPr>
-        <w:ind w:left="1776"/>
-        <w:rPr>
-          <w:b/>
-          <w:bCs/>
-          <w:lang w:eastAsia="es-CO"/>
-        </w:rPr>
-      </w:pPr>
-      <w:r>
-        <w:rPr>
-          <w:b/>
-          <w:bCs/>
-          <w:lang w:eastAsia="es-CO"/>
-        </w:rPr>
-        <w:t>Para ampliar esta información diríjase a la carpeta de anexos donde encontrará información clave sobre:</w:t>
-      </w:r>
-    </w:p>
-    <w:p>
-      <w:pPr>
-        <w:ind w:left="1763" w:firstLine="0"/>
         <w:rPr>
           <w:lang w:eastAsia="es-CO"/>
         </w:rPr>
@@ -2231,7 +2228,11 @@
     </w:p>
     <w:p>
       <w:pPr>
-        <w:ind w:left="1763" w:firstLine="0"/>
+        <w:pStyle w:val="Prrafodelista"/>
+        <w:numPr>
+          <w:ilvl w:val="0"/>
+          <w:numId w:val="29"/>
+        </w:numPr>
         <w:rPr>
           <w:lang w:eastAsia="es-CO"/>
         </w:rPr>
@@ -2245,7 +2246,11 @@
     </w:p>
     <w:p>
       <w:pPr>
-        <w:ind w:left="1763" w:firstLine="0"/>
+        <w:pStyle w:val="Prrafodelista"/>
+        <w:numPr>
+          <w:ilvl w:val="0"/>
+          <w:numId w:val="29"/>
+        </w:numPr>
         <w:rPr>
           <w:lang w:eastAsia="es-CO"/>
         </w:rPr>
@@ -2259,7 +2264,11 @@
     </w:p>
     <w:p>
       <w:pPr>
-        <w:ind w:left="1763" w:firstLine="0"/>
+        <w:pStyle w:val="Prrafodelista"/>
+        <w:numPr>
+          <w:ilvl w:val="0"/>
+          <w:numId w:val="29"/>
+        </w:numPr>
         <w:rPr>
           <w:lang w:eastAsia="es-CO"/>
         </w:rPr>
@@ -2273,7 +2282,11 @@
     </w:p>
     <w:p>
       <w:pPr>
-        <w:ind w:left="1763" w:firstLine="0"/>
+        <w:pStyle w:val="Prrafodelista"/>
+        <w:numPr>
+          <w:ilvl w:val="0"/>
+          <w:numId w:val="29"/>
+        </w:numPr>
         <w:rPr>
           <w:lang w:eastAsia="es-CO"/>
         </w:rPr>
@@ -2293,45 +2306,33 @@
           <w:lang w:eastAsia="es-CO"/>
         </w:rPr>
       </w:pPr>
-    </w:p>
-    <w:p>
-      <w:pPr>
-        <w:rPr>
-          <w:b/>
-          <w:bCs/>
-          <w:lang w:eastAsia="es-CO"/>
-        </w:rPr>
-      </w:pPr>
-    </w:p>
-    <w:p>
-      <w:pPr>
-        <w:rPr>
-          <w:b/>
-          <w:bCs/>
-          <w:lang w:eastAsia="es-CO"/>
-        </w:rPr>
-      </w:pPr>
-      <w:r>
-        <w:rPr>
-          <w:b/>
-          <w:bCs/>
+      <w:r>
+        <w:rPr>
+          <w:b/>
+          <w:bCs/>
+          <w:lang w:eastAsia="es-CO"/>
+        </w:rPr>
+        <w:t>Energía eléctrica</w:t>
+      </w:r>
+    </w:p>
+    <w:p>
+      <w:pPr>
+        <w:rPr>
+          <w:lang w:eastAsia="es-CO"/>
+        </w:rPr>
+      </w:pPr>
+      <w:r>
+        <w:rPr>
+          <w:lang w:eastAsia="es-CO"/>
+        </w:rPr>
+        <w:t xml:space="preserve">La energía eléctrica es el resultado del movimiento de electrones a través de un conductor, provocado por una diferencia de potencial. Cuando se acciona un </w:t>
+      </w:r>
+      <w:r>
+        <w:rPr>
           <w:lang w:eastAsia="es-CO"/>
         </w:rPr>
         <w:lastRenderedPageBreak/>
-        <w:t>Energía eléctrica</w:t>
-      </w:r>
-    </w:p>
-    <w:p>
-      <w:pPr>
-        <w:rPr>
-          <w:lang w:eastAsia="es-CO"/>
-        </w:rPr>
-      </w:pPr>
-      <w:r>
-        <w:rPr>
-          <w:lang w:eastAsia="es-CO"/>
-        </w:rPr>
-        <w:t>La energía eléctrica es el resultado del movimiento de electrones a través de un conductor, provocado por una diferencia de potencial. Cuando se acciona un interruptor, se activa un flujo de millones de electrones, lo que permite el funcionamiento de aparatos eléctricos como televisores, lavadoras o motores.</w:t>
+        <w:t>interruptor, se activa un flujo de millones de electrones, lo que permite el funcionamiento de aparatos eléctricos como televisores, lavadoras o motores.</w:t>
       </w:r>
     </w:p>
     <w:p>
@@ -2361,7 +2362,19 @@
         <w:rPr>
           <w:lang w:eastAsia="es-CO"/>
         </w:rPr>
-        <w:t>De acuerdo con el principio físico de conservación de la energía: “La energía no se crea ni se destruye, solo se transforma”.</w:t>
+        <w:t>De acuerdo con el principio físico de conservación de la energía: “La energía no se crea ni se destruye, solo se transforma”</w:t>
+      </w:r>
+      <w:r>
+        <w:rPr>
+          <w:lang w:eastAsia="es-CO"/>
+        </w:rPr>
+        <w:t xml:space="preserve"> </w:t>
+      </w:r>
+      <w:r>
+        <w:rPr>
+          <w:lang w:eastAsia="es-CO"/>
+        </w:rPr>
+        <w:t>(Serway &amp; Jewett, 2020).</w:t>
       </w:r>
     </w:p>
     <w:p>
@@ -2519,76 +2532,64 @@
         <w:rPr>
           <w:b/>
           <w:bCs/>
-          <w:lang w:val="es-419" w:eastAsia="es-CO"/>
-        </w:rPr>
-      </w:pPr>
-    </w:p>
-    <w:p>
-      <w:pPr>
-        <w:rPr>
-          <w:b/>
-          <w:bCs/>
-          <w:lang w:val="es-419" w:eastAsia="es-CO"/>
-        </w:rPr>
-      </w:pPr>
-    </w:p>
-    <w:p>
-      <w:pPr>
-        <w:rPr>
-          <w:b/>
-          <w:bCs/>
-          <w:lang w:eastAsia="es-CO"/>
-        </w:rPr>
-      </w:pPr>
-      <w:r>
-        <w:rPr>
-          <w:b/>
-          <w:bCs/>
+          <w:lang w:eastAsia="es-CO"/>
+        </w:rPr>
+      </w:pPr>
+      <w:r>
+        <w:rPr>
+          <w:b/>
+          <w:bCs/>
+          <w:lang w:eastAsia="es-CO"/>
+        </w:rPr>
+        <w:t>Clasificación de las fuentes de energía</w:t>
+      </w:r>
+    </w:p>
+    <w:p>
+      <w:pPr>
+        <w:rPr>
+          <w:lang w:eastAsia="es-CO"/>
+        </w:rPr>
+      </w:pPr>
+      <w:r>
+        <w:rPr>
+          <w:lang w:eastAsia="es-CO"/>
+        </w:rPr>
+        <w:t>Según su disponibilidad y sostenibilidad, las fuentes de energía se clasifican en:</w:t>
+      </w:r>
+    </w:p>
+    <w:p>
+      <w:pPr>
+        <w:rPr>
+          <w:lang w:val="es-419" w:eastAsia="es-CO"/>
+        </w:rPr>
+      </w:pPr>
+      <w:r>
+        <w:rPr>
+          <w:b/>
+          <w:bCs/>
+          <w:lang w:eastAsia="es-CO"/>
+        </w:rPr>
+        <w:t>Energías renovables</w:t>
+      </w:r>
+    </w:p>
+    <w:p>
+      <w:pPr>
+        <w:rPr>
+          <w:lang w:eastAsia="es-CO"/>
+        </w:rPr>
+      </w:pPr>
+      <w:r>
+        <w:rPr>
+          <w:lang w:eastAsia="es-CO"/>
+        </w:rPr>
+        <w:t xml:space="preserve">Las energías renovables son aquellas que provienen de fuentes naturales capaces de regenerarse de forma continua. No se agotan con el uso y generan un bajo impacto </w:t>
+      </w:r>
+      <w:r>
+        <w:rPr>
           <w:lang w:eastAsia="es-CO"/>
         </w:rPr>
         <w:lastRenderedPageBreak/>
-        <w:t>Clasificación de las fuentes de energía</w:t>
-      </w:r>
-    </w:p>
-    <w:p>
-      <w:pPr>
-        <w:rPr>
-          <w:lang w:eastAsia="es-CO"/>
-        </w:rPr>
-      </w:pPr>
-      <w:r>
-        <w:rPr>
-          <w:lang w:eastAsia="es-CO"/>
-        </w:rPr>
-        <w:t>Según su disponibilidad y sostenibilidad, las fuentes de energía se clasifican en:</w:t>
-      </w:r>
-    </w:p>
-    <w:p>
-      <w:pPr>
-        <w:rPr>
-          <w:lang w:val="es-419" w:eastAsia="es-CO"/>
-        </w:rPr>
-      </w:pPr>
-      <w:r>
-        <w:rPr>
-          <w:b/>
-          <w:bCs/>
-          <w:lang w:eastAsia="es-CO"/>
-        </w:rPr>
-        <w:t>Energías renovables</w:t>
-      </w:r>
-    </w:p>
-    <w:p>
-      <w:pPr>
-        <w:rPr>
-          <w:lang w:eastAsia="es-CO"/>
-        </w:rPr>
-      </w:pPr>
-      <w:r>
-        <w:rPr>
-          <w:lang w:eastAsia="es-CO"/>
-        </w:rPr>
-        <w:t>Las energías renovables son aquellas que provienen de fuentes naturales capaces de regenerarse de forma continua. No se agotan con el uso y generan un bajo impacto ambiental, por lo que son consideradas una alternativa sostenible frente a las fuentes convencionales de energía.</w:t>
+        <w:t>ambiental, por lo que son consideradas una alternativa sostenible frente a las fuentes convencionales de energía.</w:t>
       </w:r>
     </w:p>
     <w:p>
@@ -2802,7 +2803,6 @@
           <w:bCs/>
           <w:lang w:eastAsia="es-CO"/>
         </w:rPr>
-        <w:lastRenderedPageBreak/>
         <w:t>Petróleo:</w:t>
       </w:r>
       <w:r>
@@ -2855,6 +2855,7 @@
           <w:bCs/>
           <w:lang w:eastAsia="es-CO"/>
         </w:rPr>
+        <w:lastRenderedPageBreak/>
         <w:t>Energía nuclear:</w:t>
       </w:r>
       <w:r>
@@ -2891,7 +2892,19 @@
         <w:rPr>
           <w:lang w:val="es-419" w:eastAsia="es-CO"/>
         </w:rPr>
-        <w:t>La electricidad se divide en dos ramas circuito serie y circuito paralelo, por tal razón ampliaremos cada una:</w:t>
+        <w:t>La electricidad se divide en dos ramas</w:t>
+      </w:r>
+      <w:r>
+        <w:rPr>
+          <w:lang w:val="es-419" w:eastAsia="es-CO"/>
+        </w:rPr>
+        <w:t>:</w:t>
+      </w:r>
+      <w:r>
+        <w:rPr>
+          <w:lang w:val="es-419" w:eastAsia="es-CO"/>
+        </w:rPr>
+        <w:t xml:space="preserve"> circuito serie y circuito paralelo, por tal razón ampliaremos cada una:</w:t>
       </w:r>
     </w:p>
     <w:p>
@@ -3004,37 +3017,37 @@
         <w:rPr>
           <w:lang w:eastAsia="es-CO"/>
         </w:rPr>
+        <w:t>La resistencia total de un circuito en serie se calcula sumando los valores individuales de cada resistencia:</w:t>
+      </w:r>
+    </w:p>
+    <w:p>
+      <w:pPr>
+        <w:rPr>
+          <w:b/>
+          <w:bCs/>
+          <w:lang w:eastAsia="es-CO"/>
+        </w:rPr>
+      </w:pPr>
+      <w:r>
+        <w:rPr>
+          <w:b/>
+          <w:bCs/>
+          <w:lang w:eastAsia="es-CO"/>
+        </w:rPr>
+        <w:t>R total = R1 + R2 + R3 + … + Rn</w:t>
+      </w:r>
+    </w:p>
+    <w:p>
+      <w:pPr>
+        <w:rPr>
+          <w:lang w:eastAsia="es-CO"/>
+        </w:rPr>
+      </w:pPr>
+      <w:r>
+        <w:rPr>
+          <w:lang w:eastAsia="es-CO"/>
+        </w:rPr>
         <w:lastRenderedPageBreak/>
-        <w:t>La resistencia total de un circuito en serie se calcula sumando los valores individuales de cada resistencia:</w:t>
-      </w:r>
-    </w:p>
-    <w:p>
-      <w:pPr>
-        <w:rPr>
-          <w:b/>
-          <w:bCs/>
-          <w:lang w:eastAsia="es-CO"/>
-        </w:rPr>
-      </w:pPr>
-      <w:r>
-        <w:rPr>
-          <w:b/>
-          <w:bCs/>
-          <w:lang w:eastAsia="es-CO"/>
-        </w:rPr>
-        <w:t>R total = R1 + R2 + R3 + … + Rn</w:t>
-      </w:r>
-    </w:p>
-    <w:p>
-      <w:pPr>
-        <w:rPr>
-          <w:lang w:eastAsia="es-CO"/>
-        </w:rPr>
-      </w:pPr>
-      <w:r>
-        <w:rPr>
-          <w:lang w:eastAsia="es-CO"/>
-        </w:rPr>
         <w:t>Esto quiere decir que, al aumentar el número de resistencias en serie, también aumenta la resistencia total del circuito.</w:t>
       </w:r>
     </w:p>
@@ -3190,79 +3203,57 @@
         <w:rPr>
           <w:lang w:val="es-419" w:eastAsia="es-CO"/>
         </w:rPr>
-        <w:t xml:space="preserve">Fuente: Alexander &amp; </w:t>
-      </w:r>
-      <w:proofErr w:type="spellStart"/>
-      <w:r>
-        <w:rPr>
-          <w:lang w:val="es-419" w:eastAsia="es-CO"/>
-        </w:rPr>
-        <w:t>Sadiku</w:t>
-      </w:r>
-      <w:proofErr w:type="spellEnd"/>
-      <w:r>
-        <w:rPr>
-          <w:lang w:val="es-419" w:eastAsia="es-CO"/>
-        </w:rPr>
-        <w:t>, (2013)</w:t>
-      </w:r>
-    </w:p>
-    <w:p>
-      <w:pPr>
-        <w:rPr>
-          <w:b/>
-          <w:bCs/>
-          <w:lang w:eastAsia="es-CO"/>
-        </w:rPr>
-      </w:pPr>
-      <w:r>
-        <w:rPr>
-          <w:b/>
-          <w:bCs/>
+        <w:t>Fuente: Alexander &amp; Sadiku, (2013)</w:t>
+      </w:r>
+    </w:p>
+    <w:p>
+      <w:pPr>
+        <w:rPr>
+          <w:b/>
+          <w:bCs/>
+          <w:lang w:eastAsia="es-CO"/>
+        </w:rPr>
+      </w:pPr>
+      <w:r>
+        <w:rPr>
+          <w:b/>
+          <w:bCs/>
+          <w:lang w:eastAsia="es-CO"/>
+        </w:rPr>
+        <w:t>Circuito en paralelo</w:t>
+      </w:r>
+    </w:p>
+    <w:p>
+      <w:pPr>
+        <w:rPr>
+          <w:lang w:eastAsia="es-CO"/>
+        </w:rPr>
+      </w:pPr>
+      <w:r>
+        <w:rPr>
+          <w:lang w:eastAsia="es-CO"/>
+        </w:rPr>
+        <w:t xml:space="preserve">A diferencia del circuito en serie, en el circuito en paralelo los elementos (como resistencias, bombillos u otros dispositivos eléctricos) se conectan de forma que todos </w:t>
+      </w:r>
+      <w:r>
+        <w:rPr>
           <w:lang w:eastAsia="es-CO"/>
         </w:rPr>
         <w:lastRenderedPageBreak/>
-        <w:t>Circuito en paralelo</w:t>
-      </w:r>
-    </w:p>
-    <w:p>
-      <w:pPr>
-        <w:rPr>
-          <w:lang w:eastAsia="es-CO"/>
-        </w:rPr>
-      </w:pPr>
-      <w:r>
-        <w:rPr>
-          <w:lang w:eastAsia="es-CO"/>
-        </w:rPr>
-        <w:t>A diferencia del circuito en serie, en el circuito en paralelo los elementos (como resistencias, bombillos u otros dispositivos eléctricos) se conectan de forma que todos comparten los mismos dos puntos de conexión. Esto significa que cada uno de ellos recibe la misma tensión (voltaje), aunque la corriente que circula por cada uno puede ser diferente, dependiendo de su resistencia.</w:t>
-      </w:r>
-    </w:p>
-    <w:p>
-      <w:pPr>
-        <w:rPr>
-          <w:lang w:eastAsia="es-CO"/>
-        </w:rPr>
-      </w:pPr>
-      <w:r>
-        <w:rPr>
-          <w:lang w:eastAsia="es-CO"/>
-        </w:rPr>
-        <w:t xml:space="preserve">Como lo señala Hermosa </w:t>
-      </w:r>
-      <w:proofErr w:type="spellStart"/>
-      <w:r>
-        <w:rPr>
-          <w:lang w:eastAsia="es-CO"/>
-        </w:rPr>
-        <w:t>Donate</w:t>
-      </w:r>
-      <w:proofErr w:type="spellEnd"/>
-      <w:r>
-        <w:rPr>
-          <w:lang w:eastAsia="es-CO"/>
-        </w:rPr>
-        <w:t xml:space="preserve"> (2003), en un circuito en serie la corriente es la misma en todos los elementos, mientras que, en un circuito en paralelo, lo que se mantiene constante es la tensión aplicada a cada componente.</w:t>
+        <w:t>comparten los mismos dos puntos de conexión. Esto significa que cada uno de ellos recibe la misma tensión (voltaje), aunque la corriente que circula por cada uno puede ser diferente, dependiendo de su resistencia.</w:t>
+      </w:r>
+    </w:p>
+    <w:p>
+      <w:pPr>
+        <w:rPr>
+          <w:lang w:eastAsia="es-CO"/>
+        </w:rPr>
+      </w:pPr>
+      <w:r>
+        <w:rPr>
+          <w:lang w:eastAsia="es-CO"/>
+        </w:rPr>
+        <w:t>Como lo señala Hermosa Donate (2003), en un circuito en serie la corriente es la misma en todos los elementos, mientras que, en un circuito en paralelo, lo que se mantiene constante es la tensión aplicada a cada componente.</w:t>
       </w:r>
     </w:p>
     <w:p>
@@ -3349,41 +3340,23 @@
         <w:rPr>
           <w:lang w:val="es-419" w:eastAsia="es-CO"/>
         </w:rPr>
-        <w:t xml:space="preserve">Fuente: Alexander &amp; </w:t>
-      </w:r>
-      <w:proofErr w:type="spellStart"/>
-      <w:r>
-        <w:rPr>
-          <w:lang w:val="es-419" w:eastAsia="es-CO"/>
-        </w:rPr>
-        <w:t>Sadiku</w:t>
-      </w:r>
-      <w:proofErr w:type="spellEnd"/>
-      <w:r>
-        <w:rPr>
-          <w:lang w:val="es-419" w:eastAsia="es-CO"/>
-        </w:rPr>
-        <w:t>, (2013)</w:t>
-      </w:r>
-    </w:p>
-    <w:p>
-      <w:pPr>
-        <w:rPr>
-          <w:lang w:val="es-419" w:eastAsia="es-CO"/>
-        </w:rPr>
-      </w:pPr>
-    </w:p>
-    <w:p>
-      <w:pPr>
-        <w:rPr>
-          <w:lang w:val="es-419" w:eastAsia="es-CO"/>
-        </w:rPr>
-      </w:pPr>
-      <w:r>
-        <w:rPr>
-          <w:lang w:eastAsia="es-CO"/>
-        </w:rPr>
-        <w:lastRenderedPageBreak/>
+        <w:t>Fuente: Alexander &amp; Sadiku, (2013)</w:t>
+      </w:r>
+    </w:p>
+    <w:p>
+      <w:pPr>
+        <w:rPr>
+          <w:b/>
+          <w:bCs/>
+          <w:lang w:val="es-419" w:eastAsia="es-CO"/>
+        </w:rPr>
+      </w:pPr>
+      <w:r>
+        <w:rPr>
+          <w:b/>
+          <w:bCs/>
+          <w:lang w:eastAsia="es-CO"/>
+        </w:rPr>
         <w:t>En los circuitos en paralelo:</w:t>
       </w:r>
     </w:p>
@@ -3438,6 +3411,7 @@
         <w:rPr>
           <w:lang w:val="es-419" w:eastAsia="es-CO"/>
         </w:rPr>
+        <w:lastRenderedPageBreak/>
         <w:t>La resistencia total equivalente disminuye al agregar más dispositivos, porque se abren más caminos para que circule la corriente.</w:t>
       </w:r>
     </w:p>
@@ -3598,7 +3572,19 @@
         <w:rPr>
           <w:lang w:eastAsia="es-CO"/>
         </w:rPr>
-        <w:t xml:space="preserve"> 1/(RT)</w:t>
+        <w:t xml:space="preserve"> 1/(R</w:t>
+      </w:r>
+      <w:r>
+        <w:rPr>
+          <w:lang w:eastAsia="es-CO"/>
+        </w:rPr>
+        <w:t>n</w:t>
+      </w:r>
+      <w:r>
+        <w:rPr>
+          <w:lang w:eastAsia="es-CO"/>
+        </w:rPr>
+        <w:t>)</w:t>
       </w:r>
     </w:p>
     <w:p>
@@ -3617,6 +3603,19 @@
     <w:p>
       <w:pPr>
         <w:rPr>
+          <w:lang w:eastAsia="es-CO"/>
+        </w:rPr>
+      </w:pPr>
+      <w:r>
+        <w:rPr>
+          <w:lang w:eastAsia="es-CO"/>
+        </w:rPr>
+        <w:t>Rn representa la última resistencia en el circuito.</w:t>
+      </w:r>
+    </w:p>
+    <w:p>
+      <w:pPr>
+        <w:rPr>
           <w:b/>
           <w:bCs/>
           <w:lang w:eastAsia="es-CO"/>
@@ -3673,32 +3672,17 @@
     <w:p>
       <w:pPr>
         <w:rPr>
-          <w:lang w:val="es-419" w:eastAsia="es-CO"/>
-        </w:rPr>
-      </w:pPr>
-    </w:p>
-    <w:p>
-      <w:pPr>
-        <w:rPr>
-          <w:lang w:val="es-419" w:eastAsia="es-CO"/>
-        </w:rPr>
-      </w:pPr>
-    </w:p>
-    <w:p>
-      <w:pPr>
-        <w:rPr>
-          <w:b/>
-          <w:bCs/>
-          <w:lang w:eastAsia="es-CO"/>
-        </w:rPr>
-      </w:pPr>
-      <w:r>
-        <w:rPr>
-          <w:b/>
-          <w:bCs/>
-          <w:lang w:eastAsia="es-CO"/>
-        </w:rPr>
-        <w:lastRenderedPageBreak/>
+          <w:b/>
+          <w:bCs/>
+          <w:lang w:eastAsia="es-CO"/>
+        </w:rPr>
+      </w:pPr>
+      <w:r>
+        <w:rPr>
+          <w:b/>
+          <w:bCs/>
+          <w:lang w:eastAsia="es-CO"/>
+        </w:rPr>
         <w:t>Para interruptores:</w:t>
       </w:r>
     </w:p>
@@ -3723,7 +3707,7 @@
         <w:tblLayout w:type="fixed"/>
         <w:tblLook w:val="04A0" w:firstRow="1" w:lastRow="0" w:firstColumn="1" w:lastColumn="0" w:noHBand="0" w:noVBand="1"/>
         <w:tblCaption w:val="Tabla 1.Tabla de Interruptores"/>
-        <w:tblDescription w:val="Se presenta una tabla de verdad correspondiente al funcionamiento de dos interruptores en una conexión lógica OR. La salida es abierta únicamente cuando ambos interruptores están en estado abierto. En cualquier otro caso, la salida permanece cerrada. "/>
+        <w:tblDescription w:val="Presenta una tabla de verdad correspondiente al funcionamiento de dos interruptores en una conexión lógica OR. La salida es abierta únicamente cuando ambos interruptores están en estado abierto. "/>
       </w:tblPr>
       <w:tblGrid>
         <w:gridCol w:w="2398"/>
@@ -3834,6 +3818,7 @@
               <w:pStyle w:val="TextoTablas"/>
             </w:pPr>
             <w:r>
+              <w:lastRenderedPageBreak/>
               <w:t>Abierto</w:t>
             </w:r>
           </w:p>
@@ -3967,21 +3952,7 @@
         <w:rPr>
           <w:lang w:val="es-419" w:eastAsia="es-CO"/>
         </w:rPr>
-        <w:t xml:space="preserve">Referencia Tabla - Alexander &amp; </w:t>
-      </w:r>
-      <w:proofErr w:type="spellStart"/>
-      <w:r>
-        <w:rPr>
-          <w:lang w:val="es-419" w:eastAsia="es-CO"/>
-        </w:rPr>
-        <w:t>Sadiku</w:t>
-      </w:r>
-      <w:proofErr w:type="spellEnd"/>
-      <w:r>
-        <w:rPr>
-          <w:lang w:val="es-419" w:eastAsia="es-CO"/>
-        </w:rPr>
-        <w:t>, (2013)</w:t>
+        <w:t>Referencia Tabla - Alexander &amp; Sadiku, (2013)</w:t>
       </w:r>
     </w:p>
     <w:p>
@@ -4011,21 +3982,13 @@
         <w:rPr>
           <w:lang w:eastAsia="es-CO"/>
         </w:rPr>
-        <w:t xml:space="preserve">Es aquel que combina elementos conectados tanto en serie como en paralelo. Para resolver problemas asociados a este tipo de circuitos, se recomienda simplificar las conexiones paso a paso, sumado a esto cuando se identifican dos elementos conectados en paralelo y dispuestos consecutivamente, pueden ser reemplazados por un equivalente en serie. Esta estrategia permite una solución más sencilla y ordenada del circuito (Hermosa </w:t>
-      </w:r>
-      <w:proofErr w:type="spellStart"/>
-      <w:r>
-        <w:rPr>
-          <w:lang w:eastAsia="es-CO"/>
-        </w:rPr>
-        <w:t>Donate</w:t>
-      </w:r>
-      <w:proofErr w:type="spellEnd"/>
-      <w:r>
-        <w:rPr>
-          <w:lang w:eastAsia="es-CO"/>
-        </w:rPr>
-        <w:t>, 2003).</w:t>
+        <w:t>Es aquel que combina elementos conectados tanto en serie como en paralelo. Para resolver problemas asociados a este tipo de circuitos, se recomienda simplificar las conexiones paso a paso. Una estrategia útil consiste en identificar pares de elementos conectados en paralelo y dispuestos de forma consecutiva, los cuales pueden ser reemplazados por su equivalente en serie. Este procedimiento facilita una solución más ordenada y eficiente del circuito (Hermosa Donate, 2003</w:t>
+      </w:r>
+      <w:r>
+        <w:rPr>
+          <w:lang w:eastAsia="es-CO"/>
+        </w:rPr>
+        <w:t>).</w:t>
       </w:r>
     </w:p>
     <w:p>
@@ -4112,28 +4075,30 @@
         <w:rPr>
           <w:lang w:val="es-419" w:eastAsia="es-CO"/>
         </w:rPr>
-        <w:t xml:space="preserve">Fuente: Alexander &amp; </w:t>
-      </w:r>
-      <w:proofErr w:type="spellStart"/>
-      <w:r>
-        <w:rPr>
-          <w:lang w:val="es-419" w:eastAsia="es-CO"/>
-        </w:rPr>
-        <w:t>Sadiku</w:t>
-      </w:r>
-      <w:proofErr w:type="spellEnd"/>
-      <w:r>
-        <w:rPr>
-          <w:lang w:val="es-419" w:eastAsia="es-CO"/>
-        </w:rPr>
-        <w:t>, (2013)</w:t>
-      </w:r>
+        <w:t>Fuente: Alexander &amp; Sadiku, (2013)</w:t>
+      </w:r>
+    </w:p>
+    <w:p>
+      <w:pPr>
+        <w:jc w:val="center"/>
+        <w:rPr>
+          <w:lang w:val="es-419" w:eastAsia="es-CO"/>
+        </w:rPr>
+      </w:pPr>
+    </w:p>
+    <w:p>
+      <w:pPr>
+        <w:jc w:val="center"/>
+        <w:rPr>
+          <w:lang w:val="es-419" w:eastAsia="es-CO"/>
+        </w:rPr>
+      </w:pPr>
     </w:p>
     <w:p>
       <w:pPr>
         <w:pStyle w:val="Ttulo1"/>
       </w:pPr>
-      <w:bookmarkStart w:id="2" w:name="_Toc202373146"/>
+      <w:bookmarkStart w:id="2" w:name="_Toc203582979"/>
       <w:r>
         <w:lastRenderedPageBreak/>
         <w:t>Medidas eléctricas</w:t>
@@ -4574,7 +4539,7 @@
       <w:pPr>
         <w:pStyle w:val="Ttulo1"/>
       </w:pPr>
-      <w:bookmarkStart w:id="3" w:name="_Toc202373147"/>
+      <w:bookmarkStart w:id="3" w:name="_Toc203582980"/>
       <w:r>
         <w:lastRenderedPageBreak/>
         <w:t>Leyes fundamentales en electricidad</w:t>
@@ -4825,13 +4790,7 @@
     </w:p>
     <w:p>
       <w:pPr>
-        <w:rPr>
-          <w:lang w:val="es-419" w:eastAsia="es-CO"/>
-        </w:rPr>
-      </w:pPr>
-    </w:p>
-    <w:p>
-      <w:pPr>
+        <w:ind w:firstLine="0"/>
         <w:rPr>
           <w:lang w:val="es-419" w:eastAsia="es-CO"/>
         </w:rPr>
@@ -4856,7 +4815,8 @@
           <w:bCs/>
           <w:lang w:eastAsia="es-CO"/>
         </w:rPr>
-        <w:t>Ley de corrientes de Kirchhoff (LCK) o Ley de nodos</w:t>
+        <w:lastRenderedPageBreak/>
+        <w:t>Ley de Corrientes de Kirchhoff (LCK) o Ley de nodos</w:t>
       </w:r>
     </w:p>
     <w:p>
@@ -4921,7 +4881,23 @@
           <w:bCs/>
           <w:lang w:eastAsia="es-CO"/>
         </w:rPr>
-        <w:t>Ley de voltajes de Kirchhoff (LVK) o Ley de mallas</w:t>
+        <w:t xml:space="preserve">Ley de </w:t>
+      </w:r>
+      <w:r>
+        <w:rPr>
+          <w:b/>
+          <w:bCs/>
+          <w:lang w:eastAsia="es-CO"/>
+        </w:rPr>
+        <w:t>V</w:t>
+      </w:r>
+      <w:r>
+        <w:rPr>
+          <w:b/>
+          <w:bCs/>
+          <w:lang w:eastAsia="es-CO"/>
+        </w:rPr>
+        <w:t>oltajes de Kirchhoff (LVK) o Ley de mallas</w:t>
       </w:r>
     </w:p>
     <w:p>
@@ -5067,7 +5043,7 @@
     <w:p>
       <w:pPr>
         <w:rPr>
-          <w:lang w:val="es-419" w:eastAsia="es-CO"/>
+          <w:lang w:eastAsia="es-CO"/>
         </w:rPr>
       </w:pPr>
       <w:r>
@@ -5076,6 +5052,13 @@
         </w:rPr>
         <w:t>Estas leyes permiten plantear ecuaciones que describen el comportamiento del circuito, facilitando su análisis y resolución. Un ejemplo es: 1k Ω</w:t>
       </w:r>
+    </w:p>
+    <w:p>
+      <w:pPr>
+        <w:rPr>
+          <w:lang w:val="es-419" w:eastAsia="es-CO"/>
+        </w:rPr>
+      </w:pPr>
     </w:p>
     <w:p>
       <w:pPr>
@@ -5105,10 +5088,10 @@
           <w:lang w:val="es-419" w:eastAsia="es-CO"/>
         </w:rPr>
         <w:drawing>
-          <wp:inline distT="0" distB="0" distL="0" distR="0" wp14:anchorId="22AC24DC" wp14:editId="104F0DD4">
-            <wp:extent cx="3800475" cy="1685925"/>
-            <wp:effectExtent l="0" t="0" r="9525" b="9525"/>
-            <wp:docPr id="10" name="Imagen 10" descr="Representa un circuito resistivo con un nodo central donde convergen tres corrientes: I1​, I2​ e I3​. Cada rama contiene una resistencia de 1k. El diagrama ilustra la aplicación de la Ley de Kirchhoff para corrientes, indicando que la suma de las corrientes que entran al nodo es igual a la suma de las que salen. "/>
+          <wp:inline distT="0" distB="0" distL="0" distR="0" wp14:anchorId="131A6FB1" wp14:editId="138006DF">
+            <wp:extent cx="3797300" cy="1689100"/>
+            <wp:effectExtent l="0" t="0" r="0" b="0"/>
+            <wp:docPr id="248287789" name="Gráfico 4" descr="Representa un circuito resistivo con un nodo central donde convergen tres corrientes: I1, I2 e I3. Cada rama contiene una resistencia de 1k. El diagrama ilustra la aplicación de la Ley de Kirchhoff para corrientes, indicando que la suma de las corrientes que entran al nodo es igual a la suma de las que salen."/>
             <wp:cNvGraphicFramePr>
               <a:graphicFrameLocks xmlns:a="http://schemas.openxmlformats.org/drawingml/2006/main" noChangeAspect="1"/>
             </wp:cNvGraphicFramePr>
@@ -5116,33 +5099,29 @@
               <a:graphicData uri="http://schemas.openxmlformats.org/drawingml/2006/picture">
                 <pic:pic xmlns:pic="http://schemas.openxmlformats.org/drawingml/2006/picture">
                   <pic:nvPicPr>
-                    <pic:cNvPr id="10" name="Imagen 10" descr="Representa un circuito resistivo con un nodo central donde convergen tres corrientes: I1​, I2​ e I3​. Cada rama contiene una resistencia de 1k. El diagrama ilustra la aplicación de la Ley de Kirchhoff para corrientes, indicando que la suma de las corrientes que entran al nodo es igual a la suma de las que salen. "/>
-                    <pic:cNvPicPr>
-                      <a:picLocks noChangeAspect="1" noChangeArrowheads="1"/>
-                    </pic:cNvPicPr>
+                    <pic:cNvPr id="248287789" name="Gráfico 4" descr="Representa un circuito resistivo con un nodo central donde convergen tres corrientes: I1, I2 e I3. Cada rama contiene una resistencia de 1k. El diagrama ilustra la aplicación de la Ley de Kirchhoff para corrientes, indicando que la suma de las corrientes que entran al nodo es igual a la suma de las que salen."/>
+                    <pic:cNvPicPr/>
                   </pic:nvPicPr>
                   <pic:blipFill>
                     <a:blip r:embed="rId18">
                       <a:extLst>
-                        <a:ext uri="{28A0092B-C50C-407E-A947-70E740481C1C}">
-                          <a14:useLocalDpi xmlns:a14="http://schemas.microsoft.com/office/drawing/2010/main" val="0"/>
+                        <a:ext uri="{96DAC541-7B7A-43D3-8B79-37D633B846F1}">
+                          <asvg:svgBlip xmlns:asvg="http://schemas.microsoft.com/office/drawing/2016/SVG/main" r:embed="rId19"/>
                         </a:ext>
                       </a:extLst>
                     </a:blip>
-                    <a:srcRect/>
                     <a:stretch>
                       <a:fillRect/>
                     </a:stretch>
                   </pic:blipFill>
-                  <pic:spPr bwMode="auto">
+                  <pic:spPr>
                     <a:xfrm>
                       <a:off x="0" y="0"/>
-                      <a:ext cx="3800475" cy="1685925"/>
+                      <a:ext cx="3797300" cy="1689100"/>
                     </a:xfrm>
                     <a:prstGeom prst="rect">
                       <a:avLst/>
                     </a:prstGeom>
-                    <a:noFill/>
                   </pic:spPr>
                 </pic:pic>
               </a:graphicData>
@@ -5239,7 +5218,7 @@
                     </pic:cNvPicPr>
                   </pic:nvPicPr>
                   <pic:blipFill>
-                    <a:blip r:embed="rId19">
+                    <a:blip r:embed="rId20">
                       <a:extLst>
                         <a:ext uri="{28A0092B-C50C-407E-A947-70E740481C1C}">
                           <a14:useLocalDpi xmlns:a14="http://schemas.microsoft.com/office/drawing/2010/main" val="0"/>
@@ -5279,21 +5258,7 @@
         <w:rPr>
           <w:lang w:val="es-419" w:eastAsia="es-CO"/>
         </w:rPr>
-        <w:t xml:space="preserve">Fuente: </w:t>
-      </w:r>
-      <w:proofErr w:type="spellStart"/>
-      <w:r>
-        <w:rPr>
-          <w:lang w:val="es-419" w:eastAsia="es-CO"/>
-        </w:rPr>
-        <w:t>Polverini</w:t>
-      </w:r>
-      <w:proofErr w:type="spellEnd"/>
-      <w:r>
-        <w:rPr>
-          <w:lang w:val="es-419" w:eastAsia="es-CO"/>
-        </w:rPr>
-        <w:t>, (2022)</w:t>
+        <w:t>Fuente: Polverini, (2022)</w:t>
       </w:r>
     </w:p>
     <w:p>
@@ -5454,7 +5419,7 @@
                     </pic:cNvPicPr>
                   </pic:nvPicPr>
                   <pic:blipFill>
-                    <a:blip r:embed="rId20">
+                    <a:blip r:embed="rId21">
                       <a:extLst>
                         <a:ext uri="{28A0092B-C50C-407E-A947-70E740481C1C}">
                           <a14:useLocalDpi xmlns:a14="http://schemas.microsoft.com/office/drawing/2010/main" val="0"/>
@@ -5543,21 +5508,7 @@
         <w:rPr>
           <w:lang w:eastAsia="es-CO"/>
         </w:rPr>
-        <w:t xml:space="preserve">La diferencia de potencial (DDP) en esta resistencia R1 es de I1 x </w:t>
-      </w:r>
-      <w:proofErr w:type="gramStart"/>
-      <w:r>
-        <w:rPr>
-          <w:lang w:eastAsia="es-CO"/>
-        </w:rPr>
-        <w:t>R</w:t>
-      </w:r>
-      <w:proofErr w:type="gramEnd"/>
-      <w:r>
-        <w:rPr>
-          <w:lang w:eastAsia="es-CO"/>
-        </w:rPr>
-        <w:t xml:space="preserve"> o sea, 5 voltios. Esto está en oposición de los 15 voltios de la batería.</w:t>
+        <w:t>La diferencia de potencial (DDP) en esta resistencia R1 es de I1 x R o sea, 5 voltios. Esto está en oposición de los 15 voltios de la batería.</w:t>
       </w:r>
     </w:p>
     <w:p>
@@ -6000,7 +5951,7 @@
       <w:pPr>
         <w:pStyle w:val="Ttulo1"/>
       </w:pPr>
-      <w:bookmarkStart w:id="4" w:name="_Toc202373148"/>
+      <w:bookmarkStart w:id="4" w:name="_Toc203582981"/>
       <w:r>
         <w:lastRenderedPageBreak/>
         <w:t>Elementos de un circuito y resistencias</w:t>
@@ -6331,7 +6282,19 @@
         <w:rPr>
           <w:lang w:eastAsia="es-CO"/>
         </w:rPr>
-        <w:t>Pulsador: Abre o cierra el circuito solo mientras está presionado.</w:t>
+        <w:t xml:space="preserve">Pulsador: </w:t>
+      </w:r>
+      <w:r>
+        <w:rPr>
+          <w:lang w:eastAsia="es-CO"/>
+        </w:rPr>
+        <w:t>a</w:t>
+      </w:r>
+      <w:r>
+        <w:rPr>
+          <w:lang w:eastAsia="es-CO"/>
+        </w:rPr>
+        <w:t>bre o cierra el circuito solo mientras está presionado.</w:t>
       </w:r>
     </w:p>
     <w:p>
@@ -6349,7 +6312,19 @@
         <w:rPr>
           <w:lang w:eastAsia="es-CO"/>
         </w:rPr>
-        <w:t>Interruptor: Abre o cierra el circuito de forma permanente hasta que se accione nuevamente.</w:t>
+        <w:t xml:space="preserve">Interruptor: </w:t>
+      </w:r>
+      <w:r>
+        <w:rPr>
+          <w:lang w:eastAsia="es-CO"/>
+        </w:rPr>
+        <w:t>a</w:t>
+      </w:r>
+      <w:r>
+        <w:rPr>
+          <w:lang w:eastAsia="es-CO"/>
+        </w:rPr>
+        <w:t>bre o cierra el circuito de forma permanente hasta que se accione nuevamente.</w:t>
       </w:r>
     </w:p>
     <w:p>
@@ -6367,7 +6342,19 @@
         <w:rPr>
           <w:lang w:eastAsia="es-CO"/>
         </w:rPr>
-        <w:t>Conmutador: Permite controlar el encendido o apagado del circuito desde diferentes puntos. Un tipo especial es el conmutador de cruce, que invierte la polaridad del circuito, comúnmente usado para cambiar el sentido de giro de los motores.</w:t>
+        <w:t xml:space="preserve">Conmutador: </w:t>
+      </w:r>
+      <w:r>
+        <w:rPr>
+          <w:lang w:eastAsia="es-CO"/>
+        </w:rPr>
+        <w:t>p</w:t>
+      </w:r>
+      <w:r>
+        <w:rPr>
+          <w:lang w:eastAsia="es-CO"/>
+        </w:rPr>
+        <w:t>ermite controlar el encendido o apagado del circuito desde diferentes puntos. Un tipo especial es el conmutador de cruce, que invierte la polaridad del circuito, comúnmente usado para cambiar el sentido de giro de los motores.</w:t>
       </w:r>
     </w:p>
     <w:p>
@@ -6498,7 +6485,7 @@
                     </pic:cNvPicPr>
                   </pic:nvPicPr>
                   <pic:blipFill>
-                    <a:blip r:embed="rId21">
+                    <a:blip r:embed="rId22">
                       <a:extLst>
                         <a:ext uri="{28A0092B-C50C-407E-A947-70E740481C1C}">
                           <a14:useLocalDpi xmlns:a14="http://schemas.microsoft.com/office/drawing/2010/main" val="0"/>
@@ -6609,7 +6596,7 @@
                     </pic:cNvPicPr>
                   </pic:nvPicPr>
                   <pic:blipFill>
-                    <a:blip r:embed="rId22">
+                    <a:blip r:embed="rId23">
                       <a:extLst>
                         <a:ext uri="{28A0092B-C50C-407E-A947-70E740481C1C}">
                           <a14:useLocalDpi xmlns:a14="http://schemas.microsoft.com/office/drawing/2010/main" val="0"/>
@@ -6864,7 +6851,7 @@
                     </pic:cNvPicPr>
                   </pic:nvPicPr>
                   <pic:blipFill>
-                    <a:blip r:embed="rId23">
+                    <a:blip r:embed="rId24">
                       <a:extLst>
                         <a:ext uri="{28A0092B-C50C-407E-A947-70E740481C1C}">
                           <a14:useLocalDpi xmlns:a14="http://schemas.microsoft.com/office/drawing/2010/main" val="0"/>
@@ -7030,7 +7017,7 @@
                     </pic:cNvPicPr>
                   </pic:nvPicPr>
                   <pic:blipFill>
-                    <a:blip r:embed="rId24">
+                    <a:blip r:embed="rId25">
                       <a:extLst>
                         <a:ext uri="{28A0092B-C50C-407E-A947-70E740481C1C}">
                           <a14:useLocalDpi xmlns:a14="http://schemas.microsoft.com/office/drawing/2010/main" val="0"/>
@@ -7133,7 +7120,7 @@
                     </pic:cNvPicPr>
                   </pic:nvPicPr>
                   <pic:blipFill>
-                    <a:blip r:embed="rId25">
+                    <a:blip r:embed="rId26">
                       <a:extLst>
                         <a:ext uri="{28A0092B-C50C-407E-A947-70E740481C1C}">
                           <a14:useLocalDpi xmlns:a14="http://schemas.microsoft.com/office/drawing/2010/main" val="0"/>
@@ -7304,7 +7291,7 @@
                     </pic:cNvPicPr>
                   </pic:nvPicPr>
                   <pic:blipFill>
-                    <a:blip r:embed="rId26">
+                    <a:blip r:embed="rId27">
                       <a:extLst>
                         <a:ext uri="{28A0092B-C50C-407E-A947-70E740481C1C}">
                           <a14:useLocalDpi xmlns:a14="http://schemas.microsoft.com/office/drawing/2010/main" val="0"/>
@@ -7385,13 +7372,7 @@
     </w:p>
     <w:p>
       <w:pPr>
-        <w:rPr>
-          <w:lang w:val="es-419" w:eastAsia="es-CO"/>
-        </w:rPr>
-      </w:pPr>
-    </w:p>
-    <w:p>
-      <w:pPr>
+        <w:ind w:firstLine="0"/>
         <w:rPr>
           <w:lang w:val="es-419" w:eastAsia="es-CO"/>
         </w:rPr>
@@ -7408,6 +7389,7 @@
         <w:rPr>
           <w:lang w:val="es-419"/>
         </w:rPr>
+        <w:lastRenderedPageBreak/>
         <w:t>Resistencias en paralelo (R1-2-3 y R4-5)</w:t>
       </w:r>
     </w:p>
@@ -7424,9 +7406,9 @@
           <w:lang w:val="es-419" w:eastAsia="es-CO"/>
         </w:rPr>
         <w:drawing>
-          <wp:inline distT="0" distB="0" distL="0" distR="0" wp14:anchorId="7398A5C5" wp14:editId="3C356BAC">
-            <wp:extent cx="1064526" cy="1485901"/>
-            <wp:effectExtent l="0" t="0" r="2540" b="0"/>
+          <wp:inline distT="0" distB="0" distL="0" distR="0" wp14:anchorId="7398A5C5" wp14:editId="23DA5838">
+            <wp:extent cx="1193800" cy="1666346"/>
+            <wp:effectExtent l="0" t="0" r="0" b="0"/>
             <wp:docPr id="21" name="Imagen 21" descr="El circuito presenta una configuración en la que se tiene una residencia equivalente R1-2-3 conectada en paralelo con una resistencia equivalente R4-5. Ambas resistencias equivalentes están conectadas en serie con R6, formando la resistencia total Rt del circuito. "/>
             <wp:cNvGraphicFramePr>
               <a:graphicFrameLocks xmlns:a="http://schemas.openxmlformats.org/drawingml/2006/main" noChangeAspect="1"/>
@@ -7436,166 +7418,6 @@
                 <pic:pic xmlns:pic="http://schemas.openxmlformats.org/drawingml/2006/picture">
                   <pic:nvPicPr>
                     <pic:cNvPr id="21" name="Imagen 21" descr="El circuito presenta una configuración en la que se tiene una residencia equivalente R1-2-3 conectada en paralelo con una resistencia equivalente R4-5. Ambas resistencias equivalentes están conectadas en serie con R6, formando la resistencia total Rt del circuito. "/>
-                    <pic:cNvPicPr>
-                      <a:picLocks noChangeAspect="1" noChangeArrowheads="1"/>
-                    </pic:cNvPicPr>
-                  </pic:nvPicPr>
-                  <pic:blipFill>
-                    <a:blip r:embed="rId27">
-                      <a:extLst>
-                        <a:ext uri="{28A0092B-C50C-407E-A947-70E740481C1C}">
-                          <a14:useLocalDpi xmlns:a14="http://schemas.microsoft.com/office/drawing/2010/main" val="0"/>
-                        </a:ext>
-                      </a:extLst>
-                    </a:blip>
-                    <a:srcRect/>
-                    <a:stretch>
-                      <a:fillRect/>
-                    </a:stretch>
-                  </pic:blipFill>
-                  <pic:spPr bwMode="auto">
-                    <a:xfrm>
-                      <a:off x="0" y="0"/>
-                      <a:ext cx="1073998" cy="1499123"/>
-                    </a:xfrm>
-                    <a:prstGeom prst="rect">
-                      <a:avLst/>
-                    </a:prstGeom>
-                    <a:noFill/>
-                  </pic:spPr>
-                </pic:pic>
-              </a:graphicData>
-            </a:graphic>
-          </wp:inline>
-        </w:drawing>
-      </w:r>
-    </w:p>
-    <w:p>
-      <w:pPr>
-        <w:rPr>
-          <w:lang w:eastAsia="es-CO"/>
-        </w:rPr>
-      </w:pPr>
-      <w:r>
-        <w:rPr>
-          <w:lang w:eastAsia="es-CO"/>
-        </w:rPr>
-        <w:t>Se evidencia que cada vez la malla del circuito se va reduciendo, sucede que es una forma sencilla de resolverlo por pasos, con la práctica no será necesario hacerlo ya que se podrá resolver mentalmente.</w:t>
-      </w:r>
-    </w:p>
-    <w:p>
-      <w:pPr>
-        <w:rPr>
-          <w:lang w:eastAsia="es-CO"/>
-        </w:rPr>
-      </w:pPr>
-      <w:r>
-        <w:rPr>
-          <w:lang w:eastAsia="es-CO"/>
-        </w:rPr>
-        <w:t>Ahora se resuelve el circuito en paralelo para obtener R₁₋₅.</w:t>
-      </w:r>
-    </w:p>
-    <w:p>
-      <w:pPr>
-        <w:rPr>
-          <w:b/>
-          <w:bCs/>
-          <w:lang w:eastAsia="es-CO"/>
-        </w:rPr>
-      </w:pPr>
-      <w:r>
-        <w:rPr>
-          <w:b/>
-          <w:bCs/>
-          <w:lang w:eastAsia="es-CO"/>
-        </w:rPr>
-        <w:t xml:space="preserve">1 / </w:t>
-      </w:r>
-      <w:bookmarkStart w:id="5" w:name="_Hlk202370357"/>
-      <w:r>
-        <w:rPr>
-          <w:b/>
-          <w:bCs/>
-          <w:lang w:eastAsia="es-CO"/>
-        </w:rPr>
-        <w:t xml:space="preserve">R₁₋₅ </w:t>
-      </w:r>
-      <w:bookmarkEnd w:id="5"/>
-      <w:r>
-        <w:rPr>
-          <w:b/>
-          <w:bCs/>
-          <w:lang w:eastAsia="es-CO"/>
-        </w:rPr>
-        <w:t>= 1 / R₁₂₃ + 1 / R₄₅</w:t>
-      </w:r>
-    </w:p>
-    <w:p>
-      <w:pPr>
-        <w:rPr>
-          <w:lang w:val="es-419" w:eastAsia="es-CO"/>
-        </w:rPr>
-      </w:pPr>
-      <w:r>
-        <w:rPr>
-          <w:lang w:eastAsia="es-CO"/>
-        </w:rPr>
-        <w:t>Finalmente se obtiene el circuito más sencillo de todos y es un circuito en serie, el cual proporciona la resistencia total.</w:t>
-      </w:r>
-    </w:p>
-    <w:p>
-      <w:pPr>
-        <w:pStyle w:val="Figura"/>
-        <w:rPr>
-          <w:lang w:val="es-419"/>
-        </w:rPr>
-      </w:pPr>
-      <w:r>
-        <w:rPr>
-          <w:lang w:val="es-419"/>
-        </w:rPr>
-        <w:t>Resistencia en serie (</w:t>
-      </w:r>
-      <w:r>
-        <w:rPr>
-          <w:b/>
-          <w:bCs/>
-        </w:rPr>
-        <w:t xml:space="preserve">R₁₋₅ </w:t>
-      </w:r>
-      <w:r>
-        <w:rPr>
-          <w:lang w:val="es-419"/>
-        </w:rPr>
-        <w:t>y R6)</w:t>
-      </w:r>
-    </w:p>
-    <w:p>
-      <w:pPr>
-        <w:jc w:val="center"/>
-        <w:rPr>
-          <w:lang w:val="es-419" w:eastAsia="es-CO"/>
-        </w:rPr>
-      </w:pPr>
-      <w:r>
-        <w:rPr>
-          <w:noProof/>
-          <w:lang w:val="es-419" w:eastAsia="es-CO"/>
-        </w:rPr>
-        <w:drawing>
-          <wp:inline distT="0" distB="0" distL="0" distR="0" wp14:anchorId="58756FCE" wp14:editId="79EA1CAB">
-            <wp:extent cx="1261241" cy="1287517"/>
-            <wp:effectExtent l="0" t="0" r="0" b="8255"/>
-            <wp:docPr id="22" name="Imagen 22" descr="En el circuito representado,  las sistencias R1, R2, R3, R4 y R5 forman una resistencia equivalente R1-5 que esta conectada en serie a una resistencia R6 y que su resistencia total se denota como Rt."/>
-            <wp:cNvGraphicFramePr>
-              <a:graphicFrameLocks xmlns:a="http://schemas.openxmlformats.org/drawingml/2006/main" noChangeAspect="1"/>
-            </wp:cNvGraphicFramePr>
-            <a:graphic xmlns:a="http://schemas.openxmlformats.org/drawingml/2006/main">
-              <a:graphicData uri="http://schemas.openxmlformats.org/drawingml/2006/picture">
-                <pic:pic xmlns:pic="http://schemas.openxmlformats.org/drawingml/2006/picture">
-                  <pic:nvPicPr>
-                    <pic:cNvPr id="22" name="Imagen 22" descr="En el circuito representado,  las sistencias R1, R2, R3, R4 y R5 forman una resistencia equivalente R1-5 que esta conectada en serie a una resistencia R6 y que su resistencia total se denota como Rt."/>
                     <pic:cNvPicPr>
                       <a:picLocks noChangeAspect="1" noChangeArrowheads="1"/>
                     </pic:cNvPicPr>
@@ -7616,7 +7438,7 @@
                   <pic:spPr bwMode="auto">
                     <a:xfrm>
                       <a:off x="0" y="0"/>
-                      <a:ext cx="1266109" cy="1292486"/>
+                      <a:ext cx="1206760" cy="1684436"/>
                     </a:xfrm>
                     <a:prstGeom prst="rect">
                       <a:avLst/>
@@ -7633,6 +7455,190 @@
     <w:p>
       <w:pPr>
         <w:rPr>
+          <w:lang w:eastAsia="es-CO"/>
+        </w:rPr>
+      </w:pPr>
+      <w:r>
+        <w:rPr>
+          <w:lang w:eastAsia="es-CO"/>
+        </w:rPr>
+        <w:t>Se evidencia que cada vez la malla del circuito se va reduciendo, sucede que es una forma sencilla de resolverlo por pasos, con la práctica no será necesario hacerlo</w:t>
+      </w:r>
+      <w:r>
+        <w:rPr>
+          <w:lang w:eastAsia="es-CO"/>
+        </w:rPr>
+        <w:t>,</w:t>
+      </w:r>
+      <w:r>
+        <w:rPr>
+          <w:lang w:eastAsia="es-CO"/>
+        </w:rPr>
+        <w:t xml:space="preserve"> ya que</w:t>
+      </w:r>
+      <w:r>
+        <w:rPr>
+          <w:lang w:eastAsia="es-CO"/>
+        </w:rPr>
+        <w:t>,</w:t>
+      </w:r>
+      <w:r>
+        <w:rPr>
+          <w:lang w:eastAsia="es-CO"/>
+        </w:rPr>
+        <w:t xml:space="preserve"> se podrá resolver mentalmente.</w:t>
+      </w:r>
+    </w:p>
+    <w:p>
+      <w:pPr>
+        <w:rPr>
+          <w:lang w:eastAsia="es-CO"/>
+        </w:rPr>
+      </w:pPr>
+      <w:r>
+        <w:rPr>
+          <w:lang w:eastAsia="es-CO"/>
+        </w:rPr>
+        <w:t>Ahora se resuelve el circuito en paralelo para obtener R₁₋₅.</w:t>
+      </w:r>
+    </w:p>
+    <w:p>
+      <w:pPr>
+        <w:rPr>
+          <w:b/>
+          <w:bCs/>
+          <w:lang w:eastAsia="es-CO"/>
+        </w:rPr>
+      </w:pPr>
+      <w:r>
+        <w:rPr>
+          <w:b/>
+          <w:bCs/>
+          <w:lang w:eastAsia="es-CO"/>
+        </w:rPr>
+        <w:t xml:space="preserve">1 / </w:t>
+      </w:r>
+      <w:bookmarkStart w:id="5" w:name="_Hlk202370357"/>
+      <w:r>
+        <w:rPr>
+          <w:b/>
+          <w:bCs/>
+          <w:lang w:eastAsia="es-CO"/>
+        </w:rPr>
+        <w:t xml:space="preserve">R₁₋₅ </w:t>
+      </w:r>
+      <w:bookmarkEnd w:id="5"/>
+      <w:r>
+        <w:rPr>
+          <w:b/>
+          <w:bCs/>
+          <w:lang w:eastAsia="es-CO"/>
+        </w:rPr>
+        <w:t>= 1 / R₁₂₃ + 1 / R₄₅</w:t>
+      </w:r>
+    </w:p>
+    <w:p>
+      <w:pPr>
+        <w:rPr>
+          <w:lang w:val="es-419" w:eastAsia="es-CO"/>
+        </w:rPr>
+      </w:pPr>
+      <w:r>
+        <w:rPr>
+          <w:lang w:eastAsia="es-CO"/>
+        </w:rPr>
+        <w:t>Finalmente se obtiene el circuito más sencillo de todos y es un circuito en serie, el cual proporciona la resistencia total.</w:t>
+      </w:r>
+    </w:p>
+    <w:p>
+      <w:pPr>
+        <w:pStyle w:val="Figura"/>
+        <w:rPr>
+          <w:lang w:val="es-419"/>
+        </w:rPr>
+      </w:pPr>
+      <w:r>
+        <w:rPr>
+          <w:lang w:val="es-419"/>
+        </w:rPr>
+        <w:t>Resistencia en serie (</w:t>
+      </w:r>
+      <w:r>
+        <w:rPr>
+          <w:b/>
+          <w:bCs/>
+        </w:rPr>
+        <w:t xml:space="preserve">R₁₋₅ </w:t>
+      </w:r>
+      <w:r>
+        <w:rPr>
+          <w:lang w:val="es-419"/>
+        </w:rPr>
+        <w:t>y R6)</w:t>
+      </w:r>
+    </w:p>
+    <w:p>
+      <w:pPr>
+        <w:jc w:val="center"/>
+        <w:rPr>
+          <w:lang w:val="es-419" w:eastAsia="es-CO"/>
+        </w:rPr>
+      </w:pPr>
+      <w:r>
+        <w:rPr>
+          <w:noProof/>
+          <w:lang w:val="es-419" w:eastAsia="es-CO"/>
+        </w:rPr>
+        <w:drawing>
+          <wp:inline distT="0" distB="0" distL="0" distR="0" wp14:anchorId="58756FCE" wp14:editId="3F341A77">
+            <wp:extent cx="1485900" cy="1516856"/>
+            <wp:effectExtent l="0" t="0" r="0" b="0"/>
+            <wp:docPr id="22" name="Imagen 22" descr="En el circuito representado,  las sistencias R1, R2, R3, R4 y R5 forman una resistencia equivalente R1-5 que esta conectada en serie a una resistencia R6 y que su resistencia total se denota como Rt."/>
+            <wp:cNvGraphicFramePr>
+              <a:graphicFrameLocks xmlns:a="http://schemas.openxmlformats.org/drawingml/2006/main" noChangeAspect="1"/>
+            </wp:cNvGraphicFramePr>
+            <a:graphic xmlns:a="http://schemas.openxmlformats.org/drawingml/2006/main">
+              <a:graphicData uri="http://schemas.openxmlformats.org/drawingml/2006/picture">
+                <pic:pic xmlns:pic="http://schemas.openxmlformats.org/drawingml/2006/picture">
+                  <pic:nvPicPr>
+                    <pic:cNvPr id="22" name="Imagen 22" descr="En el circuito representado,  las sistencias R1, R2, R3, R4 y R5 forman una resistencia equivalente R1-5 que esta conectada en serie a una resistencia R6 y que su resistencia total se denota como Rt."/>
+                    <pic:cNvPicPr>
+                      <a:picLocks noChangeAspect="1" noChangeArrowheads="1"/>
+                    </pic:cNvPicPr>
+                  </pic:nvPicPr>
+                  <pic:blipFill>
+                    <a:blip r:embed="rId29">
+                      <a:extLst>
+                        <a:ext uri="{28A0092B-C50C-407E-A947-70E740481C1C}">
+                          <a14:useLocalDpi xmlns:a14="http://schemas.microsoft.com/office/drawing/2010/main" val="0"/>
+                        </a:ext>
+                      </a:extLst>
+                    </a:blip>
+                    <a:srcRect/>
+                    <a:stretch>
+                      <a:fillRect/>
+                    </a:stretch>
+                  </pic:blipFill>
+                  <pic:spPr bwMode="auto">
+                    <a:xfrm>
+                      <a:off x="0" y="0"/>
+                      <a:ext cx="1495985" cy="1527151"/>
+                    </a:xfrm>
+                    <a:prstGeom prst="rect">
+                      <a:avLst/>
+                    </a:prstGeom>
+                    <a:noFill/>
+                  </pic:spPr>
+                </pic:pic>
+              </a:graphicData>
+            </a:graphic>
+          </wp:inline>
+        </w:drawing>
+      </w:r>
+    </w:p>
+    <w:p>
+      <w:pPr>
+        <w:rPr>
           <w:b/>
           <w:bCs/>
           <w:lang w:eastAsia="es-CO"/>
@@ -7700,7 +7706,7 @@
       <w:pPr>
         <w:pStyle w:val="Ttulo1"/>
       </w:pPr>
-      <w:bookmarkStart w:id="6" w:name="_Toc202373149"/>
+      <w:bookmarkStart w:id="6" w:name="_Toc203582982"/>
       <w:r>
         <w:lastRenderedPageBreak/>
         <w:t>Estudio de los divisores de tensión y corriente y del comportamiento dinámico de condensadores e inductores en circuitos eléctricos</w:t>
@@ -7846,7 +7852,7 @@
                     </pic:cNvPicPr>
                   </pic:nvPicPr>
                   <pic:blipFill>
-                    <a:blip r:embed="rId29">
+                    <a:blip r:embed="rId30">
                       <a:extLst>
                         <a:ext uri="{28A0092B-C50C-407E-A947-70E740481C1C}">
                           <a14:useLocalDpi xmlns:a14="http://schemas.microsoft.com/office/drawing/2010/main" val="0"/>
@@ -8061,7 +8067,7 @@
                     </pic:cNvPicPr>
                   </pic:nvPicPr>
                   <pic:blipFill>
-                    <a:blip r:embed="rId30">
+                    <a:blip r:embed="rId31">
                       <a:extLst>
                         <a:ext uri="{28A0092B-C50C-407E-A947-70E740481C1C}">
                           <a14:useLocalDpi xmlns:a14="http://schemas.microsoft.com/office/drawing/2010/main" val="0"/>
@@ -8484,7 +8490,7 @@
                     </pic:cNvPicPr>
                   </pic:nvPicPr>
                   <pic:blipFill>
-                    <a:blip r:embed="rId31">
+                    <a:blip r:embed="rId32">
                       <a:extLst>
                         <a:ext uri="{28A0092B-C50C-407E-A947-70E740481C1C}">
                           <a14:useLocalDpi xmlns:a14="http://schemas.microsoft.com/office/drawing/2010/main" val="0"/>
@@ -8747,7 +8753,7 @@
       <w:pPr>
         <w:pStyle w:val="Ttulo1"/>
       </w:pPr>
-      <w:bookmarkStart w:id="7" w:name="_Toc202373150"/>
+      <w:bookmarkStart w:id="7" w:name="_Toc203582983"/>
       <w:r>
         <w:lastRenderedPageBreak/>
         <w:t>Transformadores de energía</w:t>
@@ -8928,44 +8934,20 @@
           <w:bCs/>
           <w:lang w:val="es-419" w:eastAsia="es-CO"/>
         </w:rPr>
-        <w:t xml:space="preserve">Generación </w:t>
-      </w:r>
-      <w:proofErr w:type="spellStart"/>
-      <w:r>
-        <w:rPr>
-          <w:b/>
-          <w:bCs/>
-          <w:lang w:val="es-419" w:eastAsia="es-CO"/>
-        </w:rPr>
-        <w:t>geotermoeléctrica</w:t>
-      </w:r>
-      <w:proofErr w:type="spellEnd"/>
-    </w:p>
-    <w:p>
-      <w:pPr>
-        <w:rPr>
-          <w:lang w:val="es-419" w:eastAsia="es-CO"/>
-        </w:rPr>
-      </w:pPr>
-      <w:r>
-        <w:rPr>
-          <w:lang w:val="es-419" w:eastAsia="es-CO"/>
-        </w:rPr>
-        <w:t xml:space="preserve">Las centrales </w:t>
-      </w:r>
-      <w:proofErr w:type="spellStart"/>
-      <w:r>
-        <w:rPr>
-          <w:lang w:val="es-419" w:eastAsia="es-CO"/>
-        </w:rPr>
-        <w:t>geotermoeléctricas</w:t>
-      </w:r>
-      <w:proofErr w:type="spellEnd"/>
-      <w:r>
-        <w:rPr>
-          <w:lang w:val="es-419" w:eastAsia="es-CO"/>
-        </w:rPr>
-        <w:t xml:space="preserve"> funcionan de manera similar a las termoeléctricas, pero la fuente de calor proviene del interior de la Tierra; se extrae una mezcla de agua y vapor desde el subsuelo a través de pozos geotérmicos. Esta mezcla se separa en un equipo especializado para obtener vapor seco, que luego se dirige a una turbina. Al igual que en otros sistemas, el vapor hace girar la turbina, generando electricidad mediante un generador.</w:t>
+        <w:t>Generación geotermoeléctrica</w:t>
+      </w:r>
+    </w:p>
+    <w:p>
+      <w:pPr>
+        <w:rPr>
+          <w:lang w:val="es-419" w:eastAsia="es-CO"/>
+        </w:rPr>
+      </w:pPr>
+      <w:r>
+        <w:rPr>
+          <w:lang w:val="es-419" w:eastAsia="es-CO"/>
+        </w:rPr>
+        <w:t>Las centrales geotermoeléctricas funcionan de manera similar a las termoeléctricas, pero la fuente de calor proviene del interior de la Tierra; se extrae una mezcla de agua y vapor desde el subsuelo a través de pozos geotérmicos. Esta mezcla se separa en un equipo especializado para obtener vapor seco, que luego se dirige a una turbina. Al igual que en otros sistemas, el vapor hace girar la turbina, generando electricidad mediante un generador.</w:t>
       </w:r>
     </w:p>
     <w:p>
@@ -9168,7 +9150,7 @@
       <w:pPr>
         <w:pStyle w:val="Ttulo1"/>
       </w:pPr>
-      <w:bookmarkStart w:id="8" w:name="_Toc202373151"/>
+      <w:bookmarkStart w:id="8" w:name="_Toc203582984"/>
       <w:r>
         <w:lastRenderedPageBreak/>
         <w:t>Sistema eléctrico</w:t>
@@ -9232,10 +9214,10 @@
           <w:lang w:eastAsia="es-CO"/>
         </w:rPr>
         <w:drawing>
-          <wp:inline distT="0" distB="0" distL="0" distR="0" wp14:anchorId="0787FC04" wp14:editId="25D9CD04">
-            <wp:extent cx="6332220" cy="2219960"/>
-            <wp:effectExtent l="0" t="0" r="0" b="8890"/>
-            <wp:docPr id="30" name="Imagen 30" descr="Ilustra el proceso de generación, transmisión, transformación, distribución y consumo de electricidad, comenzando desde una central eléctrica que produce energía a 22 kV y utilizando transformadores para elevar el voltaje hasta 220 kV para su transmisión a larga distancia; después, la electricidad se transforma nuevamente a 66 kV y posteriormente a 15 kV, facilitando su distribución en media y baja tensión, hasta alcanzar los usuarios finales que consumen la energía a niveles de 220/110 V."/>
+          <wp:inline distT="0" distB="0" distL="0" distR="0" wp14:anchorId="7B929C8A" wp14:editId="3FCC7520">
+            <wp:extent cx="6332220" cy="2216150"/>
+            <wp:effectExtent l="0" t="0" r="5080" b="6350"/>
+            <wp:docPr id="373249565" name="Imagen 5" descr="Ilustra el proceso de generación, transmisión, transformación, distribución y consumo de electricidad, comenzando desde una central eléctrica que produce energía a 22 kV y utilizando transformadores para elevar el voltaje hasta 220 kV para su transmisión a larga distancia; después, la electricidad se transforma nuevamente a 66 kV y posteriormente a 15 kV, facilitando su distribución en media y baja tensión, hasta alcanzar los usuarios finales que consumen la energía a niveles de 220/110 V."/>
             <wp:cNvGraphicFramePr>
               <a:graphicFrameLocks xmlns:a="http://schemas.openxmlformats.org/drawingml/2006/main" noChangeAspect="1"/>
             </wp:cNvGraphicFramePr>
@@ -9243,36 +9225,29 @@
               <a:graphicData uri="http://schemas.openxmlformats.org/drawingml/2006/picture">
                 <pic:pic xmlns:pic="http://schemas.openxmlformats.org/drawingml/2006/picture">
                   <pic:nvPicPr>
-                    <pic:cNvPr id="30" name="Imagen 30" descr="Ilustra el proceso de generación, transmisión, transformación, distribución y consumo de electricidad, comenzando desde una central eléctrica que produce energía a 22 kV y utilizando transformadores para elevar el voltaje hasta 220 kV para su transmisión a larga distancia; después, la electricidad se transforma nuevamente a 66 kV y posteriormente a 15 kV, facilitando su distribución en media y baja tensión, hasta alcanzar los usuarios finales que consumen la energía a niveles de 220/110 V."/>
-                    <pic:cNvPicPr>
-                      <a:picLocks noChangeAspect="1" noChangeArrowheads="1"/>
-                    </pic:cNvPicPr>
+                    <pic:cNvPr id="373249565" name="Imagen 5" descr="Ilustra el proceso de generación, transmisión, transformación, distribución y consumo de electricidad, comenzando desde una central eléctrica que produce energía a 22 kV y utilizando transformadores para elevar el voltaje hasta 220 kV para su transmisión a larga distancia; después, la electricidad se transforma nuevamente a 66 kV y posteriormente a 15 kV, facilitando su distribución en media y baja tensión, hasta alcanzar los usuarios finales que consumen la energía a niveles de 220/110 V."/>
+                    <pic:cNvPicPr/>
                   </pic:nvPicPr>
                   <pic:blipFill>
-                    <a:blip r:embed="rId32" cstate="print">
+                    <a:blip r:embed="rId33">
                       <a:extLst>
                         <a:ext uri="{28A0092B-C50C-407E-A947-70E740481C1C}">
                           <a14:useLocalDpi xmlns:a14="http://schemas.microsoft.com/office/drawing/2010/main" val="0"/>
                         </a:ext>
                       </a:extLst>
                     </a:blip>
-                    <a:srcRect/>
                     <a:stretch>
                       <a:fillRect/>
                     </a:stretch>
                   </pic:blipFill>
-                  <pic:spPr bwMode="auto">
+                  <pic:spPr>
                     <a:xfrm>
                       <a:off x="0" y="0"/>
-                      <a:ext cx="6332220" cy="2219960"/>
+                      <a:ext cx="6332220" cy="2216150"/>
                     </a:xfrm>
                     <a:prstGeom prst="rect">
                       <a:avLst/>
                     </a:prstGeom>
-                    <a:noFill/>
-                    <a:ln>
-                      <a:noFill/>
-                    </a:ln>
                   </pic:spPr>
                 </pic:pic>
               </a:graphicData>
@@ -9292,21 +9267,7 @@
         <w:rPr>
           <w:lang w:val="es-419" w:eastAsia="es-CO"/>
         </w:rPr>
-        <w:t xml:space="preserve">Fuente: </w:t>
-      </w:r>
-      <w:proofErr w:type="spellStart"/>
-      <w:r>
-        <w:rPr>
-          <w:lang w:val="es-419" w:eastAsia="es-CO"/>
-        </w:rPr>
-        <w:t>Picco</w:t>
-      </w:r>
-      <w:proofErr w:type="spellEnd"/>
-      <w:r>
-        <w:rPr>
-          <w:lang w:val="es-419" w:eastAsia="es-CO"/>
-        </w:rPr>
-        <w:t>, (2014)</w:t>
+        <w:t>Fuente: Picco, (2014)</w:t>
       </w:r>
     </w:p>
     <w:p>
@@ -9808,7 +9769,7 @@
                     </pic:cNvPicPr>
                   </pic:nvPicPr>
                   <pic:blipFill>
-                    <a:blip r:embed="rId33">
+                    <a:blip r:embed="rId34">
                       <a:extLst>
                         <a:ext uri="{28A0092B-C50C-407E-A947-70E740481C1C}">
                           <a14:useLocalDpi xmlns:a14="http://schemas.microsoft.com/office/drawing/2010/main" val="0"/>
@@ -9878,7 +9839,13 @@
         <w:rPr>
           <w:lang w:eastAsia="es-CO"/>
         </w:rPr>
-        <w:t>Se diferencia de la directa en que cambia su sentido de circulación periódicamente y, por tanto, su polaridad. Esto ocurre tantas veces como frecuencia en hercios (Hz) tenga esa corriente. A la corriente directa (DC), también se le llama “corriente continua”.</w:t>
+        <w:t>Se diferencia de la directa en que cambia su sentido de circulación periódicamente y, por tanto, su polaridad. Esto ocurre tantas veces como frecuencia en hercios (Hz) tenga esa corriente</w:t>
+      </w:r>
+      <w:r>
+        <w:rPr>
+          <w:lang w:eastAsia="es-CO"/>
+        </w:rPr>
+        <w:t>.</w:t>
       </w:r>
     </w:p>
     <w:p>
@@ -9959,7 +9926,7 @@
                     </pic:cNvPicPr>
                   </pic:nvPicPr>
                   <pic:blipFill>
-                    <a:blip r:embed="rId34">
+                    <a:blip r:embed="rId35">
                       <a:extLst>
                         <a:ext uri="{28A0092B-C50C-407E-A947-70E740481C1C}">
                           <a14:useLocalDpi xmlns:a14="http://schemas.microsoft.com/office/drawing/2010/main" val="0"/>
@@ -10143,7 +10110,7 @@
         </w:numPr>
         <w:ind w:left="1068"/>
       </w:pPr>
-      <w:bookmarkStart w:id="9" w:name="_Toc202373152"/>
+      <w:bookmarkStart w:id="9" w:name="_Toc203582985"/>
       <w:r>
         <w:lastRenderedPageBreak/>
         <w:t>Síntesis</w:t>
@@ -10207,7 +10174,7 @@
                     </pic:cNvPicPr>
                   </pic:nvPicPr>
                   <pic:blipFill>
-                    <a:blip r:embed="rId35">
+                    <a:blip r:embed="rId36">
                       <a:extLst>
                         <a:ext uri="{28A0092B-C50C-407E-A947-70E740481C1C}">
                           <a14:useLocalDpi xmlns:a14="http://schemas.microsoft.com/office/drawing/2010/main" val="0"/>
@@ -10301,7 +10268,7 @@
         </w:numPr>
         <w:ind w:left="1068"/>
       </w:pPr>
-      <w:bookmarkStart w:id="10" w:name="_Toc202373153"/>
+      <w:bookmarkStart w:id="10" w:name="_Toc203582986"/>
       <w:r>
         <w:lastRenderedPageBreak/>
         <w:t>Material complementario</w:t>
@@ -10430,7 +10397,7 @@
             <w:pPr>
               <w:pStyle w:val="TextoTablas"/>
             </w:pPr>
-            <w:hyperlink r:id="rId36" w:history="1">
+            <w:hyperlink r:id="rId37" w:history="1">
               <w:r>
                 <w:rPr>
                   <w:rStyle w:val="Hipervnculo"/>
@@ -10464,23 +10431,7 @@
               <w:pStyle w:val="TextoTablas"/>
             </w:pPr>
             <w:r>
-              <w:t xml:space="preserve">RTR Energy. (s.f.). Condensadores Eléctricos. [Catálogo PDF]. Direct </w:t>
-            </w:r>
-            <w:proofErr w:type="spellStart"/>
-            <w:r>
-              <w:t>Industry</w:t>
-            </w:r>
-            <w:proofErr w:type="spellEnd"/>
-            <w:r>
-              <w:t xml:space="preserve"> </w:t>
-            </w:r>
-            <w:proofErr w:type="spellStart"/>
-            <w:r>
-              <w:t>Connect</w:t>
-            </w:r>
-            <w:proofErr w:type="spellEnd"/>
-            <w:r>
-              <w:t>.</w:t>
+              <w:t>RTR Energy. (s.f.). Condensadores Eléctricos. [Catálogo PDF]. Direct Industry Connect.</w:t>
             </w:r>
           </w:p>
         </w:tc>
@@ -10505,7 +10456,7 @@
             <w:pPr>
               <w:pStyle w:val="TextoTablas"/>
             </w:pPr>
-            <w:hyperlink r:id="rId37" w:history="1">
+            <w:hyperlink r:id="rId38" w:history="1">
               <w:r>
                 <w:rPr>
                   <w:rStyle w:val="Hipervnculo"/>
@@ -10567,7 +10518,7 @@
             <w:pPr>
               <w:pStyle w:val="TextoTablas"/>
             </w:pPr>
-            <w:hyperlink r:id="rId38" w:history="1">
+            <w:hyperlink r:id="rId39" w:history="1">
               <w:r>
                 <w:rPr>
                   <w:rStyle w:val="Hipervnculo"/>
@@ -10660,7 +10611,7 @@
         </w:numPr>
         <w:ind w:left="1068"/>
       </w:pPr>
-      <w:bookmarkStart w:id="11" w:name="_Toc202373154"/>
+      <w:bookmarkStart w:id="11" w:name="_Toc203582987"/>
       <w:r>
         <w:lastRenderedPageBreak/>
         <w:t>Glosario</w:t>
@@ -10953,7 +10904,21 @@
           <w:bdr w:val="none" w:sz="0" w:space="0" w:color="auto" w:frame="1"/>
           <w:lang w:eastAsia="es-CO"/>
         </w:rPr>
-        <w:t xml:space="preserve"> determina la cantidad de calor que es capaz de entregar una resistencia, esta cantidad de calor dependerá de la intensidad de corriente que por ella circule de la cantidad de tiempo que esté conectada.</w:t>
+        <w:t xml:space="preserve"> </w:t>
+      </w:r>
+      <w:r>
+        <w:rPr>
+          <w:bdr w:val="none" w:sz="0" w:space="0" w:color="auto" w:frame="1"/>
+          <w:lang w:eastAsia="es-CO"/>
+        </w:rPr>
+        <w:t>determina la cantidad de calor que una resistencia es capaz de entregar, la cual depende de la intensidad de corriente que la atraviesa y del tiempo durante el cual permanece conectada</w:t>
+      </w:r>
+      <w:r>
+        <w:rPr>
+          <w:bdr w:val="none" w:sz="0" w:space="0" w:color="auto" w:frame="1"/>
+          <w:lang w:eastAsia="es-CO"/>
+        </w:rPr>
+        <w:t>.</w:t>
       </w:r>
     </w:p>
     <w:p>
@@ -11175,7 +11140,7 @@
         </w:numPr>
         <w:ind w:left="1068"/>
       </w:pPr>
-      <w:bookmarkStart w:id="12" w:name="_Toc202373155"/>
+      <w:bookmarkStart w:id="12" w:name="_Toc203582988"/>
       <w:r>
         <w:rPr>
           <w:bdr w:val="none" w:sz="0" w:space="0" w:color="auto" w:frame="1"/>
@@ -11269,7 +11234,7 @@
         </w:rPr>
         <w:t>. Circuito eléctrico. (11 de mayo de 2014). Recuperado de </w:t>
       </w:r>
-      <w:hyperlink r:id="rId39" w:tgtFrame="_blank" w:history="1">
+      <w:hyperlink r:id="rId40" w:tgtFrame="_blank" w:history="1">
         <w:r>
           <w:rPr>
             <w:rStyle w:val="Hipervnculo"/>
@@ -11318,7 +11283,7 @@
           <w:lang w:eastAsia="es-CO"/>
           <w14:ligatures w14:val="none"/>
         </w:rPr>
-        <w:t xml:space="preserve">. (2014). Descubrimiento de la primera partícula subatómica: el electrón. </w:t>
+        <w:t>. (2014). Descubrimiento de la primera partícula subatómica: el electrón.</w:t>
       </w:r>
       <w:r>
         <w:rPr>
@@ -11331,10 +11296,21 @@
         </w:rPr>
         <w:t xml:space="preserve"> </w:t>
       </w:r>
-    </w:p>
-    <w:p>
-      <w:pPr>
-        <w:ind w:left="709" w:hanging="709"/>
+      <w:hyperlink r:id="rId41" w:history="1">
+        <w:r>
+          <w:rPr>
+            <w:rStyle w:val="Hipervnculo"/>
+            <w:rFonts w:eastAsia="Times New Roman" w:cstheme="minorHAnsi"/>
+            <w:kern w:val="0"/>
+            <w:szCs w:val="28"/>
+            <w:bdr w:val="none" w:sz="0" w:space="0" w:color="auto" w:frame="1"/>
+            <w:lang w:eastAsia="es-CO"/>
+            <w14:ligatures w14:val="none"/>
+          </w:rPr>
+          <w:t>https://escuelapedia.com/descubrimiento-de-la-primera-particula-subatomica-el-electron/</w:t>
+        </w:r>
+      </w:hyperlink>
+      <w:r>
         <w:rPr>
           <w:rFonts w:eastAsia="Times New Roman" w:cstheme="minorHAnsi"/>
           <w:kern w:val="0"/>
@@ -11343,8 +11319,12 @@
           <w:lang w:eastAsia="es-CO"/>
           <w14:ligatures w14:val="none"/>
         </w:rPr>
-      </w:pPr>
-      <w:r>
+        <w:t xml:space="preserve"> </w:t>
+      </w:r>
+    </w:p>
+    <w:p>
+      <w:pPr>
+        <w:ind w:left="709" w:hanging="709"/>
         <w:rPr>
           <w:rFonts w:eastAsia="Times New Roman" w:cstheme="minorHAnsi"/>
           <w:kern w:val="0"/>
@@ -11353,9 +11333,7 @@
           <w:lang w:eastAsia="es-CO"/>
           <w14:ligatures w14:val="none"/>
         </w:rPr>
-        <w:t xml:space="preserve">García González, A. (22 de marzo de 2023). Conceptos básicos de electricidad: La ley de Ohm - </w:t>
-      </w:r>
-      <w:proofErr w:type="spellStart"/>
+      </w:pPr>
       <w:r>
         <w:rPr>
           <w:rFonts w:eastAsia="Times New Roman" w:cstheme="minorHAnsi"/>
@@ -11365,9 +11343,9 @@
           <w:lang w:eastAsia="es-CO"/>
           <w14:ligatures w14:val="none"/>
         </w:rPr>
-        <w:t>Panama</w:t>
-      </w:r>
-      <w:proofErr w:type="spellEnd"/>
+        <w:t xml:space="preserve">García González, A. (22 de marzo de 2023). Conceptos básicos de electricidad: La ley de Ohm - </w:t>
+      </w:r>
+      <w:proofErr w:type="spellStart"/>
       <w:r>
         <w:rPr>
           <w:rFonts w:eastAsia="Times New Roman" w:cstheme="minorHAnsi"/>
@@ -11377,9 +11355,9 @@
           <w:lang w:eastAsia="es-CO"/>
           <w14:ligatures w14:val="none"/>
         </w:rPr>
-        <w:t xml:space="preserve"> </w:t>
-      </w:r>
-      <w:proofErr w:type="spellStart"/>
+        <w:t>Panama</w:t>
+      </w:r>
+      <w:proofErr w:type="spellEnd"/>
       <w:r>
         <w:rPr>
           <w:rFonts w:eastAsia="Times New Roman" w:cstheme="minorHAnsi"/>
@@ -11389,9 +11367,9 @@
           <w:lang w:eastAsia="es-CO"/>
           <w14:ligatures w14:val="none"/>
         </w:rPr>
-        <w:t>Hitek</w:t>
-      </w:r>
-      <w:proofErr w:type="spellEnd"/>
+        <w:t xml:space="preserve"> </w:t>
+      </w:r>
+      <w:proofErr w:type="spellStart"/>
       <w:r>
         <w:rPr>
           <w:rFonts w:eastAsia="Times New Roman" w:cstheme="minorHAnsi"/>
@@ -11401,9 +11379,21 @@
           <w:lang w:eastAsia="es-CO"/>
           <w14:ligatures w14:val="none"/>
         </w:rPr>
+        <w:t>Hitek</w:t>
+      </w:r>
+      <w:proofErr w:type="spellEnd"/>
+      <w:r>
+        <w:rPr>
+          <w:rFonts w:eastAsia="Times New Roman" w:cstheme="minorHAnsi"/>
+          <w:kern w:val="0"/>
+          <w:szCs w:val="28"/>
+          <w:bdr w:val="none" w:sz="0" w:space="0" w:color="auto" w:frame="1"/>
+          <w:lang w:eastAsia="es-CO"/>
+          <w14:ligatures w14:val="none"/>
+        </w:rPr>
         <w:t>. Recuperado de </w:t>
       </w:r>
-      <w:hyperlink r:id="rId40" w:tgtFrame="_blank" w:history="1">
+      <w:hyperlink r:id="rId42" w:tgtFrame="_blank" w:history="1">
         <w:r>
           <w:rPr>
             <w:rStyle w:val="Hipervnculo"/>
@@ -11441,7 +11431,7 @@
         </w:rPr>
         <w:t>García Fraile, A. (28 de febrero de 2011). Energías renovables y no renovables. [Web blog spot]. Recuperado de </w:t>
       </w:r>
-      <w:hyperlink r:id="rId41" w:tgtFrame="_blank" w:history="1">
+      <w:hyperlink r:id="rId43" w:tgtFrame="_blank" w:history="1">
         <w:r>
           <w:rPr>
             <w:rStyle w:val="Hipervnculo"/>
@@ -11501,10 +11491,12 @@
           <w:lang w:eastAsia="es-CO"/>
           <w14:ligatures w14:val="none"/>
         </w:rPr>
-        <w:t xml:space="preserve">Hermosa </w:t>
-      </w:r>
-      <w:proofErr w:type="spellStart"/>
-      <w:r>
+        <w:t>Hermosa Donate, A. (2003). Principios de electricidad y electrónica. (T III).</w:t>
+      </w:r>
+    </w:p>
+    <w:p>
+      <w:pPr>
+        <w:ind w:left="709" w:hanging="709"/>
         <w:rPr>
           <w:rFonts w:eastAsia="Times New Roman" w:cstheme="minorHAnsi"/>
           <w:kern w:val="0"/>
@@ -11513,9 +11505,7 @@
           <w:lang w:eastAsia="es-CO"/>
           <w14:ligatures w14:val="none"/>
         </w:rPr>
-        <w:t>Donate</w:t>
-      </w:r>
-      <w:proofErr w:type="spellEnd"/>
+      </w:pPr>
       <w:r>
         <w:rPr>
           <w:rFonts w:eastAsia="Times New Roman" w:cstheme="minorHAnsi"/>
@@ -11525,33 +11515,9 @@
           <w:lang w:eastAsia="es-CO"/>
           <w14:ligatures w14:val="none"/>
         </w:rPr>
-        <w:t>, A. (2003). Principios de electricidad y electrónica. (T III).</w:t>
-      </w:r>
-    </w:p>
-    <w:p>
-      <w:pPr>
-        <w:ind w:left="709" w:hanging="709"/>
-        <w:rPr>
-          <w:rFonts w:eastAsia="Times New Roman" w:cstheme="minorHAnsi"/>
-          <w:kern w:val="0"/>
-          <w:szCs w:val="28"/>
-          <w:bdr w:val="none" w:sz="0" w:space="0" w:color="auto" w:frame="1"/>
-          <w:lang w:eastAsia="es-CO"/>
-          <w14:ligatures w14:val="none"/>
-        </w:rPr>
-      </w:pPr>
-      <w:r>
-        <w:rPr>
-          <w:rFonts w:eastAsia="Times New Roman" w:cstheme="minorHAnsi"/>
-          <w:kern w:val="0"/>
-          <w:szCs w:val="28"/>
-          <w:bdr w:val="none" w:sz="0" w:space="0" w:color="auto" w:frame="1"/>
-          <w:lang w:eastAsia="es-CO"/>
-          <w14:ligatures w14:val="none"/>
-        </w:rPr>
         <w:t>Martínez, R. (2012). Receptores eléctricos. Recuperado de </w:t>
       </w:r>
-      <w:hyperlink r:id="rId42" w:tgtFrame="_blank" w:history="1">
+      <w:hyperlink r:id="rId44" w:tgtFrame="_blank" w:history="1">
         <w:r>
           <w:rPr>
             <w:rStyle w:val="Hipervnculo"/>
@@ -11602,7 +11568,7 @@
         </w:rPr>
         <w:t>. (mar.). Medidas eléctricas en las instalaciones de baja tensión. Recuperado de </w:t>
       </w:r>
-      <w:hyperlink r:id="rId43" w:tgtFrame="_blank" w:history="1">
+      <w:hyperlink r:id="rId45" w:tgtFrame="_blank" w:history="1">
         <w:r>
           <w:rPr>
             <w:rStyle w:val="Hipervnculo"/>
@@ -11639,6 +11605,7 @@
           <w:lang w:eastAsia="es-CO"/>
           <w14:ligatures w14:val="none"/>
         </w:rPr>
+        <w:lastRenderedPageBreak/>
         <w:t>Picco</w:t>
       </w:r>
       <w:proofErr w:type="spellEnd"/>
@@ -11653,7 +11620,7 @@
         </w:rPr>
         <w:t>, D. L. (9 de mayo de 2014). El largo camino de la electricidad. [Web blog spot]. Recuperado de </w:t>
       </w:r>
-      <w:hyperlink r:id="rId44" w:tgtFrame="_blank" w:history="1">
+      <w:hyperlink r:id="rId46" w:tgtFrame="_blank" w:history="1">
         <w:r>
           <w:rPr>
             <w:rStyle w:val="Hipervnculo"/>
@@ -11689,10 +11656,9 @@
           <w:lang w:eastAsia="es-CO"/>
           <w14:ligatures w14:val="none"/>
         </w:rPr>
-        <w:lastRenderedPageBreak/>
         <w:t>Polanco Cáceres, H.G. (2010). Manual de procesos y procedimientos. [Monografía]. Universidad Santiago de Cali. Recuperado de </w:t>
       </w:r>
-      <w:hyperlink r:id="rId45" w:tgtFrame="_blank" w:history="1">
+      <w:hyperlink r:id="rId47" w:tgtFrame="_blank" w:history="1">
         <w:r>
           <w:rPr>
             <w:rStyle w:val="Hipervnculo"/>
@@ -11815,7 +11781,7 @@
         </w:rPr>
         <w:t>. Recuperado de </w:t>
       </w:r>
-      <w:hyperlink r:id="rId46" w:tgtFrame="_blank" w:history="1">
+      <w:hyperlink r:id="rId48" w:tgtFrame="_blank" w:history="1">
         <w:r>
           <w:rPr>
             <w:rStyle w:val="Hipervnculo"/>
@@ -11866,7 +11832,7 @@
         </w:rPr>
         <w:t>. (11 de febrero de 2011). Corriente eléctrica. Recuperado de </w:t>
       </w:r>
-      <w:hyperlink r:id="rId47" w:tgtFrame="_blank" w:history="1">
+      <w:hyperlink r:id="rId49" w:tgtFrame="_blank" w:history="1">
         <w:r>
           <w:rPr>
             <w:rStyle w:val="Hipervnculo"/>
@@ -11904,7 +11870,7 @@
         </w:rPr>
         <w:t>Rueda, L. (26 de abril de 2021). Electrónica: 3. tutorial de electrónica básica autor Rueda Luis. SlideShare. </w:t>
       </w:r>
-      <w:hyperlink r:id="rId48" w:tgtFrame="_blank" w:history="1">
+      <w:hyperlink r:id="rId50" w:tgtFrame="_blank" w:history="1">
         <w:r>
           <w:rPr>
             <w:rStyle w:val="Hipervnculo"/>
@@ -11979,7 +11945,7 @@
         </w:rPr>
         <w:t>. Buenos Aires: SISBI- UBA. Recuperado de: </w:t>
       </w:r>
-      <w:hyperlink r:id="rId49" w:tgtFrame="_blank" w:history="1">
+      <w:hyperlink r:id="rId51" w:tgtFrame="_blank" w:history="1">
         <w:r>
           <w:rPr>
             <w:rStyle w:val="Hipervnculo"/>
@@ -12030,7 +11996,7 @@
         </w:rPr>
         <w:t>. (s.f.). Sistema Eléctrico de Potencia. Recuperado de </w:t>
       </w:r>
-      <w:hyperlink r:id="rId50" w:tgtFrame="_blank" w:history="1">
+      <w:hyperlink r:id="rId52" w:tgtFrame="_blank" w:history="1">
         <w:r>
           <w:rPr>
             <w:rStyle w:val="Hipervnculo"/>
@@ -12049,7 +12015,18 @@
       <w:pPr>
         <w:ind w:left="709" w:hanging="709"/>
         <w:rPr>
-          <w:rStyle w:val="Hipervnculo"/>
+          <w:rFonts w:eastAsia="Times New Roman" w:cstheme="minorHAnsi"/>
+          <w:color w:val="1F3864" w:themeColor="accent1" w:themeShade="80"/>
+          <w:kern w:val="0"/>
+          <w:szCs w:val="28"/>
+          <w:u w:val="single"/>
+          <w:bdr w:val="none" w:sz="0" w:space="0" w:color="auto" w:frame="1"/>
+          <w:lang w:eastAsia="es-CO"/>
+          <w14:ligatures w14:val="none"/>
+        </w:rPr>
+      </w:pPr>
+      <w:r>
+        <w:rPr>
           <w:rFonts w:eastAsia="Times New Roman" w:cstheme="minorHAnsi"/>
           <w:kern w:val="0"/>
           <w:szCs w:val="28"/>
@@ -12057,7 +12034,8 @@
           <w:lang w:eastAsia="es-CO"/>
           <w14:ligatures w14:val="none"/>
         </w:rPr>
-      </w:pPr>
+        <w:t>Zambrano, A. B. (2019). ELEMENTOS DE UN CIRCUITO Unidad 1. Conceptos básicos de electricidad. Senasofiaplus.</w:t>
+      </w:r>
       <w:r>
         <w:rPr>
           <w:rFonts w:eastAsia="Times New Roman" w:cstheme="minorHAnsi"/>
@@ -12067,20 +12045,9 @@
           <w:lang w:eastAsia="es-CO"/>
           <w14:ligatures w14:val="none"/>
         </w:rPr>
-        <w:t>Zambrano, A. B. (2019). ELEMENTOS DE UN CIRCUITO Unidad 1. Conceptos básicos de electricidad. Senasofiaplus.</w:t>
-      </w:r>
-      <w:r>
-        <w:rPr>
-          <w:rFonts w:eastAsia="Times New Roman" w:cstheme="minorHAnsi"/>
-          <w:kern w:val="0"/>
-          <w:szCs w:val="28"/>
-          <w:bdr w:val="none" w:sz="0" w:space="0" w:color="auto" w:frame="1"/>
-          <w:lang w:eastAsia="es-CO"/>
-          <w14:ligatures w14:val="none"/>
-        </w:rPr>
         <w:t>,</w:t>
       </w:r>
-      <w:hyperlink r:id="rId51" w:history="1">
+      <w:hyperlink r:id="rId53" w:history="1">
         <w:r>
           <w:rPr>
             <w:rStyle w:val="Hipervnculo"/>
@@ -12097,33 +12064,6 @@
     </w:p>
     <w:p>
       <w:pPr>
-        <w:ind w:left="709" w:hanging="709"/>
-        <w:rPr>
-          <w:rStyle w:val="Hipervnculo"/>
-          <w:rFonts w:eastAsia="Times New Roman" w:cstheme="minorHAnsi"/>
-          <w:kern w:val="0"/>
-          <w:szCs w:val="28"/>
-          <w:bdr w:val="none" w:sz="0" w:space="0" w:color="auto" w:frame="1"/>
-          <w:lang w:eastAsia="es-CO"/>
-          <w14:ligatures w14:val="none"/>
-        </w:rPr>
-      </w:pPr>
-    </w:p>
-    <w:p>
-      <w:pPr>
-        <w:ind w:left="709" w:hanging="709"/>
-        <w:rPr>
-          <w:rFonts w:eastAsia="Times New Roman" w:cstheme="minorHAnsi"/>
-          <w:kern w:val="0"/>
-          <w:szCs w:val="28"/>
-          <w:bdr w:val="none" w:sz="0" w:space="0" w:color="auto" w:frame="1"/>
-          <w:lang w:eastAsia="es-CO"/>
-          <w14:ligatures w14:val="none"/>
-        </w:rPr>
-      </w:pPr>
-    </w:p>
-    <w:p>
-      <w:pPr>
         <w:pStyle w:val="Ttulo1"/>
         <w:numPr>
           <w:ilvl w:val="0"/>
@@ -12131,7 +12071,7 @@
         </w:numPr>
         <w:ind w:left="708"/>
       </w:pPr>
-      <w:bookmarkStart w:id="13" w:name="_Toc202373156"/>
+      <w:bookmarkStart w:id="13" w:name="_Toc203582989"/>
       <w:r>
         <w:lastRenderedPageBreak/>
         <w:t>Créditos</w:t>
@@ -12216,13 +12156,8 @@
             <w:pPr>
               <w:pStyle w:val="TextoTablas"/>
             </w:pPr>
-            <w:proofErr w:type="spellStart"/>
-            <w:r>
-              <w:t>Milady</w:t>
-            </w:r>
-            <w:proofErr w:type="spellEnd"/>
-            <w:r>
-              <w:t xml:space="preserve"> Tatiana Villamil Castellanos</w:t>
+            <w:r>
+              <w:t>Milady Tatiana Villamil Castellanos</w:t>
             </w:r>
           </w:p>
         </w:tc>
@@ -12628,15 +12563,7 @@
               <w:pStyle w:val="TextoTablas"/>
             </w:pPr>
             <w:r>
-              <w:t xml:space="preserve">Laura Paola </w:t>
-            </w:r>
-            <w:proofErr w:type="spellStart"/>
-            <w:r>
-              <w:t>Gelvez</w:t>
-            </w:r>
-            <w:proofErr w:type="spellEnd"/>
-            <w:r>
-              <w:t xml:space="preserve"> Manosalva</w:t>
+              <w:t>Laura Paola Gelvez Manosalva</w:t>
             </w:r>
           </w:p>
         </w:tc>
@@ -12765,8 +12692,8 @@
       </w:pPr>
     </w:p>
     <w:sectPr>
-      <w:headerReference w:type="default" r:id="rId52"/>
-      <w:footerReference w:type="default" r:id="rId53"/>
+      <w:headerReference w:type="default" r:id="rId54"/>
+      <w:footerReference w:type="default" r:id="rId55"/>
       <w:pgSz w:w="12240" w:h="15840"/>
       <w:pgMar w:top="1701" w:right="1134" w:bottom="1134" w:left="1134" w:header="709" w:footer="737" w:gutter="0"/>
       <w:pgNumType w:start="1"/>
@@ -12778,7 +12705,7 @@
 </file>
 
 <file path=word/endnotes.xml><?xml version="1.0" encoding="utf-8"?>
-<w:endnotes xmlns:wpc="http://schemas.microsoft.com/office/word/2010/wordprocessingCanvas" xmlns:cx="http://schemas.microsoft.com/office/drawing/2014/chartex" xmlns:cx1="http://schemas.microsoft.com/office/drawing/2015/9/8/chartex" xmlns:cx2="http://schemas.microsoft.com/office/drawing/2015/10/21/chartex" xmlns:cx3="http://schemas.microsoft.com/office/drawing/2016/5/9/chartex" xmlns:cx4="http://schemas.microsoft.com/office/drawing/2016/5/10/chartex" xmlns:cx5="http://schemas.microsoft.com/office/drawing/2016/5/11/chartex" xmlns:cx6="http://schemas.microsoft.com/office/drawing/2016/5/12/chartex" xmlns:cx7="http://schemas.microsoft.com/office/drawing/2016/5/13/chartex" xmlns:cx8="http://schemas.microsoft.com/office/drawing/2016/5/14/chartex" xmlns:mc="http://schemas.openxmlformats.org/markup-compatibility/2006" xmlns:aink="http://schemas.microsoft.com/office/drawing/2016/ink" xmlns:am3d="http://schemas.microsoft.com/office/drawing/2017/model3d" xmlns:o="urn:schemas-microsoft-com:office:office" xmlns:r="http://schemas.openxmlformats.org/officeDocument/2006/relationships" xmlns:m="http://schemas.openxmlformats.org/officeDocument/2006/math" xmlns:v="urn:schemas-microsoft-com:vml" xmlns:wp14="http://schemas.microsoft.com/office/word/2010/wordprocessingDrawing" xmlns:wp="http://schemas.openxmlformats.org/drawingml/2006/wordprocessingDrawing" xmlns:w10="urn:schemas-microsoft-com:office:word" xmlns:w="http://schemas.openxmlformats.org/wordprocessingml/2006/main" xmlns:w14="http://schemas.microsoft.com/office/word/2010/wordml" xmlns:w15="http://schemas.microsoft.com/office/word/2012/wordml" xmlns:w16cex="http://schemas.microsoft.com/office/word/2018/wordml/cex" xmlns:w16cid="http://schemas.microsoft.com/office/word/2016/wordml/cid" xmlns:w16="http://schemas.microsoft.com/office/word/2018/wordml" xmlns:w16sdtdh="http://schemas.microsoft.com/office/word/2020/wordml/sdtdatahash" xmlns:w16se="http://schemas.microsoft.com/office/word/2015/wordml/symex" xmlns:wpg="http://schemas.microsoft.com/office/word/2010/wordprocessingGroup" xmlns:wpi="http://schemas.microsoft.com/office/word/2010/wordprocessingInk" xmlns:wne="http://schemas.microsoft.com/office/word/2006/wordml" xmlns:wps="http://schemas.microsoft.com/office/word/2010/wordprocessingShape" mc:Ignorable="w14 w15 w16se w16cid w16 w16cex w16sdtdh wp14">
+<w:endnotes xmlns:wpc="http://schemas.microsoft.com/office/word/2010/wordprocessingCanvas" xmlns:cx="http://schemas.microsoft.com/office/drawing/2014/chartex" xmlns:cx1="http://schemas.microsoft.com/office/drawing/2015/9/8/chartex" xmlns:cx2="http://schemas.microsoft.com/office/drawing/2015/10/21/chartex" xmlns:cx3="http://schemas.microsoft.com/office/drawing/2016/5/9/chartex" xmlns:cx4="http://schemas.microsoft.com/office/drawing/2016/5/10/chartex" xmlns:cx5="http://schemas.microsoft.com/office/drawing/2016/5/11/chartex" xmlns:cx6="http://schemas.microsoft.com/office/drawing/2016/5/12/chartex" xmlns:cx7="http://schemas.microsoft.com/office/drawing/2016/5/13/chartex" xmlns:cx8="http://schemas.microsoft.com/office/drawing/2016/5/14/chartex" xmlns:mc="http://schemas.openxmlformats.org/markup-compatibility/2006" xmlns:aink="http://schemas.microsoft.com/office/drawing/2016/ink" xmlns:am3d="http://schemas.microsoft.com/office/drawing/2017/model3d" xmlns:o="urn:schemas-microsoft-com:office:office" xmlns:oel="http://schemas.microsoft.com/office/2019/extlst" xmlns:r="http://schemas.openxmlformats.org/officeDocument/2006/relationships" xmlns:m="http://schemas.openxmlformats.org/officeDocument/2006/math" xmlns:v="urn:schemas-microsoft-com:vml" xmlns:wp14="http://schemas.microsoft.com/office/word/2010/wordprocessingDrawing" xmlns:wp="http://schemas.openxmlformats.org/drawingml/2006/wordprocessingDrawing" xmlns:w10="urn:schemas-microsoft-com:office:word" xmlns:w="http://schemas.openxmlformats.org/wordprocessingml/2006/main" xmlns:w14="http://schemas.microsoft.com/office/word/2010/wordml" xmlns:w15="http://schemas.microsoft.com/office/word/2012/wordml" xmlns:w16cex="http://schemas.microsoft.com/office/word/2018/wordml/cex" xmlns:w16cid="http://schemas.microsoft.com/office/word/2016/wordml/cid" xmlns:w16="http://schemas.microsoft.com/office/word/2018/wordml" xmlns:w16du="http://schemas.microsoft.com/office/word/2023/wordml/word16du" xmlns:w16sdtdh="http://schemas.microsoft.com/office/word/2020/wordml/sdtdatahash" xmlns:w16sdtfl="http://schemas.microsoft.com/office/word/2024/wordml/sdtformatlock" xmlns:w16se="http://schemas.microsoft.com/office/word/2015/wordml/symex" xmlns:wpg="http://schemas.microsoft.com/office/word/2010/wordprocessingGroup" xmlns:wpi="http://schemas.microsoft.com/office/word/2010/wordprocessingInk" xmlns:wne="http://schemas.microsoft.com/office/word/2006/wordml" xmlns:wps="http://schemas.microsoft.com/office/word/2010/wordprocessingShape" mc:Ignorable="w14 w15 w16se w16cid w16 w16cex w16sdtdh w16sdtfl w16du wp14">
   <w:endnote w:type="separator" w:id="-1">
     <w:p>
       <w:pPr>
@@ -12803,7 +12730,7 @@
 </file>
 
 <file path=word/footer1.xml><?xml version="1.0" encoding="utf-8"?>
-<w:ftr xmlns:wpc="http://schemas.microsoft.com/office/word/2010/wordprocessingCanvas" xmlns:cx="http://schemas.microsoft.com/office/drawing/2014/chartex" xmlns:cx1="http://schemas.microsoft.com/office/drawing/2015/9/8/chartex" xmlns:cx2="http://schemas.microsoft.com/office/drawing/2015/10/21/chartex" xmlns:cx3="http://schemas.microsoft.com/office/drawing/2016/5/9/chartex" xmlns:cx4="http://schemas.microsoft.com/office/drawing/2016/5/10/chartex" xmlns:cx5="http://schemas.microsoft.com/office/drawing/2016/5/11/chartex" xmlns:cx6="http://schemas.microsoft.com/office/drawing/2016/5/12/chartex" xmlns:cx7="http://schemas.microsoft.com/office/drawing/2016/5/13/chartex" xmlns:cx8="http://schemas.microsoft.com/office/drawing/2016/5/14/chartex" xmlns:mc="http://schemas.openxmlformats.org/markup-compatibility/2006" xmlns:aink="http://schemas.microsoft.com/office/drawing/2016/ink" xmlns:am3d="http://schemas.microsoft.com/office/drawing/2017/model3d" xmlns:o="urn:schemas-microsoft-com:office:office" xmlns:r="http://schemas.openxmlformats.org/officeDocument/2006/relationships" xmlns:m="http://schemas.openxmlformats.org/officeDocument/2006/math" xmlns:v="urn:schemas-microsoft-com:vml" xmlns:wp14="http://schemas.microsoft.com/office/word/2010/wordprocessingDrawing" xmlns:wp="http://schemas.openxmlformats.org/drawingml/2006/wordprocessingDrawing" xmlns:w10="urn:schemas-microsoft-com:office:word" xmlns:w="http://schemas.openxmlformats.org/wordprocessingml/2006/main" xmlns:w14="http://schemas.microsoft.com/office/word/2010/wordml" xmlns:w15="http://schemas.microsoft.com/office/word/2012/wordml" xmlns:w16cex="http://schemas.microsoft.com/office/word/2018/wordml/cex" xmlns:w16cid="http://schemas.microsoft.com/office/word/2016/wordml/cid" xmlns:w16="http://schemas.microsoft.com/office/word/2018/wordml" xmlns:w16sdtdh="http://schemas.microsoft.com/office/word/2020/wordml/sdtdatahash" xmlns:w16se="http://schemas.microsoft.com/office/word/2015/wordml/symex" xmlns:wpg="http://schemas.microsoft.com/office/word/2010/wordprocessingGroup" xmlns:wpi="http://schemas.microsoft.com/office/word/2010/wordprocessingInk" xmlns:wne="http://schemas.microsoft.com/office/word/2006/wordml" xmlns:wps="http://schemas.microsoft.com/office/word/2010/wordprocessingShape" mc:Ignorable="w14 w15 w16se w16cid w16 w16cex w16sdtdh wp14">
+<w:ftr xmlns:wpc="http://schemas.microsoft.com/office/word/2010/wordprocessingCanvas" xmlns:cx="http://schemas.microsoft.com/office/drawing/2014/chartex" xmlns:cx1="http://schemas.microsoft.com/office/drawing/2015/9/8/chartex" xmlns:cx2="http://schemas.microsoft.com/office/drawing/2015/10/21/chartex" xmlns:cx3="http://schemas.microsoft.com/office/drawing/2016/5/9/chartex" xmlns:cx4="http://schemas.microsoft.com/office/drawing/2016/5/10/chartex" xmlns:cx5="http://schemas.microsoft.com/office/drawing/2016/5/11/chartex" xmlns:cx6="http://schemas.microsoft.com/office/drawing/2016/5/12/chartex" xmlns:cx7="http://schemas.microsoft.com/office/drawing/2016/5/13/chartex" xmlns:cx8="http://schemas.microsoft.com/office/drawing/2016/5/14/chartex" xmlns:mc="http://schemas.openxmlformats.org/markup-compatibility/2006" xmlns:aink="http://schemas.microsoft.com/office/drawing/2016/ink" xmlns:am3d="http://schemas.microsoft.com/office/drawing/2017/model3d" xmlns:o="urn:schemas-microsoft-com:office:office" xmlns:oel="http://schemas.microsoft.com/office/2019/extlst" xmlns:r="http://schemas.openxmlformats.org/officeDocument/2006/relationships" xmlns:m="http://schemas.openxmlformats.org/officeDocument/2006/math" xmlns:v="urn:schemas-microsoft-com:vml" xmlns:wp14="http://schemas.microsoft.com/office/word/2010/wordprocessingDrawing" xmlns:wp="http://schemas.openxmlformats.org/drawingml/2006/wordprocessingDrawing" xmlns:w10="urn:schemas-microsoft-com:office:word" xmlns:w="http://schemas.openxmlformats.org/wordprocessingml/2006/main" xmlns:w14="http://schemas.microsoft.com/office/word/2010/wordml" xmlns:w15="http://schemas.microsoft.com/office/word/2012/wordml" xmlns:w16cex="http://schemas.microsoft.com/office/word/2018/wordml/cex" xmlns:w16cid="http://schemas.microsoft.com/office/word/2016/wordml/cid" xmlns:w16="http://schemas.microsoft.com/office/word/2018/wordml" xmlns:w16du="http://schemas.microsoft.com/office/word/2023/wordml/word16du" xmlns:w16sdtdh="http://schemas.microsoft.com/office/word/2020/wordml/sdtdatahash" xmlns:w16sdtfl="http://schemas.microsoft.com/office/word/2024/wordml/sdtformatlock" xmlns:w16se="http://schemas.microsoft.com/office/word/2015/wordml/symex" xmlns:wpg="http://schemas.microsoft.com/office/word/2010/wordprocessingGroup" xmlns:wpi="http://schemas.microsoft.com/office/word/2010/wordprocessingInk" xmlns:wne="http://schemas.microsoft.com/office/word/2006/wordml" xmlns:wps="http://schemas.microsoft.com/office/word/2010/wordprocessingShape" mc:Ignorable="w14 w15 w16se w16cid w16 w16cex w16sdtdh w16sdtfl w16du wp14">
   <w:sdt>
     <w:sdtPr>
       <w:id w:val="111017779"/>
@@ -12812,7 +12739,6 @@
         <w:docPartUnique/>
       </w:docPartObj>
     </w:sdtPr>
-    <w:sdtEndPr/>
     <w:sdtContent>
       <w:p>
         <w:pPr>
@@ -12831,7 +12757,7 @@
 </file>
 
 <file path=word/footer2.xml><?xml version="1.0" encoding="utf-8"?>
-<w:ftr xmlns:wpc="http://schemas.microsoft.com/office/word/2010/wordprocessingCanvas" xmlns:cx="http://schemas.microsoft.com/office/drawing/2014/chartex" xmlns:cx1="http://schemas.microsoft.com/office/drawing/2015/9/8/chartex" xmlns:cx2="http://schemas.microsoft.com/office/drawing/2015/10/21/chartex" xmlns:cx3="http://schemas.microsoft.com/office/drawing/2016/5/9/chartex" xmlns:cx4="http://schemas.microsoft.com/office/drawing/2016/5/10/chartex" xmlns:cx5="http://schemas.microsoft.com/office/drawing/2016/5/11/chartex" xmlns:cx6="http://schemas.microsoft.com/office/drawing/2016/5/12/chartex" xmlns:cx7="http://schemas.microsoft.com/office/drawing/2016/5/13/chartex" xmlns:cx8="http://schemas.microsoft.com/office/drawing/2016/5/14/chartex" xmlns:mc="http://schemas.openxmlformats.org/markup-compatibility/2006" xmlns:aink="http://schemas.microsoft.com/office/drawing/2016/ink" xmlns:am3d="http://schemas.microsoft.com/office/drawing/2017/model3d" xmlns:o="urn:schemas-microsoft-com:office:office" xmlns:r="http://schemas.openxmlformats.org/officeDocument/2006/relationships" xmlns:m="http://schemas.openxmlformats.org/officeDocument/2006/math" xmlns:v="urn:schemas-microsoft-com:vml" xmlns:wp14="http://schemas.microsoft.com/office/word/2010/wordprocessingDrawing" xmlns:wp="http://schemas.openxmlformats.org/drawingml/2006/wordprocessingDrawing" xmlns:w10="urn:schemas-microsoft-com:office:word" xmlns:w="http://schemas.openxmlformats.org/wordprocessingml/2006/main" xmlns:w14="http://schemas.microsoft.com/office/word/2010/wordml" xmlns:w15="http://schemas.microsoft.com/office/word/2012/wordml" xmlns:w16cex="http://schemas.microsoft.com/office/word/2018/wordml/cex" xmlns:w16cid="http://schemas.microsoft.com/office/word/2016/wordml/cid" xmlns:w16="http://schemas.microsoft.com/office/word/2018/wordml" xmlns:w16sdtdh="http://schemas.microsoft.com/office/word/2020/wordml/sdtdatahash" xmlns:w16se="http://schemas.microsoft.com/office/word/2015/wordml/symex" xmlns:wpg="http://schemas.microsoft.com/office/word/2010/wordprocessingGroup" xmlns:wpi="http://schemas.microsoft.com/office/word/2010/wordprocessingInk" xmlns:wne="http://schemas.microsoft.com/office/word/2006/wordml" xmlns:wps="http://schemas.microsoft.com/office/word/2010/wordprocessingShape" mc:Ignorable="w14 w15 w16se w16cid w16 w16cex w16sdtdh wp14">
+<w:ftr xmlns:wpc="http://schemas.microsoft.com/office/word/2010/wordprocessingCanvas" xmlns:cx="http://schemas.microsoft.com/office/drawing/2014/chartex" xmlns:cx1="http://schemas.microsoft.com/office/drawing/2015/9/8/chartex" xmlns:cx2="http://schemas.microsoft.com/office/drawing/2015/10/21/chartex" xmlns:cx3="http://schemas.microsoft.com/office/drawing/2016/5/9/chartex" xmlns:cx4="http://schemas.microsoft.com/office/drawing/2016/5/10/chartex" xmlns:cx5="http://schemas.microsoft.com/office/drawing/2016/5/11/chartex" xmlns:cx6="http://schemas.microsoft.com/office/drawing/2016/5/12/chartex" xmlns:cx7="http://schemas.microsoft.com/office/drawing/2016/5/13/chartex" xmlns:cx8="http://schemas.microsoft.com/office/drawing/2016/5/14/chartex" xmlns:mc="http://schemas.openxmlformats.org/markup-compatibility/2006" xmlns:aink="http://schemas.microsoft.com/office/drawing/2016/ink" xmlns:am3d="http://schemas.microsoft.com/office/drawing/2017/model3d" xmlns:o="urn:schemas-microsoft-com:office:office" xmlns:oel="http://schemas.microsoft.com/office/2019/extlst" xmlns:r="http://schemas.openxmlformats.org/officeDocument/2006/relationships" xmlns:m="http://schemas.openxmlformats.org/officeDocument/2006/math" xmlns:v="urn:schemas-microsoft-com:vml" xmlns:wp14="http://schemas.microsoft.com/office/word/2010/wordprocessingDrawing" xmlns:wp="http://schemas.openxmlformats.org/drawingml/2006/wordprocessingDrawing" xmlns:w10="urn:schemas-microsoft-com:office:word" xmlns:w="http://schemas.openxmlformats.org/wordprocessingml/2006/main" xmlns:w14="http://schemas.microsoft.com/office/word/2010/wordml" xmlns:w15="http://schemas.microsoft.com/office/word/2012/wordml" xmlns:w16cex="http://schemas.microsoft.com/office/word/2018/wordml/cex" xmlns:w16cid="http://schemas.microsoft.com/office/word/2016/wordml/cid" xmlns:w16="http://schemas.microsoft.com/office/word/2018/wordml" xmlns:w16du="http://schemas.microsoft.com/office/word/2023/wordml/word16du" xmlns:w16sdtdh="http://schemas.microsoft.com/office/word/2020/wordml/sdtdatahash" xmlns:w16sdtfl="http://schemas.microsoft.com/office/word/2024/wordml/sdtformatlock" xmlns:w16se="http://schemas.microsoft.com/office/word/2015/wordml/symex" xmlns:wpg="http://schemas.microsoft.com/office/word/2010/wordprocessingGroup" xmlns:wpi="http://schemas.microsoft.com/office/word/2010/wordprocessingInk" xmlns:wne="http://schemas.microsoft.com/office/word/2006/wordml" xmlns:wps="http://schemas.microsoft.com/office/word/2010/wordprocessingShape" mc:Ignorable="w14 w15 w16se w16cid w16 w16cex w16sdtdh w16sdtfl w16du wp14">
   <w:sdt>
     <w:sdtPr>
       <w:id w:val="-1465197936"/>
@@ -12840,7 +12766,6 @@
         <w:docPartUnique/>
       </w:docPartObj>
     </w:sdtPr>
-    <w:sdtEndPr/>
     <w:sdtContent>
       <w:p>
         <w:pPr>
@@ -12935,7 +12860,7 @@
                   <v:stroke joinstyle="miter"/>
                   <v:path gradientshapeok="t" o:connecttype="rect"/>
                 </v:shapetype>
-                <v:shape id="_x0000_s1027" type="#_x0000_t202" alt="&quot;&quot;" style="position:absolute;left:0;text-align:left;margin-left:16.1pt;margin-top:.65pt;width:455.15pt;height:41.4pt;z-index:251661312;visibility:visible;mso-wrap-style:square;mso-width-percent:0;mso-height-percent:0;mso-wrap-distance-left:9pt;mso-wrap-distance-top:3.6pt;mso-wrap-distance-right:9pt;mso-wrap-distance-bottom:3.6pt;mso-position-horizontal:absolute;mso-position-horizontal-relative:text;mso-position-vertical:absolute;mso-position-vertical-relative:text;mso-width-percent:0;mso-height-percent:0;mso-width-relative:margin;mso-height-relative:margin;v-text-anchor:top" o:gfxdata="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" stroked="f">
+                <v:shape id="_x0000_s1027" type="#_x0000_t202" alt="&quot;&quot;" style="position:absolute;left:0;text-align:left;margin-left:16.1pt;margin-top:.65pt;width:455.15pt;height:41.4pt;z-index:251661312;visibility:visible;mso-wrap-style:square;mso-width-percent:0;mso-height-percent:0;mso-wrap-distance-left:9pt;mso-wrap-distance-top:3.6pt;mso-wrap-distance-right:9pt;mso-wrap-distance-bottom:3.6pt;mso-position-horizontal:absolute;mso-position-horizontal-relative:text;mso-position-vertical:absolute;mso-position-vertical-relative:text;mso-width-percent:0;mso-height-percent:0;mso-width-relative:margin;mso-height-relative:margin;v-text-anchor:top" o:gfxdata="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" stroked="f">
                   <v:textbox>
                     <w:txbxContent>
                       <w:p>
@@ -12986,7 +12911,7 @@
 </file>
 
 <file path=word/footnotes.xml><?xml version="1.0" encoding="utf-8"?>
-<w:footnotes xmlns:wpc="http://schemas.microsoft.com/office/word/2010/wordprocessingCanvas" xmlns:cx="http://schemas.microsoft.com/office/drawing/2014/chartex" xmlns:cx1="http://schemas.microsoft.com/office/drawing/2015/9/8/chartex" xmlns:cx2="http://schemas.microsoft.com/office/drawing/2015/10/21/chartex" xmlns:cx3="http://schemas.microsoft.com/office/drawing/2016/5/9/chartex" xmlns:cx4="http://schemas.microsoft.com/office/drawing/2016/5/10/chartex" xmlns:cx5="http://schemas.microsoft.com/office/drawing/2016/5/11/chartex" xmlns:cx6="http://schemas.microsoft.com/office/drawing/2016/5/12/chartex" xmlns:cx7="http://schemas.microsoft.com/office/drawing/2016/5/13/chartex" xmlns:cx8="http://schemas.microsoft.com/office/drawing/2016/5/14/chartex" xmlns:mc="http://schemas.openxmlformats.org/markup-compatibility/2006" xmlns:aink="http://schemas.microsoft.com/office/drawing/2016/ink" xmlns:am3d="http://schemas.microsoft.com/office/drawing/2017/model3d" xmlns:o="urn:schemas-microsoft-com:office:office" xmlns:r="http://schemas.openxmlformats.org/officeDocument/2006/relationships" xmlns:m="http://schemas.openxmlformats.org/officeDocument/2006/math" xmlns:v="urn:schemas-microsoft-com:vml" xmlns:wp14="http://schemas.microsoft.com/office/word/2010/wordprocessingDrawing" xmlns:wp="http://schemas.openxmlformats.org/drawingml/2006/wordprocessingDrawing" xmlns:w10="urn:schemas-microsoft-com:office:word" xmlns:w="http://schemas.openxmlformats.org/wordprocessingml/2006/main" xmlns:w14="http://schemas.microsoft.com/office/word/2010/wordml" xmlns:w15="http://schemas.microsoft.com/office/word/2012/wordml" xmlns:w16cex="http://schemas.microsoft.com/office/word/2018/wordml/cex" xmlns:w16cid="http://schemas.microsoft.com/office/word/2016/wordml/cid" xmlns:w16="http://schemas.microsoft.com/office/word/2018/wordml" xmlns:w16sdtdh="http://schemas.microsoft.com/office/word/2020/wordml/sdtdatahash" xmlns:w16se="http://schemas.microsoft.com/office/word/2015/wordml/symex" xmlns:wpg="http://schemas.microsoft.com/office/word/2010/wordprocessingGroup" xmlns:wpi="http://schemas.microsoft.com/office/word/2010/wordprocessingInk" xmlns:wne="http://schemas.microsoft.com/office/word/2006/wordml" xmlns:wps="http://schemas.microsoft.com/office/word/2010/wordprocessingShape" mc:Ignorable="w14 w15 w16se w16cid w16 w16cex w16sdtdh wp14">
+<w:footnotes xmlns:wpc="http://schemas.microsoft.com/office/word/2010/wordprocessingCanvas" xmlns:cx="http://schemas.microsoft.com/office/drawing/2014/chartex" xmlns:cx1="http://schemas.microsoft.com/office/drawing/2015/9/8/chartex" xmlns:cx2="http://schemas.microsoft.com/office/drawing/2015/10/21/chartex" xmlns:cx3="http://schemas.microsoft.com/office/drawing/2016/5/9/chartex" xmlns:cx4="http://schemas.microsoft.com/office/drawing/2016/5/10/chartex" xmlns:cx5="http://schemas.microsoft.com/office/drawing/2016/5/11/chartex" xmlns:cx6="http://schemas.microsoft.com/office/drawing/2016/5/12/chartex" xmlns:cx7="http://schemas.microsoft.com/office/drawing/2016/5/13/chartex" xmlns:cx8="http://schemas.microsoft.com/office/drawing/2016/5/14/chartex" xmlns:mc="http://schemas.openxmlformats.org/markup-compatibility/2006" xmlns:aink="http://schemas.microsoft.com/office/drawing/2016/ink" xmlns:am3d="http://schemas.microsoft.com/office/drawing/2017/model3d" xmlns:o="urn:schemas-microsoft-com:office:office" xmlns:oel="http://schemas.microsoft.com/office/2019/extlst" xmlns:r="http://schemas.openxmlformats.org/officeDocument/2006/relationships" xmlns:m="http://schemas.openxmlformats.org/officeDocument/2006/math" xmlns:v="urn:schemas-microsoft-com:vml" xmlns:wp14="http://schemas.microsoft.com/office/word/2010/wordprocessingDrawing" xmlns:wp="http://schemas.openxmlformats.org/drawingml/2006/wordprocessingDrawing" xmlns:w10="urn:schemas-microsoft-com:office:word" xmlns:w="http://schemas.openxmlformats.org/wordprocessingml/2006/main" xmlns:w14="http://schemas.microsoft.com/office/word/2010/wordml" xmlns:w15="http://schemas.microsoft.com/office/word/2012/wordml" xmlns:w16cex="http://schemas.microsoft.com/office/word/2018/wordml/cex" xmlns:w16cid="http://schemas.microsoft.com/office/word/2016/wordml/cid" xmlns:w16="http://schemas.microsoft.com/office/word/2018/wordml" xmlns:w16du="http://schemas.microsoft.com/office/word/2023/wordml/word16du" xmlns:w16sdtdh="http://schemas.microsoft.com/office/word/2020/wordml/sdtdatahash" xmlns:w16sdtfl="http://schemas.microsoft.com/office/word/2024/wordml/sdtformatlock" xmlns:w16se="http://schemas.microsoft.com/office/word/2015/wordml/symex" xmlns:wpg="http://schemas.microsoft.com/office/word/2010/wordprocessingGroup" xmlns:wpi="http://schemas.microsoft.com/office/word/2010/wordprocessingInk" xmlns:wne="http://schemas.microsoft.com/office/word/2006/wordml" xmlns:wps="http://schemas.microsoft.com/office/word/2010/wordprocessingShape" mc:Ignorable="w14 w15 w16se w16cid w16 w16cex w16sdtdh w16sdtfl w16du wp14">
   <w:footnote w:type="separator" w:id="-1">
     <w:p>
       <w:pPr>
@@ -13011,7 +12936,7 @@
 </file>
 
 <file path=word/header1.xml><?xml version="1.0" encoding="utf-8"?>
-<w:hdr xmlns:wpc="http://schemas.microsoft.com/office/word/2010/wordprocessingCanvas" xmlns:cx="http://schemas.microsoft.com/office/drawing/2014/chartex" xmlns:cx1="http://schemas.microsoft.com/office/drawing/2015/9/8/chartex" xmlns:cx2="http://schemas.microsoft.com/office/drawing/2015/10/21/chartex" xmlns:cx3="http://schemas.microsoft.com/office/drawing/2016/5/9/chartex" xmlns:cx4="http://schemas.microsoft.com/office/drawing/2016/5/10/chartex" xmlns:cx5="http://schemas.microsoft.com/office/drawing/2016/5/11/chartex" xmlns:cx6="http://schemas.microsoft.com/office/drawing/2016/5/12/chartex" xmlns:cx7="http://schemas.microsoft.com/office/drawing/2016/5/13/chartex" xmlns:cx8="http://schemas.microsoft.com/office/drawing/2016/5/14/chartex" xmlns:mc="http://schemas.openxmlformats.org/markup-compatibility/2006" xmlns:aink="http://schemas.microsoft.com/office/drawing/2016/ink" xmlns:am3d="http://schemas.microsoft.com/office/drawing/2017/model3d" xmlns:o="urn:schemas-microsoft-com:office:office" xmlns:r="http://schemas.openxmlformats.org/officeDocument/2006/relationships" xmlns:m="http://schemas.openxmlformats.org/officeDocument/2006/math" xmlns:v="urn:schemas-microsoft-com:vml" xmlns:wp14="http://schemas.microsoft.com/office/word/2010/wordprocessingDrawing" xmlns:wp="http://schemas.openxmlformats.org/drawingml/2006/wordprocessingDrawing" xmlns:w10="urn:schemas-microsoft-com:office:word" xmlns:w="http://schemas.openxmlformats.org/wordprocessingml/2006/main" xmlns:w14="http://schemas.microsoft.com/office/word/2010/wordml" xmlns:w15="http://schemas.microsoft.com/office/word/2012/wordml" xmlns:w16cex="http://schemas.microsoft.com/office/word/2018/wordml/cex" xmlns:w16cid="http://schemas.microsoft.com/office/word/2016/wordml/cid" xmlns:w16="http://schemas.microsoft.com/office/word/2018/wordml" xmlns:w16sdtdh="http://schemas.microsoft.com/office/word/2020/wordml/sdtdatahash" xmlns:w16se="http://schemas.microsoft.com/office/word/2015/wordml/symex" xmlns:wpg="http://schemas.microsoft.com/office/word/2010/wordprocessingGroup" xmlns:wpi="http://schemas.microsoft.com/office/word/2010/wordprocessingInk" xmlns:wne="http://schemas.microsoft.com/office/word/2006/wordml" xmlns:wps="http://schemas.microsoft.com/office/word/2010/wordprocessingShape" mc:Ignorable="w14 w15 w16se w16cid w16 w16cex w16sdtdh wp14">
+<w:hdr xmlns:wpc="http://schemas.microsoft.com/office/word/2010/wordprocessingCanvas" xmlns:cx="http://schemas.microsoft.com/office/drawing/2014/chartex" xmlns:cx1="http://schemas.microsoft.com/office/drawing/2015/9/8/chartex" xmlns:cx2="http://schemas.microsoft.com/office/drawing/2015/10/21/chartex" xmlns:cx3="http://schemas.microsoft.com/office/drawing/2016/5/9/chartex" xmlns:cx4="http://schemas.microsoft.com/office/drawing/2016/5/10/chartex" xmlns:cx5="http://schemas.microsoft.com/office/drawing/2016/5/11/chartex" xmlns:cx6="http://schemas.microsoft.com/office/drawing/2016/5/12/chartex" xmlns:cx7="http://schemas.microsoft.com/office/drawing/2016/5/13/chartex" xmlns:cx8="http://schemas.microsoft.com/office/drawing/2016/5/14/chartex" xmlns:mc="http://schemas.openxmlformats.org/markup-compatibility/2006" xmlns:aink="http://schemas.microsoft.com/office/drawing/2016/ink" xmlns:am3d="http://schemas.microsoft.com/office/drawing/2017/model3d" xmlns:o="urn:schemas-microsoft-com:office:office" xmlns:oel="http://schemas.microsoft.com/office/2019/extlst" xmlns:r="http://schemas.openxmlformats.org/officeDocument/2006/relationships" xmlns:m="http://schemas.openxmlformats.org/officeDocument/2006/math" xmlns:v="urn:schemas-microsoft-com:vml" xmlns:wp14="http://schemas.microsoft.com/office/word/2010/wordprocessingDrawing" xmlns:wp="http://schemas.openxmlformats.org/drawingml/2006/wordprocessingDrawing" xmlns:w10="urn:schemas-microsoft-com:office:word" xmlns:w="http://schemas.openxmlformats.org/wordprocessingml/2006/main" xmlns:w14="http://schemas.microsoft.com/office/word/2010/wordml" xmlns:w15="http://schemas.microsoft.com/office/word/2012/wordml" xmlns:w16cex="http://schemas.microsoft.com/office/word/2018/wordml/cex" xmlns:w16cid="http://schemas.microsoft.com/office/word/2016/wordml/cid" xmlns:w16="http://schemas.microsoft.com/office/word/2018/wordml" xmlns:w16du="http://schemas.microsoft.com/office/word/2023/wordml/word16du" xmlns:w16sdtdh="http://schemas.microsoft.com/office/word/2020/wordml/sdtdatahash" xmlns:w16sdtfl="http://schemas.microsoft.com/office/word/2024/wordml/sdtformatlock" xmlns:w16se="http://schemas.microsoft.com/office/word/2015/wordml/symex" xmlns:wpg="http://schemas.microsoft.com/office/word/2010/wordprocessingGroup" xmlns:wpi="http://schemas.microsoft.com/office/word/2010/wordprocessingInk" xmlns:wne="http://schemas.microsoft.com/office/word/2006/wordml" xmlns:wps="http://schemas.microsoft.com/office/word/2010/wordprocessingShape" mc:Ignorable="w14 w15 w16se w16cid w16 w16cex w16sdtdh w16sdtfl w16du wp14">
   <w:p>
     <w:pPr>
       <w:pStyle w:val="Encabezado"/>
@@ -13097,7 +13022,7 @@
 </file>
 
 <file path=word/numbering.xml><?xml version="1.0" encoding="utf-8"?>
-<w:numbering xmlns:wpc="http://schemas.microsoft.com/office/word/2010/wordprocessingCanvas" xmlns:cx="http://schemas.microsoft.com/office/drawing/2014/chartex" xmlns:cx1="http://schemas.microsoft.com/office/drawing/2015/9/8/chartex" xmlns:cx2="http://schemas.microsoft.com/office/drawing/2015/10/21/chartex" xmlns:cx3="http://schemas.microsoft.com/office/drawing/2016/5/9/chartex" xmlns:cx4="http://schemas.microsoft.com/office/drawing/2016/5/10/chartex" xmlns:cx5="http://schemas.microsoft.com/office/drawing/2016/5/11/chartex" xmlns:cx6="http://schemas.microsoft.com/office/drawing/2016/5/12/chartex" xmlns:cx7="http://schemas.microsoft.com/office/drawing/2016/5/13/chartex" xmlns:cx8="http://schemas.microsoft.com/office/drawing/2016/5/14/chartex" xmlns:mc="http://schemas.openxmlformats.org/markup-compatibility/2006" xmlns:aink="http://schemas.microsoft.com/office/drawing/2016/ink" xmlns:am3d="http://schemas.microsoft.com/office/drawing/2017/model3d" xmlns:o="urn:schemas-microsoft-com:office:office" xmlns:r="http://schemas.openxmlformats.org/officeDocument/2006/relationships" xmlns:m="http://schemas.openxmlformats.org/officeDocument/2006/math" xmlns:v="urn:schemas-microsoft-com:vml" xmlns:wp14="http://schemas.microsoft.com/office/word/2010/wordprocessingDrawing" xmlns:wp="http://schemas.openxmlformats.org/drawingml/2006/wordprocessingDrawing" xmlns:w10="urn:schemas-microsoft-com:office:word" xmlns:w="http://schemas.openxmlformats.org/wordprocessingml/2006/main" xmlns:w14="http://schemas.microsoft.com/office/word/2010/wordml" xmlns:w15="http://schemas.microsoft.com/office/word/2012/wordml" xmlns:w16cex="http://schemas.microsoft.com/office/word/2018/wordml/cex" xmlns:w16cid="http://schemas.microsoft.com/office/word/2016/wordml/cid" xmlns:w16="http://schemas.microsoft.com/office/word/2018/wordml" xmlns:w16sdtdh="http://schemas.microsoft.com/office/word/2020/wordml/sdtdatahash" xmlns:w16se="http://schemas.microsoft.com/office/word/2015/wordml/symex" xmlns:wpg="http://schemas.microsoft.com/office/word/2010/wordprocessingGroup" xmlns:wpi="http://schemas.microsoft.com/office/word/2010/wordprocessingInk" xmlns:wne="http://schemas.microsoft.com/office/word/2006/wordml" xmlns:wps="http://schemas.microsoft.com/office/word/2010/wordprocessingShape" mc:Ignorable="w14 w15 w16se w16cid w16 w16cex w16sdtdh wp14">
+<w:numbering xmlns:wpc="http://schemas.microsoft.com/office/word/2010/wordprocessingCanvas" xmlns:cx="http://schemas.microsoft.com/office/drawing/2014/chartex" xmlns:cx1="http://schemas.microsoft.com/office/drawing/2015/9/8/chartex" xmlns:cx2="http://schemas.microsoft.com/office/drawing/2015/10/21/chartex" xmlns:cx3="http://schemas.microsoft.com/office/drawing/2016/5/9/chartex" xmlns:cx4="http://schemas.microsoft.com/office/drawing/2016/5/10/chartex" xmlns:cx5="http://schemas.microsoft.com/office/drawing/2016/5/11/chartex" xmlns:cx6="http://schemas.microsoft.com/office/drawing/2016/5/12/chartex" xmlns:cx7="http://schemas.microsoft.com/office/drawing/2016/5/13/chartex" xmlns:cx8="http://schemas.microsoft.com/office/drawing/2016/5/14/chartex" xmlns:mc="http://schemas.openxmlformats.org/markup-compatibility/2006" xmlns:aink="http://schemas.microsoft.com/office/drawing/2016/ink" xmlns:am3d="http://schemas.microsoft.com/office/drawing/2017/model3d" xmlns:o="urn:schemas-microsoft-com:office:office" xmlns:oel="http://schemas.microsoft.com/office/2019/extlst" xmlns:r="http://schemas.openxmlformats.org/officeDocument/2006/relationships" xmlns:m="http://schemas.openxmlformats.org/officeDocument/2006/math" xmlns:v="urn:schemas-microsoft-com:vml" xmlns:wp14="http://schemas.microsoft.com/office/word/2010/wordprocessingDrawing" xmlns:wp="http://schemas.openxmlformats.org/drawingml/2006/wordprocessingDrawing" xmlns:w10="urn:schemas-microsoft-com:office:word" xmlns:w="http://schemas.openxmlformats.org/wordprocessingml/2006/main" xmlns:w14="http://schemas.microsoft.com/office/word/2010/wordml" xmlns:w15="http://schemas.microsoft.com/office/word/2012/wordml" xmlns:w16cex="http://schemas.microsoft.com/office/word/2018/wordml/cex" xmlns:w16cid="http://schemas.microsoft.com/office/word/2016/wordml/cid" xmlns:w16="http://schemas.microsoft.com/office/word/2018/wordml" xmlns:w16du="http://schemas.microsoft.com/office/word/2023/wordml/word16du" xmlns:w16sdtdh="http://schemas.microsoft.com/office/word/2020/wordml/sdtdatahash" xmlns:w16sdtfl="http://schemas.microsoft.com/office/word/2024/wordml/sdtformatlock" xmlns:w16se="http://schemas.microsoft.com/office/word/2015/wordml/symex" xmlns:wpg="http://schemas.microsoft.com/office/word/2010/wordprocessingGroup" xmlns:wpi="http://schemas.microsoft.com/office/word/2010/wordprocessingInk" xmlns:wne="http://schemas.microsoft.com/office/word/2006/wordml" xmlns:wps="http://schemas.microsoft.com/office/word/2010/wordprocessingShape" mc:Ignorable="w14 w15 w16se w16cid w16 w16cex w16sdtdh w16sdtfl w16du wp14">
   <w:numPicBullet w:numPicBulletId="0">
     <w:pict>
       <v:shapetype id="_x0000_t75" coordsize="21600,21600" o:spt="75" o:preferrelative="t" path="m@4@5l@4@11@9@11@9@5xe" filled="f" stroked="f">
@@ -13119,7 +13044,7 @@
         <v:path o:extrusionok="f" gradientshapeok="t" o:connecttype="rect"/>
         <o:lock v:ext="edit" aspectratio="t"/>
       </v:shapetype>
-      <v:shape id="_x0000_i1049" type="#_x0000_t75" style="width:10.9pt;height:10.9pt" o:bullet="t">
+      <v:shape id="_x0000_i1072" type="#_x0000_t75" style="width:11pt;height:11pt" o:bullet="t">
         <v:imagedata r:id="rId1" o:title="mso428E"/>
       </v:shape>
     </w:pict>
@@ -15729,6 +15654,232 @@
     </w:lvl>
   </w:abstractNum>
   <w:abstractNum w:abstractNumId="25" w15:restartNumberingAfterBreak="0">
+    <w:nsid w:val="6A43667A"/>
+    <w:multiLevelType w:val="hybridMultilevel"/>
+    <w:tmpl w:val="63B0B460"/>
+    <w:lvl w:ilvl="0" w:tplc="080A0001">
+      <w:start w:val="1"/>
+      <w:numFmt w:val="bullet"/>
+      <w:lvlText w:val=""/>
+      <w:lvlJc w:val="left"/>
+      <w:pPr>
+        <w:ind w:left="1429" w:hanging="360"/>
+      </w:pPr>
+      <w:rPr>
+        <w:rFonts w:ascii="Symbol" w:hAnsi="Symbol" w:hint="default"/>
+      </w:rPr>
+    </w:lvl>
+    <w:lvl w:ilvl="1" w:tplc="080A0003" w:tentative="1">
+      <w:start w:val="1"/>
+      <w:numFmt w:val="bullet"/>
+      <w:lvlText w:val="o"/>
+      <w:lvlJc w:val="left"/>
+      <w:pPr>
+        <w:ind w:left="2149" w:hanging="360"/>
+      </w:pPr>
+      <w:rPr>
+        <w:rFonts w:ascii="Courier New" w:hAnsi="Courier New" w:cs="Courier New" w:hint="default"/>
+      </w:rPr>
+    </w:lvl>
+    <w:lvl w:ilvl="2" w:tplc="080A0005" w:tentative="1">
+      <w:start w:val="1"/>
+      <w:numFmt w:val="bullet"/>
+      <w:lvlText w:val=""/>
+      <w:lvlJc w:val="left"/>
+      <w:pPr>
+        <w:ind w:left="2869" w:hanging="360"/>
+      </w:pPr>
+      <w:rPr>
+        <w:rFonts w:ascii="Wingdings" w:hAnsi="Wingdings" w:hint="default"/>
+      </w:rPr>
+    </w:lvl>
+    <w:lvl w:ilvl="3" w:tplc="080A0001" w:tentative="1">
+      <w:start w:val="1"/>
+      <w:numFmt w:val="bullet"/>
+      <w:lvlText w:val=""/>
+      <w:lvlJc w:val="left"/>
+      <w:pPr>
+        <w:ind w:left="3589" w:hanging="360"/>
+      </w:pPr>
+      <w:rPr>
+        <w:rFonts w:ascii="Symbol" w:hAnsi="Symbol" w:hint="default"/>
+      </w:rPr>
+    </w:lvl>
+    <w:lvl w:ilvl="4" w:tplc="080A0003" w:tentative="1">
+      <w:start w:val="1"/>
+      <w:numFmt w:val="bullet"/>
+      <w:lvlText w:val="o"/>
+      <w:lvlJc w:val="left"/>
+      <w:pPr>
+        <w:ind w:left="4309" w:hanging="360"/>
+      </w:pPr>
+      <w:rPr>
+        <w:rFonts w:ascii="Courier New" w:hAnsi="Courier New" w:cs="Courier New" w:hint="default"/>
+      </w:rPr>
+    </w:lvl>
+    <w:lvl w:ilvl="5" w:tplc="080A0005" w:tentative="1">
+      <w:start w:val="1"/>
+      <w:numFmt w:val="bullet"/>
+      <w:lvlText w:val=""/>
+      <w:lvlJc w:val="left"/>
+      <w:pPr>
+        <w:ind w:left="5029" w:hanging="360"/>
+      </w:pPr>
+      <w:rPr>
+        <w:rFonts w:ascii="Wingdings" w:hAnsi="Wingdings" w:hint="default"/>
+      </w:rPr>
+    </w:lvl>
+    <w:lvl w:ilvl="6" w:tplc="080A0001" w:tentative="1">
+      <w:start w:val="1"/>
+      <w:numFmt w:val="bullet"/>
+      <w:lvlText w:val=""/>
+      <w:lvlJc w:val="left"/>
+      <w:pPr>
+        <w:ind w:left="5749" w:hanging="360"/>
+      </w:pPr>
+      <w:rPr>
+        <w:rFonts w:ascii="Symbol" w:hAnsi="Symbol" w:hint="default"/>
+      </w:rPr>
+    </w:lvl>
+    <w:lvl w:ilvl="7" w:tplc="080A0003" w:tentative="1">
+      <w:start w:val="1"/>
+      <w:numFmt w:val="bullet"/>
+      <w:lvlText w:val="o"/>
+      <w:lvlJc w:val="left"/>
+      <w:pPr>
+        <w:ind w:left="6469" w:hanging="360"/>
+      </w:pPr>
+      <w:rPr>
+        <w:rFonts w:ascii="Courier New" w:hAnsi="Courier New" w:cs="Courier New" w:hint="default"/>
+      </w:rPr>
+    </w:lvl>
+    <w:lvl w:ilvl="8" w:tplc="080A0005" w:tentative="1">
+      <w:start w:val="1"/>
+      <w:numFmt w:val="bullet"/>
+      <w:lvlText w:val=""/>
+      <w:lvlJc w:val="left"/>
+      <w:pPr>
+        <w:ind w:left="7189" w:hanging="360"/>
+      </w:pPr>
+      <w:rPr>
+        <w:rFonts w:ascii="Wingdings" w:hAnsi="Wingdings" w:hint="default"/>
+      </w:rPr>
+    </w:lvl>
+  </w:abstractNum>
+  <w:abstractNum w:abstractNumId="26" w15:restartNumberingAfterBreak="0">
+    <w:nsid w:val="6FA72DB8"/>
+    <w:multiLevelType w:val="hybridMultilevel"/>
+    <w:tmpl w:val="1AE62DC0"/>
+    <w:lvl w:ilvl="0" w:tplc="080A0001">
+      <w:start w:val="1"/>
+      <w:numFmt w:val="bullet"/>
+      <w:lvlText w:val=""/>
+      <w:lvlJc w:val="left"/>
+      <w:pPr>
+        <w:ind w:left="1429" w:hanging="360"/>
+      </w:pPr>
+      <w:rPr>
+        <w:rFonts w:ascii="Symbol" w:hAnsi="Symbol" w:hint="default"/>
+      </w:rPr>
+    </w:lvl>
+    <w:lvl w:ilvl="1" w:tplc="080A0003" w:tentative="1">
+      <w:start w:val="1"/>
+      <w:numFmt w:val="bullet"/>
+      <w:lvlText w:val="o"/>
+      <w:lvlJc w:val="left"/>
+      <w:pPr>
+        <w:ind w:left="2149" w:hanging="360"/>
+      </w:pPr>
+      <w:rPr>
+        <w:rFonts w:ascii="Courier New" w:hAnsi="Courier New" w:cs="Courier New" w:hint="default"/>
+      </w:rPr>
+    </w:lvl>
+    <w:lvl w:ilvl="2" w:tplc="080A0005" w:tentative="1">
+      <w:start w:val="1"/>
+      <w:numFmt w:val="bullet"/>
+      <w:lvlText w:val=""/>
+      <w:lvlJc w:val="left"/>
+      <w:pPr>
+        <w:ind w:left="2869" w:hanging="360"/>
+      </w:pPr>
+      <w:rPr>
+        <w:rFonts w:ascii="Wingdings" w:hAnsi="Wingdings" w:hint="default"/>
+      </w:rPr>
+    </w:lvl>
+    <w:lvl w:ilvl="3" w:tplc="080A0001" w:tentative="1">
+      <w:start w:val="1"/>
+      <w:numFmt w:val="bullet"/>
+      <w:lvlText w:val=""/>
+      <w:lvlJc w:val="left"/>
+      <w:pPr>
+        <w:ind w:left="3589" w:hanging="360"/>
+      </w:pPr>
+      <w:rPr>
+        <w:rFonts w:ascii="Symbol" w:hAnsi="Symbol" w:hint="default"/>
+      </w:rPr>
+    </w:lvl>
+    <w:lvl w:ilvl="4" w:tplc="080A0003" w:tentative="1">
+      <w:start w:val="1"/>
+      <w:numFmt w:val="bullet"/>
+      <w:lvlText w:val="o"/>
+      <w:lvlJc w:val="left"/>
+      <w:pPr>
+        <w:ind w:left="4309" w:hanging="360"/>
+      </w:pPr>
+      <w:rPr>
+        <w:rFonts w:ascii="Courier New" w:hAnsi="Courier New" w:cs="Courier New" w:hint="default"/>
+      </w:rPr>
+    </w:lvl>
+    <w:lvl w:ilvl="5" w:tplc="080A0005" w:tentative="1">
+      <w:start w:val="1"/>
+      <w:numFmt w:val="bullet"/>
+      <w:lvlText w:val=""/>
+      <w:lvlJc w:val="left"/>
+      <w:pPr>
+        <w:ind w:left="5029" w:hanging="360"/>
+      </w:pPr>
+      <w:rPr>
+        <w:rFonts w:ascii="Wingdings" w:hAnsi="Wingdings" w:hint="default"/>
+      </w:rPr>
+    </w:lvl>
+    <w:lvl w:ilvl="6" w:tplc="080A0001" w:tentative="1">
+      <w:start w:val="1"/>
+      <w:numFmt w:val="bullet"/>
+      <w:lvlText w:val=""/>
+      <w:lvlJc w:val="left"/>
+      <w:pPr>
+        <w:ind w:left="5749" w:hanging="360"/>
+      </w:pPr>
+      <w:rPr>
+        <w:rFonts w:ascii="Symbol" w:hAnsi="Symbol" w:hint="default"/>
+      </w:rPr>
+    </w:lvl>
+    <w:lvl w:ilvl="7" w:tplc="080A0003" w:tentative="1">
+      <w:start w:val="1"/>
+      <w:numFmt w:val="bullet"/>
+      <w:lvlText w:val="o"/>
+      <w:lvlJc w:val="left"/>
+      <w:pPr>
+        <w:ind w:left="6469" w:hanging="360"/>
+      </w:pPr>
+      <w:rPr>
+        <w:rFonts w:ascii="Courier New" w:hAnsi="Courier New" w:cs="Courier New" w:hint="default"/>
+      </w:rPr>
+    </w:lvl>
+    <w:lvl w:ilvl="8" w:tplc="080A0005" w:tentative="1">
+      <w:start w:val="1"/>
+      <w:numFmt w:val="bullet"/>
+      <w:lvlText w:val=""/>
+      <w:lvlJc w:val="left"/>
+      <w:pPr>
+        <w:ind w:left="7189" w:hanging="360"/>
+      </w:pPr>
+      <w:rPr>
+        <w:rFonts w:ascii="Wingdings" w:hAnsi="Wingdings" w:hint="default"/>
+      </w:rPr>
+    </w:lvl>
+  </w:abstractNum>
+  <w:abstractNum w:abstractNumId="27" w15:restartNumberingAfterBreak="0">
     <w:nsid w:val="709E24DB"/>
     <w:multiLevelType w:val="hybridMultilevel"/>
     <w:tmpl w:val="41884BA6"/>
@@ -15843,7 +15994,7 @@
       </w:pPr>
     </w:lvl>
   </w:abstractNum>
-  <w:abstractNum w:abstractNumId="26" w15:restartNumberingAfterBreak="0">
+  <w:abstractNum w:abstractNumId="28" w15:restartNumberingAfterBreak="0">
     <w:nsid w:val="7C161D1C"/>
     <w:multiLevelType w:val="multilevel"/>
     <w:tmpl w:val="476430D0"/>
@@ -15978,93 +16129,99 @@
       </w:pPr>
     </w:lvl>
   </w:abstractNum>
-  <w:num w:numId="1">
+  <w:num w:numId="1" w16cid:durableId="2062556235">
+    <w:abstractNumId w:val="28"/>
+  </w:num>
+  <w:num w:numId="2" w16cid:durableId="1774544297">
+    <w:abstractNumId w:val="0"/>
+  </w:num>
+  <w:num w:numId="3" w16cid:durableId="689917536">
+    <w:abstractNumId w:val="8"/>
+  </w:num>
+  <w:num w:numId="4" w16cid:durableId="168982981">
+    <w:abstractNumId w:val="22"/>
+  </w:num>
+  <w:num w:numId="5" w16cid:durableId="6911432">
+    <w:abstractNumId w:val="12"/>
+  </w:num>
+  <w:num w:numId="6" w16cid:durableId="1862012078">
+    <w:abstractNumId w:val="4"/>
+  </w:num>
+  <w:num w:numId="7" w16cid:durableId="1480996600">
+    <w:abstractNumId w:val="27"/>
+  </w:num>
+  <w:num w:numId="8" w16cid:durableId="2143190587">
+    <w:abstractNumId w:val="16"/>
+  </w:num>
+  <w:num w:numId="9" w16cid:durableId="402415513">
+    <w:abstractNumId w:val="2"/>
+  </w:num>
+  <w:num w:numId="10" w16cid:durableId="1915435373">
+    <w:abstractNumId w:val="9"/>
+  </w:num>
+  <w:num w:numId="11" w16cid:durableId="519468618">
+    <w:abstractNumId w:val="3"/>
+  </w:num>
+  <w:num w:numId="12" w16cid:durableId="1191186568">
+    <w:abstractNumId w:val="23"/>
+  </w:num>
+  <w:num w:numId="13" w16cid:durableId="1867015344">
+    <w:abstractNumId w:val="13"/>
+  </w:num>
+  <w:num w:numId="14" w16cid:durableId="722683054">
+    <w:abstractNumId w:val="7"/>
+  </w:num>
+  <w:num w:numId="15" w16cid:durableId="1201750437">
+    <w:abstractNumId w:val="24"/>
+  </w:num>
+  <w:num w:numId="16" w16cid:durableId="101339007">
+    <w:abstractNumId w:val="15"/>
+  </w:num>
+  <w:num w:numId="17" w16cid:durableId="600572283">
+    <w:abstractNumId w:val="14"/>
+  </w:num>
+  <w:num w:numId="18" w16cid:durableId="307630227">
+    <w:abstractNumId w:val="18"/>
+  </w:num>
+  <w:num w:numId="19" w16cid:durableId="2030719154">
+    <w:abstractNumId w:val="21"/>
+  </w:num>
+  <w:num w:numId="20" w16cid:durableId="1753966444">
+    <w:abstractNumId w:val="1"/>
+  </w:num>
+  <w:num w:numId="21" w16cid:durableId="1034114752">
+    <w:abstractNumId w:val="10"/>
+  </w:num>
+  <w:num w:numId="22" w16cid:durableId="102117732">
+    <w:abstractNumId w:val="19"/>
+  </w:num>
+  <w:num w:numId="23" w16cid:durableId="120658977">
+    <w:abstractNumId w:val="20"/>
+  </w:num>
+  <w:num w:numId="24" w16cid:durableId="276839305">
+    <w:abstractNumId w:val="17"/>
+  </w:num>
+  <w:num w:numId="25" w16cid:durableId="1780639559">
+    <w:abstractNumId w:val="5"/>
+  </w:num>
+  <w:num w:numId="26" w16cid:durableId="1241990581">
+    <w:abstractNumId w:val="6"/>
+  </w:num>
+  <w:num w:numId="27" w16cid:durableId="1612199075">
+    <w:abstractNumId w:val="11"/>
+  </w:num>
+  <w:num w:numId="28" w16cid:durableId="995183012">
     <w:abstractNumId w:val="26"/>
   </w:num>
-  <w:num w:numId="2">
-    <w:abstractNumId w:val="0"/>
-  </w:num>
-  <w:num w:numId="3">
-    <w:abstractNumId w:val="8"/>
-  </w:num>
-  <w:num w:numId="4">
-    <w:abstractNumId w:val="22"/>
-  </w:num>
-  <w:num w:numId="5">
-    <w:abstractNumId w:val="12"/>
-  </w:num>
-  <w:num w:numId="6">
-    <w:abstractNumId w:val="4"/>
-  </w:num>
-  <w:num w:numId="7">
+  <w:num w:numId="29" w16cid:durableId="989671399">
     <w:abstractNumId w:val="25"/>
-  </w:num>
-  <w:num w:numId="8">
-    <w:abstractNumId w:val="16"/>
-  </w:num>
-  <w:num w:numId="9">
-    <w:abstractNumId w:val="2"/>
-  </w:num>
-  <w:num w:numId="10">
-    <w:abstractNumId w:val="9"/>
-  </w:num>
-  <w:num w:numId="11">
-    <w:abstractNumId w:val="3"/>
-  </w:num>
-  <w:num w:numId="12">
-    <w:abstractNumId w:val="23"/>
-  </w:num>
-  <w:num w:numId="13">
-    <w:abstractNumId w:val="13"/>
-  </w:num>
-  <w:num w:numId="14">
-    <w:abstractNumId w:val="7"/>
-  </w:num>
-  <w:num w:numId="15">
-    <w:abstractNumId w:val="24"/>
-  </w:num>
-  <w:num w:numId="16">
-    <w:abstractNumId w:val="15"/>
-  </w:num>
-  <w:num w:numId="17">
-    <w:abstractNumId w:val="14"/>
-  </w:num>
-  <w:num w:numId="18">
-    <w:abstractNumId w:val="18"/>
-  </w:num>
-  <w:num w:numId="19">
-    <w:abstractNumId w:val="21"/>
-  </w:num>
-  <w:num w:numId="20">
-    <w:abstractNumId w:val="1"/>
-  </w:num>
-  <w:num w:numId="21">
-    <w:abstractNumId w:val="10"/>
-  </w:num>
-  <w:num w:numId="22">
-    <w:abstractNumId w:val="19"/>
-  </w:num>
-  <w:num w:numId="23">
-    <w:abstractNumId w:val="20"/>
-  </w:num>
-  <w:num w:numId="24">
-    <w:abstractNumId w:val="17"/>
-  </w:num>
-  <w:num w:numId="25">
-    <w:abstractNumId w:val="5"/>
-  </w:num>
-  <w:num w:numId="26">
-    <w:abstractNumId w:val="6"/>
-  </w:num>
-  <w:num w:numId="27">
-    <w:abstractNumId w:val="11"/>
   </w:num>
   <w:numIdMacAtCleanup w:val="27"/>
 </w:numbering>
 </file>
 
 <file path=word/styles.xml><?xml version="1.0" encoding="utf-8"?>
-<w:styles xmlns:mc="http://schemas.openxmlformats.org/markup-compatibility/2006" xmlns:r="http://schemas.openxmlformats.org/officeDocument/2006/relationships" xmlns:w="http://schemas.openxmlformats.org/wordprocessingml/2006/main" xmlns:w14="http://schemas.microsoft.com/office/word/2010/wordml" xmlns:w15="http://schemas.microsoft.com/office/word/2012/wordml" xmlns:w16cex="http://schemas.microsoft.com/office/word/2018/wordml/cex" xmlns:w16cid="http://schemas.microsoft.com/office/word/2016/wordml/cid" xmlns:w16="http://schemas.microsoft.com/office/word/2018/wordml" xmlns:w16sdtdh="http://schemas.microsoft.com/office/word/2020/wordml/sdtdatahash" xmlns:w16se="http://schemas.microsoft.com/office/word/2015/wordml/symex" mc:Ignorable="w14 w15 w16se w16cid w16 w16cex w16sdtdh">
+<w:styles xmlns:mc="http://schemas.openxmlformats.org/markup-compatibility/2006" xmlns:r="http://schemas.openxmlformats.org/officeDocument/2006/relationships" xmlns:w="http://schemas.openxmlformats.org/wordprocessingml/2006/main" xmlns:w14="http://schemas.microsoft.com/office/word/2010/wordml" xmlns:w15="http://schemas.microsoft.com/office/word/2012/wordml" xmlns:w16cex="http://schemas.microsoft.com/office/word/2018/wordml/cex" xmlns:w16cid="http://schemas.microsoft.com/office/word/2016/wordml/cid" xmlns:w16="http://schemas.microsoft.com/office/word/2018/wordml" xmlns:w16du="http://schemas.microsoft.com/office/word/2023/wordml/word16du" xmlns:w16sdtdh="http://schemas.microsoft.com/office/word/2020/wordml/sdtdatahash" xmlns:w16sdtfl="http://schemas.microsoft.com/office/word/2024/wordml/sdtformatlock" xmlns:w16se="http://schemas.microsoft.com/office/word/2015/wordml/symex" mc:Ignorable="w14 w15 w16se w16cid w16 w16cex w16sdtdh w16sdtfl w16du">
   <w:docDefaults>
     <w:rPrDefault>
       <w:rPr>
@@ -16608,6 +16765,7 @@
   <w:style w:type="character" w:default="1" w:styleId="Fuentedeprrafopredeter">
     <w:name w:val="Default Paragraph Font"/>
     <w:uiPriority w:val="1"/>
+    <w:semiHidden/>
     <w:unhideWhenUsed/>
   </w:style>
   <w:style w:type="table" w:default="1" w:styleId="Tablanormal">
@@ -17795,30 +17953,10 @@
 </file>
 
 <file path=customXml/item1.xml><?xml version="1.0" encoding="utf-8"?>
-<p:properties xmlns:p="http://schemas.microsoft.com/office/2006/metadata/properties" xmlns:xsi="http://www.w3.org/2001/XMLSchema-instance" xmlns:pc="http://schemas.microsoft.com/office/infopath/2007/PartnerControls">
-  <documentManagement>
-    <TaxCatchAll xmlns="cb45339b-ced9-4d0d-8f64-77573914d53b" xsi:nil="true"/>
-    <lcf76f155ced4ddcb4097134ff3c332f xmlns="43a3ca16-9c26-4813-b83f-4aec9927b43f">
-      <Terms xmlns="http://schemas.microsoft.com/office/infopath/2007/PartnerControls"/>
-    </lcf76f155ced4ddcb4097134ff3c332f>
-  </documentManagement>
-</p:properties>
+<b:Sources xmlns:b="http://schemas.openxmlformats.org/officeDocument/2006/bibliography" xmlns="http://schemas.openxmlformats.org/officeDocument/2006/bibliography" SelectedStyle="\APASixthEditionOfficeOnline.xsl" StyleName="APA" Version="6"/>
 </file>
 
 <file path=customXml/item2.xml><?xml version="1.0" encoding="utf-8"?>
-<b:Sources xmlns:b="http://schemas.openxmlformats.org/officeDocument/2006/bibliography" xmlns="http://schemas.openxmlformats.org/officeDocument/2006/bibliography" SelectedStyle="\APASixthEditionOfficeOnline.xsl" StyleName="APA" Version="6"/>
-</file>
-
-<file path=customXml/item3.xml><?xml version="1.0" encoding="utf-8"?>
-<?mso-contentType ?>
-<FormTemplates xmlns="http://schemas.microsoft.com/sharepoint/v3/contenttype/forms">
-  <Display>DocumentLibraryForm</Display>
-  <Edit>DocumentLibraryForm</Edit>
-  <New>DocumentLibraryForm</New>
-</FormTemplates>
-</file>
-
-<file path=customXml/item4.xml><?xml version="1.0" encoding="utf-8"?>
 <ct:contentTypeSchema xmlns:ct="http://schemas.microsoft.com/office/2006/metadata/contentType" xmlns:ma="http://schemas.microsoft.com/office/2006/metadata/properties/metaAttributes" ct:_="" ma:_="" ma:contentTypeName="Documento" ma:contentTypeID="0x01010049282E1EDBE9234EA9E6D38F720E265F" ma:contentTypeVersion="15" ma:contentTypeDescription="Crear nuevo documento." ma:contentTypeScope="" ma:versionID="b31c7aa9eaf043a08b87120b3c4916e3">
   <xsd:schema xmlns:xsd="http://www.w3.org/2001/XMLSchema" xmlns:xs="http://www.w3.org/2001/XMLSchema" xmlns:p="http://schemas.microsoft.com/office/2006/metadata/properties" xmlns:ns2="cb45339b-ced9-4d0d-8f64-77573914d53b" xmlns:ns3="43a3ca16-9c26-4813-b83f-4aec9927b43f" targetNamespace="http://schemas.microsoft.com/office/2006/metadata/properties" ma:root="true" ma:fieldsID="3533d065b04d75c457075bc55f1f5315" ns2:_="" ns3:_="">
     <xsd:import namespace="cb45339b-ced9-4d0d-8f64-77573914d53b"/>
@@ -18053,18 +18191,27 @@
 </ct:contentTypeSchema>
 </file>
 
-<file path=customXml/itemProps1.xml><?xml version="1.0" encoding="utf-8"?>
-<ds:datastoreItem xmlns:ds="http://schemas.openxmlformats.org/officeDocument/2006/customXml" ds:itemID="{26259216-AD86-464A-AEAD-95B1F9E17392}">
-  <ds:schemaRefs>
-    <ds:schemaRef ds:uri="http://schemas.microsoft.com/office/2006/metadata/properties"/>
-    <ds:schemaRef ds:uri="http://schemas.microsoft.com/office/infopath/2007/PartnerControls"/>
-    <ds:schemaRef ds:uri="cb45339b-ced9-4d0d-8f64-77573914d53b"/>
-    <ds:schemaRef ds:uri="43a3ca16-9c26-4813-b83f-4aec9927b43f"/>
-  </ds:schemaRefs>
-</ds:datastoreItem>
+<file path=customXml/item3.xml><?xml version="1.0" encoding="utf-8"?>
+<?mso-contentType ?>
+<FormTemplates xmlns="http://schemas.microsoft.com/sharepoint/v3/contenttype/forms">
+  <Display>DocumentLibraryForm</Display>
+  <Edit>DocumentLibraryForm</Edit>
+  <New>DocumentLibraryForm</New>
+</FormTemplates>
 </file>
 
-<file path=customXml/itemProps2.xml><?xml version="1.0" encoding="utf-8"?>
+<file path=customXml/item4.xml><?xml version="1.0" encoding="utf-8"?>
+<p:properties xmlns:p="http://schemas.microsoft.com/office/2006/metadata/properties" xmlns:xsi="http://www.w3.org/2001/XMLSchema-instance" xmlns:pc="http://schemas.microsoft.com/office/infopath/2007/PartnerControls">
+  <documentManagement>
+    <TaxCatchAll xmlns="cb45339b-ced9-4d0d-8f64-77573914d53b" xsi:nil="true"/>
+    <lcf76f155ced4ddcb4097134ff3c332f xmlns="43a3ca16-9c26-4813-b83f-4aec9927b43f">
+      <Terms xmlns="http://schemas.microsoft.com/office/infopath/2007/PartnerControls"/>
+    </lcf76f155ced4ddcb4097134ff3c332f>
+  </documentManagement>
+</p:properties>
+</file>
+
+<file path=customXml/itemProps1.xml><?xml version="1.0" encoding="utf-8"?>
 <ds:datastoreItem xmlns:ds="http://schemas.openxmlformats.org/officeDocument/2006/customXml" ds:itemID="{A9F2CEBA-C824-4C86-81A8-E32CBD0EB92D}">
   <ds:schemaRefs>
     <ds:schemaRef ds:uri="http://schemas.openxmlformats.org/officeDocument/2006/bibliography"/>
@@ -18072,15 +18219,7 @@
 </ds:datastoreItem>
 </file>
 
-<file path=customXml/itemProps3.xml><?xml version="1.0" encoding="utf-8"?>
-<ds:datastoreItem xmlns:ds="http://schemas.openxmlformats.org/officeDocument/2006/customXml" ds:itemID="{D00A4A46-BDBD-48AC-87B9-2BA42D9CC06F}">
-  <ds:schemaRefs>
-    <ds:schemaRef ds:uri="http://schemas.microsoft.com/sharepoint/v3/contenttype/forms"/>
-  </ds:schemaRefs>
-</ds:datastoreItem>
-</file>
-
-<file path=customXml/itemProps4.xml><?xml version="1.0" encoding="utf-8"?>
+<file path=customXml/itemProps2.xml><?xml version="1.0" encoding="utf-8"?>
 <ds:datastoreItem xmlns:ds="http://schemas.openxmlformats.org/officeDocument/2006/customXml" ds:itemID="{0BC4A0A4-89EA-4C0C-9011-C1B351E892BC}">
   <ds:schemaRefs>
     <ds:schemaRef ds:uri="http://schemas.microsoft.com/office/2006/metadata/contentType"/>
@@ -18097,4 +18236,23 @@
     <ds:schemaRef ds:uri="http://schemas.microsoft.com/internal/obd"/>
   </ds:schemaRefs>
 </ds:datastoreItem>
+</file>
+
+<file path=customXml/itemProps3.xml><?xml version="1.0" encoding="utf-8"?>
+<ds:datastoreItem xmlns:ds="http://schemas.openxmlformats.org/officeDocument/2006/customXml" ds:itemID="{D00A4A46-BDBD-48AC-87B9-2BA42D9CC06F}">
+  <ds:schemaRefs>
+    <ds:schemaRef ds:uri="http://schemas.microsoft.com/sharepoint/v3/contenttype/forms"/>
+  </ds:schemaRefs>
+</ds:datastoreItem>
+</file>
+
+<file path=customXml/itemProps4.xml><?xml version="1.0" encoding="utf-8"?>
+<ds:datastoreItem xmlns:ds="http://schemas.openxmlformats.org/officeDocument/2006/customXml" ds:itemID="{26259216-AD86-464A-AEAD-95B1F9E17392}">
+  <ds:schemaRefs>
+    <ds:schemaRef ds:uri="http://schemas.microsoft.com/office/2006/metadata/properties"/>
+    <ds:schemaRef ds:uri="http://schemas.microsoft.com/office/infopath/2007/PartnerControls"/>
+    <ds:schemaRef ds:uri="cb45339b-ced9-4d0d-8f64-77573914d53b"/>
+    <ds:schemaRef ds:uri="43a3ca16-9c26-4813-b83f-4aec9927b43f"/>
+  </ds:schemaRefs>
+</ds:datastoreItem>
 </file>
</xml_diff>